<commit_message>
Add single-author submission metadata
</commit_message>
<xml_diff>
--- a/paper/manuscript.docx
+++ b/paper/manuscript.docx
@@ -87,55 +87,104 @@
         <w:pStyle w:val="Author"/>
       </w:pPr>
       <w:r>
-        <w:t xml:space="preserve">[Author</w:t>
-      </w:r>
-      <w:r>
-        <w:t xml:space="preserve"> </w:t>
-      </w:r>
-      <w:r>
-        <w:t xml:space="preserve">names</w:t>
-      </w:r>
-      <w:r>
-        <w:t xml:space="preserve"> </w:t>
-      </w:r>
-      <w:r>
-        <w:t xml:space="preserve">and</w:t>
-      </w:r>
-      <w:r>
-        <w:t xml:space="preserve"> </w:t>
-      </w:r>
-      <w:r>
-        <w:t xml:space="preserve">affiliations</w:t>
-      </w:r>
-      <w:r>
-        <w:t xml:space="preserve"> </w:t>
-      </w:r>
-      <w:r>
-        <w:t xml:space="preserve">to</w:t>
-      </w:r>
-      <w:r>
-        <w:t xml:space="preserve"> </w:t>
-      </w:r>
-      <w:r>
-        <w:t xml:space="preserve">be</w:t>
-      </w:r>
-      <w:r>
-        <w:t xml:space="preserve"> </w:t>
-      </w:r>
-      <w:r>
-        <w:t xml:space="preserve">inserted</w:t>
-      </w:r>
-      <w:r>
-        <w:t xml:space="preserve"> </w:t>
-      </w:r>
-      <w:r>
-        <w:t xml:space="preserve">before</w:t>
-      </w:r>
-      <w:r>
-        <w:t xml:space="preserve"> </w:t>
-      </w:r>
-      <w:r>
-        <w:t xml:space="preserve">submission]</w:t>
+        <w:t xml:space="preserve">Ihor</w:t>
+      </w:r>
+      <w:r>
+        <w:t xml:space="preserve"> </w:t>
+      </w:r>
+      <w:r>
+        <w:t xml:space="preserve">Kendiukhov</w:t>
+      </w:r>
+      <m:oMath>
+        <m:sSup>
+          <m:e>
+            <m:r>
+              <m:t>​</m:t>
+            </m:r>
+          </m:e>
+          <m:sup>
+            <m:r>
+              <m:t>1</m:t>
+            </m:r>
+          </m:sup>
+        </m:sSup>
+      </m:oMath>
+      <w:r>
+        <w:br/>
+      </w:r>
+      <m:oMath>
+        <m:sSup>
+          <m:e>
+            <m:r>
+              <m:t>​</m:t>
+            </m:r>
+          </m:e>
+          <m:sup>
+            <m:r>
+              <m:t>1</m:t>
+            </m:r>
+          </m:sup>
+        </m:sSup>
+      </m:oMath>
+      <w:r>
+        <w:t xml:space="preserve">Department</w:t>
+      </w:r>
+      <w:r>
+        <w:t xml:space="preserve"> </w:t>
+      </w:r>
+      <w:r>
+        <w:t xml:space="preserve">of</w:t>
+      </w:r>
+      <w:r>
+        <w:t xml:space="preserve"> </w:t>
+      </w:r>
+      <w:r>
+        <w:t xml:space="preserve">Computer</w:t>
+      </w:r>
+      <w:r>
+        <w:t xml:space="preserve"> </w:t>
+      </w:r>
+      <w:r>
+        <w:t xml:space="preserve">Science,</w:t>
+      </w:r>
+      <w:r>
+        <w:t xml:space="preserve"> </w:t>
+      </w:r>
+      <w:r>
+        <w:t xml:space="preserve">University</w:t>
+      </w:r>
+      <w:r>
+        <w:t xml:space="preserve"> </w:t>
+      </w:r>
+      <w:r>
+        <w:t xml:space="preserve">of</w:t>
+      </w:r>
+      <w:r>
+        <w:t xml:space="preserve"> </w:t>
+      </w:r>
+      <w:r>
+        <w:t xml:space="preserve">Tübingen,</w:t>
+      </w:r>
+      <w:r>
+        <w:t xml:space="preserve"> </w:t>
+      </w:r>
+      <w:r>
+        <w:t xml:space="preserve">Tübingen,</w:t>
+      </w:r>
+      <w:r>
+        <w:t xml:space="preserve"> </w:t>
+      </w:r>
+      <w:r>
+        <w:t xml:space="preserve">Germany</w:t>
+      </w:r>
+      <w:r>
+        <w:br/>
+      </w:r>
+      <w:r>
+        <w:rPr>
+          <w:rStyle w:val="VerbatimChar"/>
+        </w:rPr>
+        <w:t xml:space="preserve">kendiukhov@gmail.com</w:t>
       </w:r>
     </w:p>
     <w:p>

</xml_diff>

<commit_message>
Expand validated manuscript bibliography
</commit_message>
<xml_diff>
--- a/paper/manuscript.docx
+++ b/paper/manuscript.docx
@@ -1639,28 +1639,25 @@
         <w:pStyle w:val="FirstParagraph"/>
       </w:pPr>
       <w:r>
-        <w:t xml:space="preserve">Aging does not appear as a single transcriptomic program. Instead, it emerges through shifts in immune activation, stress response, proteostasis, and cell composition that vary across cell types and cohorts. Single-cell foundation models compress these patterns into latent representations, which raises an attractive question for biogerontology: do those latent spaces contain interpretable aging biology, or only weak predictive signal? Two recent foundation models for single-cell transcriptomics, Geneformer</w:t>
-      </w:r>
-      <w:r>
-        <w:t xml:space="preserve"> </w:t>
-      </w:r>
-      <w:r>
-        <w:t xml:space="preserve">(Theodoris et al. 2023)</w:t>
-      </w:r>
-      <w:r>
-        <w:t xml:space="preserve"> </w:t>
-      </w:r>
-      <w:r>
-        <w:t xml:space="preserve">and scGPT</w:t>
-      </w:r>
-      <w:r>
-        <w:t xml:space="preserve"> </w:t>
-      </w:r>
-      <w:r>
-        <w:t xml:space="preserve">(Cui et al. 2024)</w:t>
-      </w:r>
-      <w:r>
-        <w:t xml:space="preserve">, provide suitable frozen backbones for testing that question.</w:t>
+        <w:t xml:space="preserve">Aging is now understood as a systems-level process rather than a single molecular clock, with recurring hallmarks that include chronic inflammation, senescence-associated secretory signaling, stem-cell dysfunction, impaired proteostasis, and altered intercellular communication</w:t>
+      </w:r>
+      <w:r>
+        <w:t xml:space="preserve"> </w:t>
+      </w:r>
+      <w:r>
+        <w:t xml:space="preserve">(Lopez-Otin et al. 2013, 2023; Kennedy et al. 2014; Campisi et al. 2019)</w:t>
+      </w:r>
+      <w:r>
+        <w:t xml:space="preserve">. In immune and stromal compartments, age-related inflammation is especially prominent. The inflammaging literature links late-life dysfunction to persistent innate immune activation, NF-kappaB signaling, senescence-associated secretory phenotypes, and age-related rewiring of adaptive immunity</w:t>
+      </w:r>
+      <w:r>
+        <w:t xml:space="preserve"> </w:t>
+      </w:r>
+      <w:r>
+        <w:t xml:space="preserve">(FRANCESCHI et al. 2000; Franceschi and Campisi 2014; Furman et al. 2019; Ferrucci and Fabbri 2018; Nikolich-Zugich 2018; Goronzy and Weyand 2019; Salminen et al. 2008; Chien et al. 2011; Hernandez-Segura, Nehme, and Demaria 2018; Basisty et al. 2020; Zhang et al. 2013)</w:t>
+      </w:r>
+      <w:r>
+        <w:t xml:space="preserve">.</w:t>
       </w:r>
     </w:p>
     <w:p>
@@ -1668,11 +1665,63 @@
         <w:pStyle w:val="BodyText"/>
       </w:pPr>
       <w:r>
+        <w:t xml:space="preserve">At the measurement level, aging can often be detected from molecular profiles, including DNA methylation clocks, blood transcriptomic signatures, and large atlas-scale single-cell references</w:t>
+      </w:r>
+      <w:r>
+        <w:t xml:space="preserve"> </w:t>
+      </w:r>
+      <w:r>
+        <w:t xml:space="preserve">(Horvath 2013; Lu et al. 2019; Peters et al. 2015; Almanzar et al. 2020; Schaum et al. 2020; Consortium* et al. 2022; Yazar et al. 2022)</w:t>
+      </w:r>
+      <w:r>
+        <w:t xml:space="preserve">. What remains unclear is whether compact latent representations learned by large models encode merely enough information for age prediction, or whether they contain interpretable biological programs that track conserved aging mechanisms.</w:t>
+      </w:r>
+    </w:p>
+    <w:p>
+      <w:pPr>
+        <w:pStyle w:val="BodyText"/>
+      </w:pPr>
+      <w:r>
+        <w:t xml:space="preserve">Single-cell foundation models provide a concrete setting in which to test that distinction. Transformer architectures have become the dominant substrate for large representation learners</w:t>
+      </w:r>
+      <w:r>
+        <w:t xml:space="preserve"> </w:t>
+      </w:r>
+      <w:r>
+        <w:t xml:space="preserve">(Vaswani et al. 2017)</w:t>
+      </w:r>
+      <w:r>
+        <w:t xml:space="preserve">, and recent biological variants such as Geneformer and scGPT show that frozen transformer backbones can organize rich cellular structure in transcriptomic data</w:t>
+      </w:r>
+      <w:r>
+        <w:t xml:space="preserve"> </w:t>
+      </w:r>
+      <w:r>
+        <w:t xml:space="preserve">(Theodoris et al. 2023; Cui et al. 2024)</w:t>
+      </w:r>
+      <w:r>
+        <w:t xml:space="preserve">. In parallel, mechanistic-interpretability work has developed increasingly structured ways to study latent circuits and sparse features in large models</w:t>
+      </w:r>
+      <w:r>
+        <w:t xml:space="preserve"> </w:t>
+      </w:r>
+      <w:r>
+        <w:t xml:space="preserve">(Olah et al. 2020; Bau et al. 2017; Bricken et al. 2023; Templeton et al. 2024)</w:t>
+      </w:r>
+      <w:r>
+        <w:t xml:space="preserve">. Together, these developments motivate a harder question for biogerontology: do frozen single-cell foundation models encode aging biology in a form that survives mechanistic scrutiny?</w:t>
+      </w:r>
+    </w:p>
+    <w:p>
+      <w:pPr>
+        <w:pStyle w:val="BodyText"/>
+      </w:pPr>
+      <w:r>
         <w:t xml:space="preserve">This distinction matters because age can be decodable without supporting a defensible biological mechanism. Donor identity, cell-type imbalance, and cohort-specific composition shifts can all create apparent aging signals that disappear under stronger controls. We therefore focused on a harder target: not just whether age can be decoded from frozen embeddings, but whether candidate aging programs remain directional, biologically coherent, and donor-aware under increasingly strict stress tests.</w:t>
       </w:r>
     </w:p>
     <w:bookmarkEnd w:id="20"/>
-    <w:bookmarkStart w:id="25" w:name="methods"/>
+    <w:bookmarkStart w:id="26" w:name="methods"/>
     <w:p>
       <w:pPr>
         <w:pStyle w:val="Heading1"/>
@@ -1701,7 +1750,7 @@
         <w:t xml:space="preserve"> </w:t>
       </w:r>
       <w:r>
-        <w:t xml:space="preserve">(Jones et al. 2022)</w:t>
+        <w:t xml:space="preserve">(Consortium* et al. 2022)</w:t>
       </w:r>
       <w:r>
         <w:t xml:space="preserve">, the Yazar immune single-cell eQTL cohort</w:t>
@@ -1713,7 +1762,16 @@
         <w:t xml:space="preserve">(Yazar et al. 2022)</w:t>
       </w:r>
       <w:r>
-        <w:t xml:space="preserve">, and Allen immune aging-derived subsets.</w:t>
+        <w:t xml:space="preserve">, and Allen immune aging-derived subsets. We treated atlas-scale external datasets primarily as stress-test context rather than as interchangeable pooled training data, because cross-cohort integration in single-cell studies is sensitive to normalization choices, batch effects, missingness, donor structure, and pseudoreplication</w:t>
+      </w:r>
+      <w:r>
+        <w:t xml:space="preserve"> </w:t>
+      </w:r>
+      <w:r>
+        <w:t xml:space="preserve">(Luecken and Theis 2019; Wolf, Angerer, and Theis 2018; Hafemeister and Satija 2019; Stuart et al. 2019; Haghverdi et al. 2018; Korsunsky et al. 2019; Tran et al. 2020; Hicks et al. 2018; Zimmerman, Espeland, and Langefeld 2021; Squair et al. 2021)</w:t>
+      </w:r>
+      <w:r>
+        <w:t xml:space="preserve">.</w:t>
       </w:r>
     </w:p>
     <w:p>
@@ -1901,12 +1959,48 @@
       </w:r>
     </w:p>
     <w:bookmarkEnd w:id="23"/>
-    <w:bookmarkStart w:id="24" w:name="strict-gate-policy"/>
+    <w:bookmarkStart w:id="24" w:name="statistical-safeguards"/>
     <w:p>
       <w:pPr>
         <w:pStyle w:val="Heading2"/>
       </w:pPr>
       <w:r>
+        <w:t xml:space="preserve">Statistical safeguards</w:t>
+      </w:r>
+    </w:p>
+    <w:p>
+      <w:pPr>
+        <w:pStyle w:val="FirstParagraph"/>
+      </w:pPr>
+      <w:r>
+        <w:t xml:space="preserve">Single-cell datasets are unusually vulnerable to optimistic results when cells are treated as independent evidence, when donor effects leak across splits, or when batch correction silently redefines the tested biological contrast</w:t>
+      </w:r>
+      <w:r>
+        <w:t xml:space="preserve"> </w:t>
+      </w:r>
+      <w:r>
+        <w:t xml:space="preserve">(Crowell et al. 2020; Zimmerman, Espeland, and Langefeld 2021; Squair et al. 2021)</w:t>
+      </w:r>
+      <w:r>
+        <w:t xml:space="preserve">. For that reason, the pipeline was built around donor-aware data partitioning, donor-bootstrap uncertainty estimates, and contrast checks that remained interpretable after composition reweighting or composition-matched reruns. The goal was not to maximize nominal detection rate, but to suppress exactly the kinds of confounded positives that are common in atlas-scale analyses</w:t>
+      </w:r>
+      <w:r>
+        <w:t xml:space="preserve"> </w:t>
+      </w:r>
+      <w:r>
+        <w:t xml:space="preserve">(Luecken and Theis 2019; Tran et al. 2020; Hicks et al. 2018)</w:t>
+      </w:r>
+      <w:r>
+        <w:t xml:space="preserve">.</w:t>
+      </w:r>
+    </w:p>
+    <w:bookmarkEnd w:id="24"/>
+    <w:bookmarkStart w:id="25" w:name="strict-gate-policy"/>
+    <w:p>
+      <w:pPr>
+        <w:pStyle w:val="Heading2"/>
+      </w:pPr>
+      <w:r>
         <w:t xml:space="preserve">Strict gate policy</w:t>
       </w:r>
     </w:p>
@@ -1918,9 +2012,9 @@
         <w:t xml:space="preserve">Claims were promoted only when multiple directional checks agreed: expected-age contrasts had to point in the correct direction, marginal effects had to remain supportive, and old-probability shifts had to be consistent. This policy was intentionally stricter than contrast-only screening because the project goal was mechanism-grade evidence rather than loose signal detection.</w:t>
       </w:r>
     </w:p>
-    <w:bookmarkEnd w:id="24"/>
     <w:bookmarkEnd w:id="25"/>
-    <w:bookmarkStart w:id="56" w:name="results"/>
+    <w:bookmarkEnd w:id="26"/>
+    <w:bookmarkStart w:id="57" w:name="results"/>
     <w:p>
       <w:pPr>
         <w:pStyle w:val="Heading1"/>
@@ -1929,7 +2023,7 @@
         <w:t xml:space="preserve">Results</w:t>
       </w:r>
     </w:p>
-    <w:bookmarkStart w:id="27" w:name="global-trajectory-across-stages"/>
+    <w:bookmarkStart w:id="28" w:name="global-trajectory-across-stages"/>
     <w:p>
       <w:pPr>
         <w:pStyle w:val="Heading2"/>
@@ -1960,7 +2054,7 @@
         <w:t xml:space="preserve">summarizes stage-level outcomes.</w:t>
       </w:r>
     </w:p>
-    <w:bookmarkStart w:id="26" w:name="tab:stage-overview"/>
+    <w:bookmarkStart w:id="27" w:name="tab:stage-overview"/>
     <w:p>
       <w:pPr>
         <w:pStyle w:val="TableCaption"/>
@@ -2378,9 +2472,9 @@
         </w:tc>
       </w:tr>
     </w:tbl>
-    <w:bookmarkEnd w:id="26"/>
     <w:bookmarkEnd w:id="27"/>
-    <w:bookmarkStart w:id="31" w:name="Xd24edef54d090c434d7cf6e3717dbe2c9ede408"/>
+    <w:bookmarkEnd w:id="28"/>
+    <w:bookmarkStart w:id="32" w:name="Xd24edef54d090c434d7cf6e3717dbe2c9ede408"/>
     <w:p>
       <w:pPr>
         <w:pStyle w:val="Heading2"/>
@@ -2452,18 +2546,18 @@
           <wp:inline>
             <wp:extent cx="5227320" cy="1977980"/>
             <wp:effectExtent b="0" l="0" r="0" t="0"/>
-            <wp:docPr descr="" title="" id="29" name="Picture"/>
+            <wp:docPr descr="" title="" id="30" name="Picture"/>
             <a:graphic>
               <a:graphicData uri="http://schemas.openxmlformats.org/drawingml/2006/picture">
                 <pic:pic>
                   <pic:nvPicPr>
-                    <pic:cNvPr descr="figures/fig1_stage1_stage2_overview.png" id="30" name="Picture"/>
+                    <pic:cNvPr descr="figures/fig1_stage1_stage2_overview.png" id="31" name="Picture"/>
                     <pic:cNvPicPr>
                       <a:picLocks noChangeArrowheads="1" noChangeAspect="1"/>
                     </pic:cNvPicPr>
                   </pic:nvPicPr>
                   <pic:blipFill>
-                    <a:blip r:embed="rId28"/>
+                    <a:blip r:embed="rId29"/>
                     <a:stretch>
                       <a:fillRect/>
                     </a:stretch>
@@ -2498,8 +2592,8 @@
         <w:t xml:space="preserve">Detection versus geometry. Left: donor-aware age-decoding performance by dataset. Right: age-alignment geometry statistics remain weak and inconsistent, with no dataset passing the geometry gate.</w:t>
       </w:r>
     </w:p>
-    <w:bookmarkEnd w:id="31"/>
-    <w:bookmarkStart w:id="38" w:name="Xd8d69b28c299c39ab49b0ca3555e00d982e7421"/>
+    <w:bookmarkEnd w:id="32"/>
+    <w:bookmarkStart w:id="39" w:name="Xd8d69b28c299c39ab49b0ca3555e00d982e7421"/>
     <w:p>
       <w:pPr>
         <w:pStyle w:val="Heading2"/>
@@ -2539,18 +2633,18 @@
           <wp:inline>
             <wp:extent cx="4000500" cy="2157297"/>
             <wp:effectExtent b="0" l="0" r="0" t="0"/>
-            <wp:docPr descr="" title="" id="33" name="Picture"/>
+            <wp:docPr descr="" title="" id="34" name="Picture"/>
             <a:graphic>
               <a:graphicData uri="http://schemas.openxmlformats.org/drawingml/2006/picture">
                 <pic:pic>
                   <pic:nvPicPr>
-                    <pic:cNvPr descr="figures/fig2_stage3_robust_features.png" id="34" name="Picture"/>
+                    <pic:cNvPr descr="figures/fig2_stage3_robust_features.png" id="35" name="Picture"/>
                     <pic:cNvPicPr>
                       <a:picLocks noChangeArrowheads="1" noChangeAspect="1"/>
                     </pic:cNvPicPr>
                   </pic:nvPicPr>
                   <pic:blipFill>
-                    <a:blip r:embed="rId32"/>
+                    <a:blip r:embed="rId33"/>
                     <a:stretch>
                       <a:fillRect/>
                     </a:stretch>
@@ -2613,18 +2707,18 @@
           <wp:inline>
             <wp:extent cx="4267200" cy="2158863"/>
             <wp:effectExtent b="0" l="0" r="0" t="0"/>
-            <wp:docPr descr="" title="" id="36" name="Picture"/>
+            <wp:docPr descr="" title="" id="37" name="Picture"/>
             <a:graphic>
               <a:graphicData uri="http://schemas.openxmlformats.org/drawingml/2006/picture">
                 <pic:pic>
                   <pic:nvPicPr>
-                    <pic:cNvPr descr="figures/fig3_stage4_pathway_convergence.png" id="37" name="Picture"/>
+                    <pic:cNvPr descr="figures/fig3_stage4_pathway_convergence.png" id="38" name="Picture"/>
                     <pic:cNvPicPr>
                       <a:picLocks noChangeArrowheads="1" noChangeAspect="1"/>
                     </pic:cNvPicPr>
                   </pic:nvPicPr>
                   <pic:blipFill>
-                    <a:blip r:embed="rId35"/>
+                    <a:blip r:embed="rId36"/>
                     <a:stretch>
                       <a:fillRect/>
                     </a:stretch>
@@ -2659,8 +2753,8 @@
         <w:t xml:space="preserve">Cross-model pathway convergence. Inflammation / NF-kappaB dominates the shared signal between scGPT and Geneformer.</w:t>
       </w:r>
     </w:p>
-    <w:bookmarkEnd w:id="38"/>
-    <w:bookmarkStart w:id="42" w:name="X3600fc3e840c0a67b042e7402473d4a825e5afe"/>
+    <w:bookmarkEnd w:id="39"/>
+    <w:bookmarkStart w:id="43" w:name="X3600fc3e840c0a67b042e7402473d4a825e5afe"/>
     <w:p>
       <w:pPr>
         <w:pStyle w:val="Heading2"/>
@@ -2727,18 +2821,18 @@
           <wp:inline>
             <wp:extent cx="4800600" cy="2401151"/>
             <wp:effectExtent b="0" l="0" r="0" t="0"/>
-            <wp:docPr descr="" title="" id="40" name="Picture"/>
+            <wp:docPr descr="" title="" id="41" name="Picture"/>
             <a:graphic>
               <a:graphicData uri="http://schemas.openxmlformats.org/drawingml/2006/picture">
                 <pic:pic>
                   <pic:nvPicPr>
-                    <pic:cNvPr descr="figures/fig4_stage8_monocyte_scale_contrast.png" id="41" name="Picture"/>
+                    <pic:cNvPr descr="figures/fig4_stage8_monocyte_scale_contrast.png" id="42" name="Picture"/>
                     <pic:cNvPicPr>
                       <a:picLocks noChangeArrowheads="1" noChangeAspect="1"/>
                     </pic:cNvPicPr>
                   </pic:nvPicPr>
                   <pic:blipFill>
-                    <a:blip r:embed="rId39"/>
+                    <a:blip r:embed="rId40"/>
                     <a:stretch>
                       <a:fillRect/>
                     </a:stretch>
@@ -2773,8 +2867,8 @@
         <w:t xml:space="preserve">Monocyte-restricted inflammation intervention results. Positive old-versus-random effects are strongest in AIDA phase 1 v1, especially at intervention scale 2.0.</w:t>
       </w:r>
     </w:p>
-    <w:bookmarkEnd w:id="42"/>
-    <w:bookmarkStart w:id="46" w:name="Xee8aa3d04864b401d67348f018d52dc75e4dbc6"/>
+    <w:bookmarkEnd w:id="43"/>
+    <w:bookmarkStart w:id="47" w:name="Xee8aa3d04864b401d67348f018d52dc75e4dbc6"/>
     <w:p>
       <w:pPr>
         <w:pStyle w:val="Heading2"/>
@@ -2860,18 +2954,18 @@
           <wp:inline>
             <wp:extent cx="3840480" cy="2044046"/>
             <wp:effectExtent b="0" l="0" r="0" t="0"/>
-            <wp:docPr descr="" title="" id="44" name="Picture"/>
+            <wp:docPr descr="" title="" id="45" name="Picture"/>
             <a:graphic>
               <a:graphicData uri="http://schemas.openxmlformats.org/drawingml/2006/picture">
                 <pic:pic>
                   <pic:nvPicPr>
-                    <pic:cNvPr descr="figures/fig5_stage9_donor_threshold_sweep.png" id="45" name="Picture"/>
+                    <pic:cNvPr descr="figures/fig5_stage9_donor_threshold_sweep.png" id="46" name="Picture"/>
                     <pic:cNvPicPr>
                       <a:picLocks noChangeArrowheads="1" noChangeAspect="1"/>
                     </pic:cNvPicPr>
                   </pic:nvPicPr>
                   <pic:blipFill>
-                    <a:blip r:embed="rId43"/>
+                    <a:blip r:embed="rId44"/>
                     <a:stretch>
                       <a:fillRect/>
                     </a:stretch>
@@ -2906,8 +3000,8 @@
         <w:t xml:space="preserve">Donor-threshold stress test for the strongest surviving global branch. The full strict gate remains satisfied until the minimum donor threshold reaches 500.</w:t>
       </w:r>
     </w:p>
-    <w:bookmarkEnd w:id="46"/>
-    <w:bookmarkStart w:id="53" w:name="X0c8227316fa869b2409f9bc0e738a64e25069f7"/>
+    <w:bookmarkEnd w:id="47"/>
+    <w:bookmarkStart w:id="54" w:name="X0c8227316fa869b2409f9bc0e738a64e25069f7"/>
     <w:p>
       <w:pPr>
         <w:pStyle w:val="Heading2"/>
@@ -3078,18 +3172,18 @@
           <wp:inline>
             <wp:extent cx="5227320" cy="1935840"/>
             <wp:effectExtent b="0" l="0" r="0" t="0"/>
-            <wp:docPr descr="" title="" id="48" name="Picture"/>
+            <wp:docPr descr="" title="" id="49" name="Picture"/>
             <a:graphic>
               <a:graphicData uri="http://schemas.openxmlformats.org/drawingml/2006/picture">
                 <pic:pic>
                   <pic:nvPicPr>
-                    <pic:cNvPr descr="figures/fig6_composition_controls_and_seedpanel.png" id="49" name="Picture"/>
+                    <pic:cNvPr descr="figures/fig6_composition_controls_and_seedpanel.png" id="50" name="Picture"/>
                     <pic:cNvPicPr>
                       <a:picLocks noChangeArrowheads="1" noChangeAspect="1"/>
                     </pic:cNvPicPr>
                   </pic:nvPicPr>
                   <pic:blipFill>
-                    <a:blip r:embed="rId47"/>
+                    <a:blip r:embed="rId48"/>
                     <a:stretch>
                       <a:fillRect/>
                     </a:stretch>
@@ -3133,18 +3227,18 @@
           <wp:inline>
             <wp:extent cx="4160520" cy="2312764"/>
             <wp:effectExtent b="0" l="0" r="0" t="0"/>
-            <wp:docPr descr="" title="" id="51" name="Picture"/>
+            <wp:docPr descr="" title="" id="52" name="Picture"/>
             <a:graphic>
               <a:graphicData uri="http://schemas.openxmlformats.org/drawingml/2006/picture">
                 <pic:pic>
                   <pic:nvPicPr>
-                    <pic:cNvPr descr="figures/fig7_geneformer_bootstrap_stage9_vs_stage10.png" id="52" name="Picture"/>
+                    <pic:cNvPr descr="figures/fig7_geneformer_bootstrap_stage9_vs_stage10.png" id="53" name="Picture"/>
                     <pic:cNvPicPr>
                       <a:picLocks noChangeArrowheads="1" noChangeAspect="1"/>
                     </pic:cNvPicPr>
                   </pic:nvPicPr>
                   <pic:blipFill>
-                    <a:blip r:embed="rId50"/>
+                    <a:blip r:embed="rId51"/>
                     <a:stretch>
                       <a:fillRect/>
                     </a:stretch>
@@ -3179,8 +3273,8 @@
         <w:t xml:space="preserve">Geneformer donor-bootstrap intervention effects before and after full composition matching. The aging-program push remains positive, but the overall directional structure becomes less clean once full matching is enforced.</w:t>
       </w:r>
     </w:p>
-    <w:bookmarkEnd w:id="53"/>
-    <w:bookmarkStart w:id="55" w:name="X2a784b642538f732dcde11db46a0aacdee071b0"/>
+    <w:bookmarkEnd w:id="54"/>
+    <w:bookmarkStart w:id="56" w:name="X2a784b642538f732dcde11db46a0aacdee071b0"/>
     <w:p>
       <w:pPr>
         <w:pStyle w:val="Heading2"/>
@@ -3278,7 +3372,7 @@
         <w:t xml:space="preserve">summarizes the panel-level strict outcomes.</w:t>
       </w:r>
     </w:p>
-    <w:bookmarkStart w:id="54" w:name="tab:seedpanel"/>
+    <w:bookmarkStart w:id="55" w:name="tab:seedpanel"/>
     <w:p>
       <w:pPr>
         <w:pStyle w:val="TableCaption"/>
@@ -3709,10 +3803,10 @@
         </w:tc>
       </w:tr>
     </w:tbl>
-    <w:bookmarkEnd w:id="54"/>
     <w:bookmarkEnd w:id="55"/>
     <w:bookmarkEnd w:id="56"/>
-    <w:bookmarkStart w:id="59" w:name="discussion"/>
+    <w:bookmarkEnd w:id="57"/>
+    <w:bookmarkStart w:id="60" w:name="discussion"/>
     <w:p>
       <w:pPr>
         <w:pStyle w:val="Heading1"/>
@@ -3726,7 +3820,16 @@
         <w:pStyle w:val="FirstParagraph"/>
       </w:pPr>
       <w:r>
-        <w:t xml:space="preserve">A clear pattern emerged across the project. Frozen single-cell foundation models do contain aging-related structure, and some of that structure is biologically interpretable. We repeatedly recovered donor-aware sparse features, saw substantial cross-model overlap in inflammatory programs, and observed a strong cell-type-local monocyte signal in AIDA phase 1 v1. These are not trivial findings, because they appeared without age-specific fine-tuning.</w:t>
+        <w:t xml:space="preserve">A clear pattern emerged across the project. Frozen single-cell foundation models do contain aging-related structure, and some of that structure is biologically interpretable. We repeatedly recovered donor-aware sparse features, saw substantial cross-model overlap in inflammatory programs, and observed a strong cell-type-local monocyte signal in AIDA phase 1 v1. This biological direction is plausible: inflammatory drift, NF-kappaB-linked signaling, senescence-associated secretory phenotypes, and immune remodeling are all well-established features of aging biology</w:t>
+      </w:r>
+      <w:r>
+        <w:t xml:space="preserve"> </w:t>
+      </w:r>
+      <w:r>
+        <w:t xml:space="preserve">(FRANCESCHI et al. 2000; Furman et al. 2019; Ferrucci and Fabbri 2018; Goronzy and Weyand 2019; Salminen et al. 2008; Chien et al. 2011; Basisty et al. 2020)</w:t>
+      </w:r>
+      <w:r>
+        <w:t xml:space="preserve">. These are not trivial findings, because they appeared without age-specific fine-tuning.</w:t>
       </w:r>
     </w:p>
     <w:p>
@@ -3737,7 +3840,7 @@
         <w:t xml:space="preserve">At the same time, the strongest global signal did not survive the most demanding control. The AIDA phase 1 v2 Geneformer inflammation branch looked convincing after split expansion, donor-threshold tightening, and donor-composition reweighting. But once we enforced full composition matching and repeated the analysis across multiple matched seeds, the full strict claim did not replicate. That is not a side note. It is the central methodological result of the study.</w:t>
       </w:r>
     </w:p>
-    <w:bookmarkStart w:id="57" w:name="X23ac13b45d1bde487f9c63f5b619b52ef5a0bc2"/>
+    <w:bookmarkStart w:id="58" w:name="X23ac13b45d1bde487f9c63f5b619b52ef5a0bc2"/>
     <w:p>
       <w:pPr>
         <w:pStyle w:val="Heading2"/>
@@ -3816,8 +3919,8 @@
         <w:t xml:space="preserve">; these are not equivalent.</w:t>
       </w:r>
     </w:p>
-    <w:bookmarkEnd w:id="57"/>
-    <w:bookmarkStart w:id="58" w:name="limitations"/>
+    <w:bookmarkEnd w:id="58"/>
+    <w:bookmarkStart w:id="59" w:name="limitations"/>
     <w:p>
       <w:pPr>
         <w:pStyle w:val="Heading2"/>
@@ -3834,9 +3937,9 @@
         <w:t xml:space="preserve">Key limitations include: (i) limited donor support in some strata and external subsets; (ii) reduced power under strict within-cell-type constraints; (iii) sensitivity of final strict status to composition-matched sample realization; and (iv) incomplete high-power composition-matched reruns due runtime constraints.</w:t>
       </w:r>
     </w:p>
-    <w:bookmarkEnd w:id="58"/>
     <w:bookmarkEnd w:id="59"/>
-    <w:bookmarkStart w:id="60" w:name="conclusion"/>
+    <w:bookmarkEnd w:id="60"/>
+    <w:bookmarkStart w:id="61" w:name="conclusion"/>
     <w:p>
       <w:pPr>
         <w:pStyle w:val="Heading1"/>
@@ -3874,8 +3977,8 @@
         <w:t xml:space="preserve">The highest-value next step is a higher-power composition-matched consensus protocol (larger matched cell budgets and pooled multi-resample decision rules) to determine whether the Stage-9 signal reflects a true stable mechanism or a sampling-sensitive artifact.</w:t>
       </w:r>
     </w:p>
-    <w:bookmarkEnd w:id="60"/>
-    <w:bookmarkStart w:id="77" w:name="statements-and-declarations"/>
+    <w:bookmarkEnd w:id="61"/>
+    <w:bookmarkStart w:id="146" w:name="statements-and-declarations"/>
     <w:p>
       <w:pPr>
         <w:pStyle w:val="Heading1"/>
@@ -4016,7 +4119,7 @@
       <w:r>
         <w:t xml:space="preserve"> </w:t>
       </w:r>
-      <w:hyperlink r:id="rId61">
+      <w:hyperlink r:id="rId62">
         <w:r>
           <w:rPr>
             <w:rStyle w:val="Hyperlink"/>
@@ -4031,13 +4134,154 @@
         <w:br/>
       </w:r>
     </w:p>
-    <w:bookmarkStart w:id="76" w:name="refs"/>
-    <w:bookmarkStart w:id="63" w:name="ref-bricken2023monosemanticity"/>
+    <w:bookmarkStart w:id="145" w:name="refs"/>
+    <w:bookmarkStart w:id="64" w:name="ref-tabulamuris2020"/>
     <w:p>
       <w:pPr>
         <w:pStyle w:val="Bibliography"/>
       </w:pPr>
       <w:r>
+        <w:t xml:space="preserve">Almanzar, Nicole, Jane Antony, Ankit S. Baghel, Isaac Bakerman, Ishita Bansal, et al. 2020.</w:t>
+      </w:r>
+      <w:r>
+        <w:t xml:space="preserve"> </w:t>
+      </w:r>
+      <w:r>
+        <w:t xml:space="preserve">“A Single-Cell Transcriptomic Atlas Characterizes Ageing Tissues in the Mouse.”</w:t>
+      </w:r>
+      <w:r>
+        <w:t xml:space="preserve"> </w:t>
+      </w:r>
+      <w:r>
+        <w:rPr>
+          <w:iCs/>
+          <w:i/>
+        </w:rPr>
+        <w:t xml:space="preserve">Nature</w:t>
+      </w:r>
+      <w:r>
+        <w:t xml:space="preserve"> </w:t>
+      </w:r>
+      <w:r>
+        <w:t xml:space="preserve">583 (7817): 590–95.</w:t>
+      </w:r>
+      <w:r>
+        <w:t xml:space="preserve"> </w:t>
+      </w:r>
+      <w:hyperlink r:id="rId63">
+        <w:r>
+          <w:rPr>
+            <w:rStyle w:val="Hyperlink"/>
+          </w:rPr>
+          <w:t xml:space="preserve">https://doi.org/10.1038/s41586-020-2496-1</w:t>
+        </w:r>
+      </w:hyperlink>
+      <w:r>
+        <w:t xml:space="preserve">.</w:t>
+      </w:r>
+    </w:p>
+    <w:bookmarkEnd w:id="64"/>
+    <w:bookmarkStart w:id="66" w:name="ref-basisty2020secretome"/>
+    <w:p>
+      <w:pPr>
+        <w:pStyle w:val="Bibliography"/>
+      </w:pPr>
+      <w:r>
+        <w:t xml:space="preserve">Basisty, Nathan, Abhijit Kale, Ok Hee Jeon, Chisaka Kuehnemann, Therese Payne, Chirag Rao, et al. 2020.</w:t>
+      </w:r>
+      <w:r>
+        <w:t xml:space="preserve"> </w:t>
+      </w:r>
+      <w:r>
+        <w:t xml:space="preserve">“A Proteomic Atlas of Senescence-Associated Secretomes for Aging Biomarker Development.”</w:t>
+      </w:r>
+      <w:r>
+        <w:t xml:space="preserve"> </w:t>
+      </w:r>
+      <w:r>
+        <w:rPr>
+          <w:iCs/>
+          <w:i/>
+        </w:rPr>
+        <w:t xml:space="preserve">PLOS Biology</w:t>
+      </w:r>
+      <w:r>
+        <w:t xml:space="preserve"> </w:t>
+      </w:r>
+      <w:r>
+        <w:t xml:space="preserve">18 (1): e3000599.</w:t>
+      </w:r>
+      <w:r>
+        <w:t xml:space="preserve"> </w:t>
+      </w:r>
+      <w:hyperlink r:id="rId65">
+        <w:r>
+          <w:rPr>
+            <w:rStyle w:val="Hyperlink"/>
+          </w:rPr>
+          <w:t xml:space="preserve">https://doi.org/10.1371/journal.pbio.3000599</w:t>
+        </w:r>
+      </w:hyperlink>
+      <w:r>
+        <w:t xml:space="preserve">.</w:t>
+      </w:r>
+    </w:p>
+    <w:bookmarkEnd w:id="66"/>
+    <w:bookmarkStart w:id="68" w:name="ref-bau2017network"/>
+    <w:p>
+      <w:pPr>
+        <w:pStyle w:val="Bibliography"/>
+      </w:pPr>
+      <w:r>
+        <w:t xml:space="preserve">Bau, David, Bolei Zhou, Aditya Khosla, Aude Oliva, and Antonio Torralba. 2017.</w:t>
+      </w:r>
+      <w:r>
+        <w:t xml:space="preserve"> </w:t>
+      </w:r>
+      <w:r>
+        <w:t xml:space="preserve">“Network Dissection: Quantifying Interpretability of Deep Visual Representations.”</w:t>
+      </w:r>
+      <w:r>
+        <w:t xml:space="preserve"> </w:t>
+      </w:r>
+      <w:r>
+        <w:t xml:space="preserve">In</w:t>
+      </w:r>
+      <w:r>
+        <w:t xml:space="preserve"> </w:t>
+      </w:r>
+      <w:r>
+        <w:rPr>
+          <w:iCs/>
+          <w:i/>
+        </w:rPr>
+        <w:t xml:space="preserve">2017 IEEE Conference on Computer Vision and Pattern Recognition (CVPR)</w:t>
+      </w:r>
+      <w:r>
+        <w:t xml:space="preserve">, 3319–27.</w:t>
+      </w:r>
+      <w:r>
+        <w:t xml:space="preserve"> </w:t>
+      </w:r>
+      <w:hyperlink r:id="rId67">
+        <w:r>
+          <w:rPr>
+            <w:rStyle w:val="Hyperlink"/>
+          </w:rPr>
+          <w:t xml:space="preserve">https://doi.org/10.1109/CVPR.2017.354</w:t>
+        </w:r>
+      </w:hyperlink>
+      <w:r>
+        <w:t xml:space="preserve">.</w:t>
+      </w:r>
+    </w:p>
+    <w:bookmarkEnd w:id="68"/>
+    <w:bookmarkStart w:id="70" w:name="ref-bricken2023monosemanticity"/>
+    <w:p>
+      <w:pPr>
+        <w:pStyle w:val="Bibliography"/>
+      </w:pPr>
+      <w:r>
         <w:t xml:space="preserve">Bricken, Trenton, Adly Templeton, Joshua Batson, et al. 2023.</w:t>
       </w:r>
       <w:r>
@@ -4049,7 +4293,7 @@
       <w:r>
         <w:t xml:space="preserve"> </w:t>
       </w:r>
-      <w:hyperlink r:id="rId62">
+      <w:hyperlink r:id="rId69">
         <w:r>
           <w:rPr>
             <w:rStyle w:val="Hyperlink"/>
@@ -4061,20 +4305,210 @@
         <w:t xml:space="preserve">.</w:t>
       </w:r>
     </w:p>
-    <w:bookmarkEnd w:id="63"/>
-    <w:bookmarkStart w:id="65" w:name="ref-cui2024scgpt"/>
+    <w:bookmarkEnd w:id="70"/>
+    <w:bookmarkStart w:id="72" w:name="ref-campisi2019therapeutics"/>
     <w:p>
       <w:pPr>
         <w:pStyle w:val="Bibliography"/>
       </w:pPr>
       <w:r>
-        <w:t xml:space="preserve">Cui, Haotian, Chloe Wang, Himanshu Maan, et al. 2024.</w:t>
-      </w:r>
-      <w:r>
-        <w:t xml:space="preserve"> </w:t>
-      </w:r>
-      <w:r>
-        <w:t xml:space="preserve">“scGPT: Toward Building a Foundation Model for Single-Cell Multi-Omics Using Generative</w:t>
+        <w:t xml:space="preserve">Campisi, Judith, Pankaj Kapahi, Gordon J. Lithgow, Simon Melov, John C. Newman, and Eric Verdin. 2019.</w:t>
+      </w:r>
+      <w:r>
+        <w:t xml:space="preserve"> </w:t>
+      </w:r>
+      <w:r>
+        <w:t xml:space="preserve">“From Discoveries in Ageing Research to Therapeutics for Healthy Ageing.”</w:t>
+      </w:r>
+      <w:r>
+        <w:t xml:space="preserve"> </w:t>
+      </w:r>
+      <w:r>
+        <w:rPr>
+          <w:iCs/>
+          <w:i/>
+        </w:rPr>
+        <w:t xml:space="preserve">Nature</w:t>
+      </w:r>
+      <w:r>
+        <w:t xml:space="preserve"> </w:t>
+      </w:r>
+      <w:r>
+        <w:t xml:space="preserve">571 (7764): 183–92.</w:t>
+      </w:r>
+      <w:r>
+        <w:t xml:space="preserve"> </w:t>
+      </w:r>
+      <w:hyperlink r:id="rId71">
+        <w:r>
+          <w:rPr>
+            <w:rStyle w:val="Hyperlink"/>
+          </w:rPr>
+          <w:t xml:space="preserve">https://doi.org/10.1038/s41586-019-1365-2</w:t>
+        </w:r>
+      </w:hyperlink>
+      <w:r>
+        <w:t xml:space="preserve">.</w:t>
+      </w:r>
+    </w:p>
+    <w:bookmarkEnd w:id="72"/>
+    <w:bookmarkStart w:id="74" w:name="ref-chien2011sasp"/>
+    <w:p>
+      <w:pPr>
+        <w:pStyle w:val="Bibliography"/>
+      </w:pPr>
+      <w:r>
+        <w:t xml:space="preserve">Chien, Yuchen, Claudio Scuoppo, Xiaowo Wang, Xueping Fang, Brian Balgley, Jessica E. Bolden, et al. 2011.</w:t>
+      </w:r>
+      <w:r>
+        <w:t xml:space="preserve"> </w:t>
+      </w:r>
+      <w:r>
+        <w:t xml:space="preserve">“Control of the Senescence-Associated Secretory Phenotype by NF-b Promotes Senescence and Enhances Chemosensitivity.”</w:t>
+      </w:r>
+      <w:r>
+        <w:t xml:space="preserve"> </w:t>
+      </w:r>
+      <w:r>
+        <w:rPr>
+          <w:iCs/>
+          <w:i/>
+        </w:rPr>
+        <w:t xml:space="preserve">Genes &amp;Amp; Development</w:t>
+      </w:r>
+      <w:r>
+        <w:t xml:space="preserve"> </w:t>
+      </w:r>
+      <w:r>
+        <w:t xml:space="preserve">25 (20): 2125–36.</w:t>
+      </w:r>
+      <w:r>
+        <w:t xml:space="preserve"> </w:t>
+      </w:r>
+      <w:hyperlink r:id="rId73">
+        <w:r>
+          <w:rPr>
+            <w:rStyle w:val="Hyperlink"/>
+          </w:rPr>
+          <w:t xml:space="preserve">https://doi.org/10.1101/gad.17276711</w:t>
+        </w:r>
+      </w:hyperlink>
+      <w:r>
+        <w:t xml:space="preserve">.</w:t>
+      </w:r>
+    </w:p>
+    <w:bookmarkEnd w:id="74"/>
+    <w:bookmarkStart w:id="76" w:name="ref-tabula2022"/>
+    <w:p>
+      <w:pPr>
+        <w:pStyle w:val="Bibliography"/>
+      </w:pPr>
+      <w:r>
+        <w:t xml:space="preserve">Consortium*, The Tabula Sapiens, Robert C. Jones, Jim Karkanias, Mark A. Krasnow, Angela Oliveira Pisco, Stephen R. Quake, et al. 2022.</w:t>
+      </w:r>
+      <w:r>
+        <w:t xml:space="preserve"> </w:t>
+      </w:r>
+      <w:r>
+        <w:t xml:space="preserve">“The Tabula Sapiens: A Multiple-Organ, Single-Cell Transcriptomic Atlas of Humans.”</w:t>
+      </w:r>
+      <w:r>
+        <w:t xml:space="preserve"> </w:t>
+      </w:r>
+      <w:r>
+        <w:rPr>
+          <w:iCs/>
+          <w:i/>
+        </w:rPr>
+        <w:t xml:space="preserve">Science</w:t>
+      </w:r>
+      <w:r>
+        <w:t xml:space="preserve"> </w:t>
+      </w:r>
+      <w:r>
+        <w:t xml:space="preserve">376 (6594).</w:t>
+      </w:r>
+      <w:r>
+        <w:t xml:space="preserve"> </w:t>
+      </w:r>
+      <w:hyperlink r:id="rId75">
+        <w:r>
+          <w:rPr>
+            <w:rStyle w:val="Hyperlink"/>
+          </w:rPr>
+          <w:t xml:space="preserve">https://doi.org/10.1126/science.abl4896</w:t>
+        </w:r>
+      </w:hyperlink>
+      <w:r>
+        <w:t xml:space="preserve">.</w:t>
+      </w:r>
+    </w:p>
+    <w:bookmarkEnd w:id="76"/>
+    <w:bookmarkStart w:id="78" w:name="ref-crowell2020muscat"/>
+    <w:p>
+      <w:pPr>
+        <w:pStyle w:val="Bibliography"/>
+      </w:pPr>
+      <w:r>
+        <w:t xml:space="preserve">Crowell, Helena L., Charlotte Soneson, Pierre-Luc Germain, Daniela Calini, Ludovic Collin, Catarina Raposo, et al. 2020.</w:t>
+      </w:r>
+      <w:r>
+        <w:t xml:space="preserve"> </w:t>
+      </w:r>
+      <w:r>
+        <w:t xml:space="preserve">“Muscat Detects Subpopulation-Specific State Transitions from Multi-Sample Multi-Condition Single-Cell Transcriptomics Data.”</w:t>
+      </w:r>
+      <w:r>
+        <w:t xml:space="preserve"> </w:t>
+      </w:r>
+      <w:r>
+        <w:rPr>
+          <w:iCs/>
+          <w:i/>
+        </w:rPr>
+        <w:t xml:space="preserve">Nature Communications</w:t>
+      </w:r>
+      <w:r>
+        <w:t xml:space="preserve"> </w:t>
+      </w:r>
+      <w:r>
+        <w:t xml:space="preserve">11 (1).</w:t>
+      </w:r>
+      <w:r>
+        <w:t xml:space="preserve"> </w:t>
+      </w:r>
+      <w:hyperlink r:id="rId77">
+        <w:r>
+          <w:rPr>
+            <w:rStyle w:val="Hyperlink"/>
+          </w:rPr>
+          <w:t xml:space="preserve">https://doi.org/10.1038/s41467-020-19894-4</w:t>
+        </w:r>
+      </w:hyperlink>
+      <w:r>
+        <w:t xml:space="preserve">.</w:t>
+      </w:r>
+    </w:p>
+    <w:bookmarkEnd w:id="78"/>
+    <w:bookmarkStart w:id="80" w:name="ref-cui2024scgpt"/>
+    <w:p>
+      <w:pPr>
+        <w:pStyle w:val="Bibliography"/>
+      </w:pPr>
+      <w:r>
+        <w:t xml:space="preserve">Cui, Haotian, Chloe Wang, Hassaan Maan, Kuan Pang, Fengning Luo, Nan Duan, et al. 2024.</w:t>
+      </w:r>
+      <w:r>
+        <w:t xml:space="preserve"> </w:t>
+      </w:r>
+      <w:r>
+        <w:t xml:space="preserve">“</w:t>
+      </w:r>
+      <w:r>
+        <w:t xml:space="preserve">scGPT</w:t>
+      </w:r>
+      <w:r>
+        <w:t xml:space="preserve">: Toward Building a Foundation Model for Single-Cell Multi-Omics Using Generative</w:t>
       </w:r>
       <w:r>
         <w:t xml:space="preserve"> </w:t>
@@ -4104,7 +4538,7 @@
       <w:r>
         <w:t xml:space="preserve"> </w:t>
       </w:r>
-      <w:hyperlink r:id="rId64">
+      <w:hyperlink r:id="rId79">
         <w:r>
           <w:rPr>
             <w:rStyle w:val="Hyperlink"/>
@@ -4116,14 +4550,14 @@
         <w:t xml:space="preserve">.</w:t>
       </w:r>
     </w:p>
-    <w:bookmarkEnd w:id="65"/>
-    <w:bookmarkStart w:id="67" w:name="ref-efron1979bootstrap"/>
+    <w:bookmarkEnd w:id="80"/>
+    <w:bookmarkStart w:id="82" w:name="ref-efron1979bootstrap"/>
     <w:p>
       <w:pPr>
         <w:pStyle w:val="Bibliography"/>
       </w:pPr>
       <w:r>
-        <w:t xml:space="preserve">Efron, Bradley. 1979.</w:t>
+        <w:t xml:space="preserve">Efron, B. 1979.</w:t>
       </w:r>
       <w:r>
         <w:t xml:space="preserve"> </w:t>
@@ -4145,12 +4579,12 @@
         <w:t xml:space="preserve"> </w:t>
       </w:r>
       <w:r>
-        <w:t xml:space="preserve">7 (1): 1–26.</w:t>
-      </w:r>
-      <w:r>
-        <w:t xml:space="preserve"> </w:t>
-      </w:r>
-      <w:hyperlink r:id="rId66">
+        <w:t xml:space="preserve">7 (1).</w:t>
+      </w:r>
+      <w:r>
+        <w:t xml:space="preserve"> </w:t>
+      </w:r>
+      <w:hyperlink r:id="rId81">
         <w:r>
           <w:rPr>
             <w:rStyle w:val="Hyperlink"/>
@@ -4162,20 +4596,20 @@
         <w:t xml:space="preserve">.</w:t>
       </w:r>
     </w:p>
-    <w:bookmarkEnd w:id="67"/>
-    <w:bookmarkStart w:id="69" w:name="ref-tabula2022"/>
+    <w:bookmarkEnd w:id="82"/>
+    <w:bookmarkStart w:id="84" w:name="ref-ferrucci2018inflammageing"/>
     <w:p>
       <w:pPr>
         <w:pStyle w:val="Bibliography"/>
       </w:pPr>
       <w:r>
-        <w:t xml:space="preserve">Jones, R. C., J. Karkanias, M. A. Krasnow, A. O. Pisco, et al. 2022.</w:t>
-      </w:r>
-      <w:r>
-        <w:t xml:space="preserve"> </w:t>
-      </w:r>
-      <w:r>
-        <w:t xml:space="preserve">“The Tabula Sapiens: A Multiple-Organ, Single-Cell Transcriptomic Atlas of Humans.”</w:t>
+        <w:t xml:space="preserve">Ferrucci, Luigi, and Elisa Fabbri. 2018.</w:t>
+      </w:r>
+      <w:r>
+        <w:t xml:space="preserve"> </w:t>
+      </w:r>
+      <w:r>
+        <w:t xml:space="preserve">“Inflammageing: Chronic Inflammation in Ageing, Cardiovascular Disease, and Frailty.”</w:t>
       </w:r>
       <w:r>
         <w:t xml:space="preserve"> </w:t>
@@ -4185,36 +4619,1114 @@
           <w:iCs/>
           <w:i/>
         </w:rPr>
-        <w:t xml:space="preserve">Science</w:t>
-      </w:r>
-      <w:r>
-        <w:t xml:space="preserve"> </w:t>
-      </w:r>
-      <w:r>
-        <w:t xml:space="preserve">376 (6594): eabl4896.</w:t>
-      </w:r>
-      <w:r>
-        <w:t xml:space="preserve"> </w:t>
-      </w:r>
-      <w:hyperlink r:id="rId68">
+        <w:t xml:space="preserve">Nature Reviews Cardiology</w:t>
+      </w:r>
+      <w:r>
+        <w:t xml:space="preserve"> </w:t>
+      </w:r>
+      <w:r>
+        <w:t xml:space="preserve">15 (9): 505–22.</w:t>
+      </w:r>
+      <w:r>
+        <w:t xml:space="preserve"> </w:t>
+      </w:r>
+      <w:hyperlink r:id="rId83">
         <w:r>
           <w:rPr>
             <w:rStyle w:val="Hyperlink"/>
           </w:rPr>
-          <w:t xml:space="preserve">https://doi.org/10.1126/science.abl4896</w:t>
+          <w:t xml:space="preserve">https://doi.org/10.1038/s41569-018-0064-2</w:t>
         </w:r>
       </w:hyperlink>
       <w:r>
         <w:t xml:space="preserve">.</w:t>
       </w:r>
     </w:p>
-    <w:bookmarkEnd w:id="69"/>
-    <w:bookmarkStart w:id="71" w:name="ref-templeton2024scaling"/>
+    <w:bookmarkEnd w:id="84"/>
+    <w:bookmarkStart w:id="86" w:name="ref-fabbri2014chronic"/>
     <w:p>
       <w:pPr>
         <w:pStyle w:val="Bibliography"/>
       </w:pPr>
       <w:r>
+        <w:t xml:space="preserve">Franceschi, C., and J. Campisi. 2014.</w:t>
+      </w:r>
+      <w:r>
+        <w:t xml:space="preserve"> </w:t>
+      </w:r>
+      <w:r>
+        <w:t xml:space="preserve">“Chronic Inflammation (Inflammaging) and Its Potential Contribution to Age-Associated Diseases.”</w:t>
+      </w:r>
+      <w:r>
+        <w:t xml:space="preserve"> </w:t>
+      </w:r>
+      <w:r>
+        <w:rPr>
+          <w:iCs/>
+          <w:i/>
+        </w:rPr>
+        <w:t xml:space="preserve">The Journals of Gerontology Series A: Biological Sciences and Medical Sciences</w:t>
+      </w:r>
+      <w:r>
+        <w:t xml:space="preserve"> </w:t>
+      </w:r>
+      <w:r>
+        <w:t xml:space="preserve">69 (Suppl 1): S4–9.</w:t>
+      </w:r>
+      <w:r>
+        <w:t xml:space="preserve"> </w:t>
+      </w:r>
+      <w:hyperlink r:id="rId85">
+        <w:r>
+          <w:rPr>
+            <w:rStyle w:val="Hyperlink"/>
+          </w:rPr>
+          <w:t xml:space="preserve">https://doi.org/10.1093/gerona/glu057</w:t>
+        </w:r>
+      </w:hyperlink>
+      <w:r>
+        <w:t xml:space="preserve">.</w:t>
+      </w:r>
+    </w:p>
+    <w:bookmarkEnd w:id="86"/>
+    <w:bookmarkStart w:id="88" w:name="ref-franceschi2000inflammaging"/>
+    <w:p>
+      <w:pPr>
+        <w:pStyle w:val="Bibliography"/>
+      </w:pPr>
+      <w:r>
+        <w:t xml:space="preserve">FRANCESCHI, CLAUDIO, MASSIMILIANO BONAFE, SILVANA VALENSIN, FABIOLA OLIVIERI, MARIA DE LUCA, ENZO OTTAVIANI, et al. 2000.</w:t>
+      </w:r>
+      <w:r>
+        <w:t xml:space="preserve"> </w:t>
+      </w:r>
+      <w:r>
+        <w:t xml:space="preserve">“Inflammaging: An Evolutionary Perspective on Immunosenescence.”</w:t>
+      </w:r>
+      <w:r>
+        <w:t xml:space="preserve"> </w:t>
+      </w:r>
+      <w:r>
+        <w:rPr>
+          <w:iCs/>
+          <w:i/>
+        </w:rPr>
+        <w:t xml:space="preserve">Annals of the New York Academy of Sciences</w:t>
+      </w:r>
+      <w:r>
+        <w:t xml:space="preserve"> </w:t>
+      </w:r>
+      <w:r>
+        <w:t xml:space="preserve">908 (1): 244–54.</w:t>
+      </w:r>
+      <w:r>
+        <w:t xml:space="preserve"> </w:t>
+      </w:r>
+      <w:hyperlink r:id="rId87">
+        <w:r>
+          <w:rPr>
+            <w:rStyle w:val="Hyperlink"/>
+          </w:rPr>
+          <w:t xml:space="preserve">https://doi.org/10.1111/j.1749-6632.2000.tb06651.x</w:t>
+        </w:r>
+      </w:hyperlink>
+      <w:r>
+        <w:t xml:space="preserve">.</w:t>
+      </w:r>
+    </w:p>
+    <w:bookmarkEnd w:id="88"/>
+    <w:bookmarkStart w:id="90" w:name="ref-furman2019chronic"/>
+    <w:p>
+      <w:pPr>
+        <w:pStyle w:val="Bibliography"/>
+      </w:pPr>
+      <w:r>
+        <w:t xml:space="preserve">Furman, David, Judith Campisi, Eric Verdin, Pedro Carrera-Bastos, Sasha Targ, Claudio Franceschi, et al. 2019.</w:t>
+      </w:r>
+      <w:r>
+        <w:t xml:space="preserve"> </w:t>
+      </w:r>
+      <w:r>
+        <w:t xml:space="preserve">“Chronic Inflammation in the Etiology of Disease Across the Life Span.”</w:t>
+      </w:r>
+      <w:r>
+        <w:t xml:space="preserve"> </w:t>
+      </w:r>
+      <w:r>
+        <w:rPr>
+          <w:iCs/>
+          <w:i/>
+        </w:rPr>
+        <w:t xml:space="preserve">Nature Medicine</w:t>
+      </w:r>
+      <w:r>
+        <w:t xml:space="preserve"> </w:t>
+      </w:r>
+      <w:r>
+        <w:t xml:space="preserve">25 (12): 1822–32.</w:t>
+      </w:r>
+      <w:r>
+        <w:t xml:space="preserve"> </w:t>
+      </w:r>
+      <w:hyperlink r:id="rId89">
+        <w:r>
+          <w:rPr>
+            <w:rStyle w:val="Hyperlink"/>
+          </w:rPr>
+          <w:t xml:space="preserve">https://doi.org/10.1038/s41591-019-0675-0</w:t>
+        </w:r>
+      </w:hyperlink>
+      <w:r>
+        <w:t xml:space="preserve">.</w:t>
+      </w:r>
+    </w:p>
+    <w:bookmarkEnd w:id="90"/>
+    <w:bookmarkStart w:id="92" w:name="ref-goronzy2019tcell"/>
+    <w:p>
+      <w:pPr>
+        <w:pStyle w:val="Bibliography"/>
+      </w:pPr>
+      <w:r>
+        <w:t xml:space="preserve">Goronzy, Jorg J., and Cornelia M. Weyand. 2019.</w:t>
+      </w:r>
+      <w:r>
+        <w:t xml:space="preserve"> </w:t>
+      </w:r>
+      <w:r>
+        <w:t xml:space="preserve">“Mechanisms Underlying t Cell Ageing.”</w:t>
+      </w:r>
+      <w:r>
+        <w:t xml:space="preserve"> </w:t>
+      </w:r>
+      <w:r>
+        <w:rPr>
+          <w:iCs/>
+          <w:i/>
+        </w:rPr>
+        <w:t xml:space="preserve">Nature Reviews Immunology</w:t>
+      </w:r>
+      <w:r>
+        <w:t xml:space="preserve"> </w:t>
+      </w:r>
+      <w:r>
+        <w:t xml:space="preserve">19 (9): 573–83.</w:t>
+      </w:r>
+      <w:r>
+        <w:t xml:space="preserve"> </w:t>
+      </w:r>
+      <w:hyperlink r:id="rId91">
+        <w:r>
+          <w:rPr>
+            <w:rStyle w:val="Hyperlink"/>
+          </w:rPr>
+          <w:t xml:space="preserve">https://doi.org/10.1038/s41577-019-0180-1</w:t>
+        </w:r>
+      </w:hyperlink>
+      <w:r>
+        <w:t xml:space="preserve">.</w:t>
+      </w:r>
+    </w:p>
+    <w:bookmarkEnd w:id="92"/>
+    <w:bookmarkStart w:id="94" w:name="ref-hafemeister2019sctransform"/>
+    <w:p>
+      <w:pPr>
+        <w:pStyle w:val="Bibliography"/>
+      </w:pPr>
+      <w:r>
+        <w:t xml:space="preserve">Hafemeister, Christoph, and Rahul Satija. 2019.</w:t>
+      </w:r>
+      <w:r>
+        <w:t xml:space="preserve"> </w:t>
+      </w:r>
+      <w:r>
+        <w:t xml:space="preserve">“Normalization and Variance Stabilization of Single-Cell</w:t>
+      </w:r>
+      <w:r>
+        <w:t xml:space="preserve"> </w:t>
+      </w:r>
+      <w:r>
+        <w:t xml:space="preserve">RNA</w:t>
+      </w:r>
+      <w:r>
+        <w:t xml:space="preserve">-Seq Data Using Regularized Negative Binomial Regression.”</w:t>
+      </w:r>
+      <w:r>
+        <w:t xml:space="preserve"> </w:t>
+      </w:r>
+      <w:r>
+        <w:rPr>
+          <w:iCs/>
+          <w:i/>
+        </w:rPr>
+        <w:t xml:space="preserve">Genome Biology</w:t>
+      </w:r>
+      <w:r>
+        <w:t xml:space="preserve"> </w:t>
+      </w:r>
+      <w:r>
+        <w:t xml:space="preserve">20 (1).</w:t>
+      </w:r>
+      <w:r>
+        <w:t xml:space="preserve"> </w:t>
+      </w:r>
+      <w:hyperlink r:id="rId93">
+        <w:r>
+          <w:rPr>
+            <w:rStyle w:val="Hyperlink"/>
+          </w:rPr>
+          <w:t xml:space="preserve">https://doi.org/10.1186/s13059-019-1874-1</w:t>
+        </w:r>
+      </w:hyperlink>
+      <w:r>
+        <w:t xml:space="preserve">.</w:t>
+      </w:r>
+    </w:p>
+    <w:bookmarkEnd w:id="94"/>
+    <w:bookmarkStart w:id="96" w:name="ref-haghverdi2018mnn"/>
+    <w:p>
+      <w:pPr>
+        <w:pStyle w:val="Bibliography"/>
+      </w:pPr>
+      <w:r>
+        <w:t xml:space="preserve">Haghverdi, Laleh, Aaron T L Lun, Michael D Morgan, and John C Marioni. 2018.</w:t>
+      </w:r>
+      <w:r>
+        <w:t xml:space="preserve"> </w:t>
+      </w:r>
+      <w:r>
+        <w:t xml:space="preserve">“Batch Effects in Single-Cell</w:t>
+      </w:r>
+      <w:r>
+        <w:t xml:space="preserve"> </w:t>
+      </w:r>
+      <w:r>
+        <w:t xml:space="preserve">RNA</w:t>
+      </w:r>
+      <w:r>
+        <w:t xml:space="preserve">-Sequencing Data Are Corrected by Matching Mutual Nearest Neighbors.”</w:t>
+      </w:r>
+      <w:r>
+        <w:t xml:space="preserve"> </w:t>
+      </w:r>
+      <w:r>
+        <w:rPr>
+          <w:iCs/>
+          <w:i/>
+        </w:rPr>
+        <w:t xml:space="preserve">Nature Biotechnology</w:t>
+      </w:r>
+      <w:r>
+        <w:t xml:space="preserve"> </w:t>
+      </w:r>
+      <w:r>
+        <w:t xml:space="preserve">36 (5): 421–27.</w:t>
+      </w:r>
+      <w:r>
+        <w:t xml:space="preserve"> </w:t>
+      </w:r>
+      <w:hyperlink r:id="rId95">
+        <w:r>
+          <w:rPr>
+            <w:rStyle w:val="Hyperlink"/>
+          </w:rPr>
+          <w:t xml:space="preserve">https://doi.org/10.1038/nbt.4091</w:t>
+        </w:r>
+      </w:hyperlink>
+      <w:r>
+        <w:t xml:space="preserve">.</w:t>
+      </w:r>
+    </w:p>
+    <w:bookmarkEnd w:id="96"/>
+    <w:bookmarkStart w:id="98" w:name="ref-hernandez2018senescence"/>
+    <w:p>
+      <w:pPr>
+        <w:pStyle w:val="Bibliography"/>
+      </w:pPr>
+      <w:r>
+        <w:t xml:space="preserve">Hernandez-Segura, Alejandra, Jamil Nehme, and Marco Demaria. 2018.</w:t>
+      </w:r>
+      <w:r>
+        <w:t xml:space="preserve"> </w:t>
+      </w:r>
+      <w:r>
+        <w:t xml:space="preserve">“Hallmarks of Cellular Senescence.”</w:t>
+      </w:r>
+      <w:r>
+        <w:t xml:space="preserve"> </w:t>
+      </w:r>
+      <w:r>
+        <w:rPr>
+          <w:iCs/>
+          <w:i/>
+        </w:rPr>
+        <w:t xml:space="preserve">Trends in Cell Biology</w:t>
+      </w:r>
+      <w:r>
+        <w:t xml:space="preserve"> </w:t>
+      </w:r>
+      <w:r>
+        <w:t xml:space="preserve">28 (6): 436–53.</w:t>
+      </w:r>
+      <w:r>
+        <w:t xml:space="preserve"> </w:t>
+      </w:r>
+      <w:hyperlink r:id="rId97">
+        <w:r>
+          <w:rPr>
+            <w:rStyle w:val="Hyperlink"/>
+          </w:rPr>
+          <w:t xml:space="preserve">https://doi.org/10.1016/j.tcb.2018.02.001</w:t>
+        </w:r>
+      </w:hyperlink>
+      <w:r>
+        <w:t xml:space="preserve">.</w:t>
+      </w:r>
+    </w:p>
+    <w:bookmarkEnd w:id="98"/>
+    <w:bookmarkStart w:id="100" w:name="ref-hicks2018missing"/>
+    <w:p>
+      <w:pPr>
+        <w:pStyle w:val="Bibliography"/>
+      </w:pPr>
+      <w:r>
+        <w:t xml:space="preserve">Hicks, Stephanie C, F William Townes, Mingxiang Teng, and Rafael A Irizarry. 2018.</w:t>
+      </w:r>
+      <w:r>
+        <w:t xml:space="preserve"> </w:t>
+      </w:r>
+      <w:r>
+        <w:t xml:space="preserve">“Missing Data and Technical Variability in Single-Cell</w:t>
+      </w:r>
+      <w:r>
+        <w:t xml:space="preserve"> </w:t>
+      </w:r>
+      <w:r>
+        <w:t xml:space="preserve">RNA</w:t>
+      </w:r>
+      <w:r>
+        <w:t xml:space="preserve">-Sequencing Experiments.”</w:t>
+      </w:r>
+      <w:r>
+        <w:t xml:space="preserve"> </w:t>
+      </w:r>
+      <w:r>
+        <w:rPr>
+          <w:iCs/>
+          <w:i/>
+        </w:rPr>
+        <w:t xml:space="preserve">Biostatistics</w:t>
+      </w:r>
+      <w:r>
+        <w:t xml:space="preserve"> </w:t>
+      </w:r>
+      <w:r>
+        <w:t xml:space="preserve">19 (4): 562–78.</w:t>
+      </w:r>
+      <w:r>
+        <w:t xml:space="preserve"> </w:t>
+      </w:r>
+      <w:hyperlink r:id="rId99">
+        <w:r>
+          <w:rPr>
+            <w:rStyle w:val="Hyperlink"/>
+          </w:rPr>
+          <w:t xml:space="preserve">https://doi.org/10.1093/biostatistics/kxx053</w:t>
+        </w:r>
+      </w:hyperlink>
+      <w:r>
+        <w:t xml:space="preserve">.</w:t>
+      </w:r>
+    </w:p>
+    <w:bookmarkEnd w:id="100"/>
+    <w:bookmarkStart w:id="102" w:name="ref-horvath2013age"/>
+    <w:p>
+      <w:pPr>
+        <w:pStyle w:val="Bibliography"/>
+      </w:pPr>
+      <w:r>
+        <w:t xml:space="preserve">Horvath, Steve. 2013.</w:t>
+      </w:r>
+      <w:r>
+        <w:t xml:space="preserve"> </w:t>
+      </w:r>
+      <w:r>
+        <w:t xml:space="preserve">“</w:t>
+      </w:r>
+      <w:r>
+        <w:t xml:space="preserve">DNA</w:t>
+      </w:r>
+      <w:r>
+        <w:t xml:space="preserve"> </w:t>
+      </w:r>
+      <w:r>
+        <w:t xml:space="preserve">Methylation Age of Human Tissues and Cell Types.”</w:t>
+      </w:r>
+      <w:r>
+        <w:t xml:space="preserve"> </w:t>
+      </w:r>
+      <w:r>
+        <w:rPr>
+          <w:iCs/>
+          <w:i/>
+        </w:rPr>
+        <w:t xml:space="preserve">Genome Biology</w:t>
+      </w:r>
+      <w:r>
+        <w:t xml:space="preserve"> </w:t>
+      </w:r>
+      <w:r>
+        <w:t xml:space="preserve">14 (10).</w:t>
+      </w:r>
+      <w:r>
+        <w:t xml:space="preserve"> </w:t>
+      </w:r>
+      <w:hyperlink r:id="rId101">
+        <w:r>
+          <w:rPr>
+            <w:rStyle w:val="Hyperlink"/>
+          </w:rPr>
+          <w:t xml:space="preserve">https://doi.org/10.1186/gb-2013-14-10-r115</w:t>
+        </w:r>
+      </w:hyperlink>
+      <w:r>
+        <w:t xml:space="preserve">.</w:t>
+      </w:r>
+    </w:p>
+    <w:bookmarkEnd w:id="102"/>
+    <w:bookmarkStart w:id="104" w:name="ref-kennedy2014geroscience"/>
+    <w:p>
+      <w:pPr>
+        <w:pStyle w:val="Bibliography"/>
+      </w:pPr>
+      <w:r>
+        <w:t xml:space="preserve">Kennedy, Brian K., Shelley L. Berger, Anne Brunet, Judith Campisi, Ana Maria Cuervo, Elissa S. Epel, et al. 2014.</w:t>
+      </w:r>
+      <w:r>
+        <w:t xml:space="preserve"> </w:t>
+      </w:r>
+      <w:r>
+        <w:t xml:space="preserve">“Geroscience: Linking Aging to Chronic Disease.”</w:t>
+      </w:r>
+      <w:r>
+        <w:t xml:space="preserve"> </w:t>
+      </w:r>
+      <w:r>
+        <w:rPr>
+          <w:iCs/>
+          <w:i/>
+        </w:rPr>
+        <w:t xml:space="preserve">Cell</w:t>
+      </w:r>
+      <w:r>
+        <w:t xml:space="preserve"> </w:t>
+      </w:r>
+      <w:r>
+        <w:t xml:space="preserve">159 (4): 709–13.</w:t>
+      </w:r>
+      <w:r>
+        <w:t xml:space="preserve"> </w:t>
+      </w:r>
+      <w:hyperlink r:id="rId103">
+        <w:r>
+          <w:rPr>
+            <w:rStyle w:val="Hyperlink"/>
+          </w:rPr>
+          <w:t xml:space="preserve">https://doi.org/10.1016/j.cell.2014.10.039</w:t>
+        </w:r>
+      </w:hyperlink>
+      <w:r>
+        <w:t xml:space="preserve">.</w:t>
+      </w:r>
+    </w:p>
+    <w:bookmarkEnd w:id="104"/>
+    <w:bookmarkStart w:id="106" w:name="ref-korsunsky2019harmony"/>
+    <w:p>
+      <w:pPr>
+        <w:pStyle w:val="Bibliography"/>
+      </w:pPr>
+      <w:r>
+        <w:t xml:space="preserve">Korsunsky, Ilya, Nghia Millard, Jean Fan, Kamil Slowikowski, Fan Zhang, Kevin Wei, et al. 2019.</w:t>
+      </w:r>
+      <w:r>
+        <w:t xml:space="preserve"> </w:t>
+      </w:r>
+      <w:r>
+        <w:t xml:space="preserve">“Fast, Sensitive and Accurate Integration of Single-Cell Data with Harmony.”</w:t>
+      </w:r>
+      <w:r>
+        <w:t xml:space="preserve"> </w:t>
+      </w:r>
+      <w:r>
+        <w:rPr>
+          <w:iCs/>
+          <w:i/>
+        </w:rPr>
+        <w:t xml:space="preserve">Nature Methods</w:t>
+      </w:r>
+      <w:r>
+        <w:t xml:space="preserve"> </w:t>
+      </w:r>
+      <w:r>
+        <w:t xml:space="preserve">16 (12): 1289–96.</w:t>
+      </w:r>
+      <w:r>
+        <w:t xml:space="preserve"> </w:t>
+      </w:r>
+      <w:hyperlink r:id="rId105">
+        <w:r>
+          <w:rPr>
+            <w:rStyle w:val="Hyperlink"/>
+          </w:rPr>
+          <w:t xml:space="preserve">https://doi.org/10.1038/s41592-019-0619-0</w:t>
+        </w:r>
+      </w:hyperlink>
+      <w:r>
+        <w:t xml:space="preserve">.</w:t>
+      </w:r>
+    </w:p>
+    <w:bookmarkEnd w:id="106"/>
+    <w:bookmarkStart w:id="108" w:name="ref-lopez2013hallmarks"/>
+    <w:p>
+      <w:pPr>
+        <w:pStyle w:val="Bibliography"/>
+      </w:pPr>
+      <w:r>
+        <w:t xml:space="preserve">Lopez-Otin, Carlos, Maria A. Blasco, Linda Partridge, Manuel Serrano, and Guido Kroemer. 2013.</w:t>
+      </w:r>
+      <w:r>
+        <w:t xml:space="preserve"> </w:t>
+      </w:r>
+      <w:r>
+        <w:t xml:space="preserve">“The Hallmarks of Aging.”</w:t>
+      </w:r>
+      <w:r>
+        <w:t xml:space="preserve"> </w:t>
+      </w:r>
+      <w:r>
+        <w:rPr>
+          <w:iCs/>
+          <w:i/>
+        </w:rPr>
+        <w:t xml:space="preserve">Cell</w:t>
+      </w:r>
+      <w:r>
+        <w:t xml:space="preserve"> </w:t>
+      </w:r>
+      <w:r>
+        <w:t xml:space="preserve">153 (6): 1194–1217.</w:t>
+      </w:r>
+      <w:r>
+        <w:t xml:space="preserve"> </w:t>
+      </w:r>
+      <w:hyperlink r:id="rId107">
+        <w:r>
+          <w:rPr>
+            <w:rStyle w:val="Hyperlink"/>
+          </w:rPr>
+          <w:t xml:space="preserve">https://doi.org/10.1016/j.cell.2013.05.039</w:t>
+        </w:r>
+      </w:hyperlink>
+      <w:r>
+        <w:t xml:space="preserve">.</w:t>
+      </w:r>
+    </w:p>
+    <w:bookmarkEnd w:id="108"/>
+    <w:bookmarkStart w:id="110" w:name="ref-lopez2023hallmarks"/>
+    <w:p>
+      <w:pPr>
+        <w:pStyle w:val="Bibliography"/>
+      </w:pPr>
+      <w:r>
+        <w:t xml:space="preserve">———. 2023.</w:t>
+      </w:r>
+      <w:r>
+        <w:t xml:space="preserve"> </w:t>
+      </w:r>
+      <w:r>
+        <w:t xml:space="preserve">“Hallmarks of Aging: An Expanding Universe.”</w:t>
+      </w:r>
+      <w:r>
+        <w:t xml:space="preserve"> </w:t>
+      </w:r>
+      <w:r>
+        <w:rPr>
+          <w:iCs/>
+          <w:i/>
+        </w:rPr>
+        <w:t xml:space="preserve">Cell</w:t>
+      </w:r>
+      <w:r>
+        <w:t xml:space="preserve"> </w:t>
+      </w:r>
+      <w:r>
+        <w:t xml:space="preserve">186 (2): 243–78.</w:t>
+      </w:r>
+      <w:r>
+        <w:t xml:space="preserve"> </w:t>
+      </w:r>
+      <w:hyperlink r:id="rId109">
+        <w:r>
+          <w:rPr>
+            <w:rStyle w:val="Hyperlink"/>
+          </w:rPr>
+          <w:t xml:space="preserve">https://doi.org/10.1016/j.cell.2022.11.001</w:t>
+        </w:r>
+      </w:hyperlink>
+      <w:r>
+        <w:t xml:space="preserve">.</w:t>
+      </w:r>
+    </w:p>
+    <w:bookmarkEnd w:id="110"/>
+    <w:bookmarkStart w:id="112" w:name="ref-lu2019grimage"/>
+    <w:p>
+      <w:pPr>
+        <w:pStyle w:val="Bibliography"/>
+      </w:pPr>
+      <w:r>
+        <w:t xml:space="preserve">Lu, Ake T., Austin Quach, James G. Wilson, Alex P. Reiner, Abraham Aviv, Kenneth Raj, et al. 2019.</w:t>
+      </w:r>
+      <w:r>
+        <w:t xml:space="preserve"> </w:t>
+      </w:r>
+      <w:r>
+        <w:t xml:space="preserve">“</w:t>
+      </w:r>
+      <w:r>
+        <w:t xml:space="preserve">DNA</w:t>
+      </w:r>
+      <w:r>
+        <w:t xml:space="preserve"> </w:t>
+      </w:r>
+      <w:r>
+        <w:t xml:space="preserve">Methylation GrimAge Strongly Predicts Lifespan and Healthspan.”</w:t>
+      </w:r>
+      <w:r>
+        <w:t xml:space="preserve"> </w:t>
+      </w:r>
+      <w:r>
+        <w:rPr>
+          <w:iCs/>
+          <w:i/>
+        </w:rPr>
+        <w:t xml:space="preserve">Aging</w:t>
+      </w:r>
+      <w:r>
+        <w:t xml:space="preserve"> </w:t>
+      </w:r>
+      <w:r>
+        <w:t xml:space="preserve">11 (2): 303–27.</w:t>
+      </w:r>
+      <w:r>
+        <w:t xml:space="preserve"> </w:t>
+      </w:r>
+      <w:hyperlink r:id="rId111">
+        <w:r>
+          <w:rPr>
+            <w:rStyle w:val="Hyperlink"/>
+          </w:rPr>
+          <w:t xml:space="preserve">https://doi.org/10.18632/aging.101684</w:t>
+        </w:r>
+      </w:hyperlink>
+      <w:r>
+        <w:t xml:space="preserve">.</w:t>
+      </w:r>
+    </w:p>
+    <w:bookmarkEnd w:id="112"/>
+    <w:bookmarkStart w:id="114" w:name="ref-luecken2019bestpractices"/>
+    <w:p>
+      <w:pPr>
+        <w:pStyle w:val="Bibliography"/>
+      </w:pPr>
+      <w:r>
+        <w:t xml:space="preserve">Luecken, Malte D, and Fabian J Theis. 2019.</w:t>
+      </w:r>
+      <w:r>
+        <w:t xml:space="preserve"> </w:t>
+      </w:r>
+      <w:r>
+        <w:t xml:space="preserve">“Current Best Practices in Singlecell</w:t>
+      </w:r>
+      <w:r>
+        <w:t xml:space="preserve"> </w:t>
+      </w:r>
+      <w:r>
+        <w:t xml:space="preserve">RNA</w:t>
+      </w:r>
+      <w:r>
+        <w:t xml:space="preserve">seq Analysis: A Tutorial.”</w:t>
+      </w:r>
+      <w:r>
+        <w:t xml:space="preserve"> </w:t>
+      </w:r>
+      <w:r>
+        <w:rPr>
+          <w:iCs/>
+          <w:i/>
+        </w:rPr>
+        <w:t xml:space="preserve">Molecular Systems Biology</w:t>
+      </w:r>
+      <w:r>
+        <w:t xml:space="preserve"> </w:t>
+      </w:r>
+      <w:r>
+        <w:t xml:space="preserve">15 (6).</w:t>
+      </w:r>
+      <w:r>
+        <w:t xml:space="preserve"> </w:t>
+      </w:r>
+      <w:hyperlink r:id="rId113">
+        <w:r>
+          <w:rPr>
+            <w:rStyle w:val="Hyperlink"/>
+          </w:rPr>
+          <w:t xml:space="preserve">https://doi.org/10.15252/msb.20188746</w:t>
+        </w:r>
+      </w:hyperlink>
+      <w:r>
+        <w:t xml:space="preserve">.</w:t>
+      </w:r>
+    </w:p>
+    <w:bookmarkEnd w:id="114"/>
+    <w:bookmarkStart w:id="116" w:name="ref-nikolich2018twilight"/>
+    <w:p>
+      <w:pPr>
+        <w:pStyle w:val="Bibliography"/>
+      </w:pPr>
+      <w:r>
+        <w:t xml:space="preserve">Nikolich-Zugich, Janko. 2018.</w:t>
+      </w:r>
+      <w:r>
+        <w:t xml:space="preserve"> </w:t>
+      </w:r>
+      <w:r>
+        <w:t xml:space="preserve">“The Twilight of Immunity: Emerging Concepts in Aging of the Immune System.”</w:t>
+      </w:r>
+      <w:r>
+        <w:t xml:space="preserve"> </w:t>
+      </w:r>
+      <w:r>
+        <w:rPr>
+          <w:iCs/>
+          <w:i/>
+        </w:rPr>
+        <w:t xml:space="preserve">Nature Immunology</w:t>
+      </w:r>
+      <w:r>
+        <w:t xml:space="preserve"> </w:t>
+      </w:r>
+      <w:r>
+        <w:t xml:space="preserve">19 (1): 10–19.</w:t>
+      </w:r>
+      <w:r>
+        <w:t xml:space="preserve"> </w:t>
+      </w:r>
+      <w:hyperlink r:id="rId115">
+        <w:r>
+          <w:rPr>
+            <w:rStyle w:val="Hyperlink"/>
+          </w:rPr>
+          <w:t xml:space="preserve">https://doi.org/10.1038/s41590-017-0006-x</w:t>
+        </w:r>
+      </w:hyperlink>
+      <w:r>
+        <w:t xml:space="preserve">.</w:t>
+      </w:r>
+    </w:p>
+    <w:bookmarkEnd w:id="116"/>
+    <w:bookmarkStart w:id="118" w:name="ref-olah2020circuits"/>
+    <w:p>
+      <w:pPr>
+        <w:pStyle w:val="Bibliography"/>
+      </w:pPr>
+      <w:r>
+        <w:t xml:space="preserve">Olah, Chris, Nick Cammarata, Ludwig Schubert, Gabriel Goh, Michael Petrov, and Shan Carter. 2020.</w:t>
+      </w:r>
+      <w:r>
+        <w:t xml:space="preserve"> </w:t>
+      </w:r>
+      <w:r>
+        <w:t xml:space="preserve">“Zoom in: An Introduction to Circuits.”</w:t>
+      </w:r>
+      <w:r>
+        <w:t xml:space="preserve"> </w:t>
+      </w:r>
+      <w:r>
+        <w:rPr>
+          <w:iCs/>
+          <w:i/>
+        </w:rPr>
+        <w:t xml:space="preserve">Distill</w:t>
+      </w:r>
+      <w:r>
+        <w:t xml:space="preserve"> </w:t>
+      </w:r>
+      <w:r>
+        <w:t xml:space="preserve">5 (3).</w:t>
+      </w:r>
+      <w:r>
+        <w:t xml:space="preserve"> </w:t>
+      </w:r>
+      <w:hyperlink r:id="rId117">
+        <w:r>
+          <w:rPr>
+            <w:rStyle w:val="Hyperlink"/>
+          </w:rPr>
+          <w:t xml:space="preserve">https://doi.org/10.23915/distill.00024.001</w:t>
+        </w:r>
+      </w:hyperlink>
+      <w:r>
+        <w:t xml:space="preserve">.</w:t>
+      </w:r>
+    </w:p>
+    <w:bookmarkEnd w:id="118"/>
+    <w:bookmarkStart w:id="120" w:name="ref-peters2015bloodage"/>
+    <w:p>
+      <w:pPr>
+        <w:pStyle w:val="Bibliography"/>
+      </w:pPr>
+      <w:r>
+        <w:t xml:space="preserve">Peters, Marjolein J., Roby Joehanes, Luke C. Pilling, Claudia Schurmann, Karen N. Conneely, Joseph Powell, et al. 2015.</w:t>
+      </w:r>
+      <w:r>
+        <w:t xml:space="preserve"> </w:t>
+      </w:r>
+      <w:r>
+        <w:t xml:space="preserve">“The Transcriptional Landscape of Age in Human Peripheral Blood.”</w:t>
+      </w:r>
+      <w:r>
+        <w:t xml:space="preserve"> </w:t>
+      </w:r>
+      <w:r>
+        <w:rPr>
+          <w:iCs/>
+          <w:i/>
+        </w:rPr>
+        <w:t xml:space="preserve">Nature Communications</w:t>
+      </w:r>
+      <w:r>
+        <w:t xml:space="preserve"> </w:t>
+      </w:r>
+      <w:r>
+        <w:t xml:space="preserve">6 (1).</w:t>
+      </w:r>
+      <w:r>
+        <w:t xml:space="preserve"> </w:t>
+      </w:r>
+      <w:hyperlink r:id="rId119">
+        <w:r>
+          <w:rPr>
+            <w:rStyle w:val="Hyperlink"/>
+          </w:rPr>
+          <w:t xml:space="preserve">https://doi.org/10.1038/ncomms9570</w:t>
+        </w:r>
+      </w:hyperlink>
+      <w:r>
+        <w:t xml:space="preserve">.</w:t>
+      </w:r>
+    </w:p>
+    <w:bookmarkEnd w:id="120"/>
+    <w:bookmarkStart w:id="122" w:name="ref-salminen2008nfkb"/>
+    <w:p>
+      <w:pPr>
+        <w:pStyle w:val="Bibliography"/>
+      </w:pPr>
+      <w:r>
+        <w:t xml:space="preserve">Salminen, Antero, Jari Huuskonen, Johanna Ojala, Anu Kauppinen, Kai Kaarniranta, and Tiina Suuronen. 2008.</w:t>
+      </w:r>
+      <w:r>
+        <w:t xml:space="preserve"> </w:t>
+      </w:r>
+      <w:r>
+        <w:t xml:space="preserve">“Activation of Innate Immunity System During Aging:</w:t>
+      </w:r>
+      <w:r>
+        <w:t xml:space="preserve"> </w:t>
+      </w:r>
+      <w:r>
+        <w:t xml:space="preserve">NF-kB</w:t>
+      </w:r>
+      <w:r>
+        <w:t xml:space="preserve"> </w:t>
+      </w:r>
+      <w:r>
+        <w:t xml:space="preserve">Signaling Is the Molecular Culprit of Inflamm-Aging.”</w:t>
+      </w:r>
+      <w:r>
+        <w:t xml:space="preserve"> </w:t>
+      </w:r>
+      <w:r>
+        <w:rPr>
+          <w:iCs/>
+          <w:i/>
+        </w:rPr>
+        <w:t xml:space="preserve">Ageing Research Reviews</w:t>
+      </w:r>
+      <w:r>
+        <w:t xml:space="preserve"> </w:t>
+      </w:r>
+      <w:r>
+        <w:t xml:space="preserve">7 (2): 83–105.</w:t>
+      </w:r>
+      <w:r>
+        <w:t xml:space="preserve"> </w:t>
+      </w:r>
+      <w:hyperlink r:id="rId121">
+        <w:r>
+          <w:rPr>
+            <w:rStyle w:val="Hyperlink"/>
+          </w:rPr>
+          <w:t xml:space="preserve">https://doi.org/10.1016/j.arr.2007.09.002</w:t>
+        </w:r>
+      </w:hyperlink>
+      <w:r>
+        <w:t xml:space="preserve">.</w:t>
+      </w:r>
+    </w:p>
+    <w:bookmarkEnd w:id="122"/>
+    <w:bookmarkStart w:id="124" w:name="ref-schaum2020hallmarks"/>
+    <w:p>
+      <w:pPr>
+        <w:pStyle w:val="Bibliography"/>
+      </w:pPr>
+      <w:r>
+        <w:t xml:space="preserve">Schaum, Nicholas, Benoit Lehallier, Oliver Hahn, Robert Palovics, Shayan Hosseinzadeh, Song E. Lee, et al. 2020.</w:t>
+      </w:r>
+      <w:r>
+        <w:t xml:space="preserve"> </w:t>
+      </w:r>
+      <w:r>
+        <w:t xml:space="preserve">“Ageing Hallmarks Exhibit Organ-Specific Temporal Signatures.”</w:t>
+      </w:r>
+      <w:r>
+        <w:t xml:space="preserve"> </w:t>
+      </w:r>
+      <w:r>
+        <w:rPr>
+          <w:iCs/>
+          <w:i/>
+        </w:rPr>
+        <w:t xml:space="preserve">Nature</w:t>
+      </w:r>
+      <w:r>
+        <w:t xml:space="preserve"> </w:t>
+      </w:r>
+      <w:r>
+        <w:t xml:space="preserve">583 (7817): 596–602.</w:t>
+      </w:r>
+      <w:r>
+        <w:t xml:space="preserve"> </w:t>
+      </w:r>
+      <w:hyperlink r:id="rId123">
+        <w:r>
+          <w:rPr>
+            <w:rStyle w:val="Hyperlink"/>
+          </w:rPr>
+          <w:t xml:space="preserve">https://doi.org/10.1038/s41586-020-2499-y</w:t>
+        </w:r>
+      </w:hyperlink>
+      <w:r>
+        <w:t xml:space="preserve">.</w:t>
+      </w:r>
+    </w:p>
+    <w:bookmarkEnd w:id="124"/>
+    <w:bookmarkStart w:id="126" w:name="ref-squair2021false"/>
+    <w:p>
+      <w:pPr>
+        <w:pStyle w:val="Bibliography"/>
+      </w:pPr>
+      <w:r>
+        <w:t xml:space="preserve">Squair, Jordan W., Matthieu Gautier, Claudia Kathe, Mark A. Anderson, Nicholas D. James, Thomas H. Hutson, et al. 2021.</w:t>
+      </w:r>
+      <w:r>
+        <w:t xml:space="preserve"> </w:t>
+      </w:r>
+      <w:r>
+        <w:t xml:space="preserve">“Confronting False Discoveries in Single-Cell Differential Expression.”</w:t>
+      </w:r>
+      <w:r>
+        <w:t xml:space="preserve"> </w:t>
+      </w:r>
+      <w:r>
+        <w:rPr>
+          <w:iCs/>
+          <w:i/>
+        </w:rPr>
+        <w:t xml:space="preserve">Nature Communications</w:t>
+      </w:r>
+      <w:r>
+        <w:t xml:space="preserve"> </w:t>
+      </w:r>
+      <w:r>
+        <w:t xml:space="preserve">12 (1).</w:t>
+      </w:r>
+      <w:r>
+        <w:t xml:space="preserve"> </w:t>
+      </w:r>
+      <w:hyperlink r:id="rId125">
+        <w:r>
+          <w:rPr>
+            <w:rStyle w:val="Hyperlink"/>
+          </w:rPr>
+          <w:t xml:space="preserve">https://doi.org/10.1038/s41467-021-25960-2</w:t>
+        </w:r>
+      </w:hyperlink>
+      <w:r>
+        <w:t xml:space="preserve">.</w:t>
+      </w:r>
+    </w:p>
+    <w:bookmarkEnd w:id="126"/>
+    <w:bookmarkStart w:id="128" w:name="ref-stuart2019integration"/>
+    <w:p>
+      <w:pPr>
+        <w:pStyle w:val="Bibliography"/>
+      </w:pPr>
+      <w:r>
+        <w:t xml:space="preserve">Stuart, Tim, Andrew Butler, Paul Hoffman, Christoph Hafemeister, Efthymia Papalexi, William M. Mauck, et al. 2019.</w:t>
+      </w:r>
+      <w:r>
+        <w:t xml:space="preserve"> </w:t>
+      </w:r>
+      <w:r>
+        <w:t xml:space="preserve">“Comprehensive Integration of Single-Cell Data.”</w:t>
+      </w:r>
+      <w:r>
+        <w:t xml:space="preserve"> </w:t>
+      </w:r>
+      <w:r>
+        <w:rPr>
+          <w:iCs/>
+          <w:i/>
+        </w:rPr>
+        <w:t xml:space="preserve">Cell</w:t>
+      </w:r>
+      <w:r>
+        <w:t xml:space="preserve"> </w:t>
+      </w:r>
+      <w:r>
+        <w:t xml:space="preserve">177 (7): 1888–1902.e21.</w:t>
+      </w:r>
+      <w:r>
+        <w:t xml:space="preserve"> </w:t>
+      </w:r>
+      <w:hyperlink r:id="rId127">
+        <w:r>
+          <w:rPr>
+            <w:rStyle w:val="Hyperlink"/>
+          </w:rPr>
+          <w:t xml:space="preserve">https://doi.org/10.1016/j.cell.2019.05.031</w:t>
+        </w:r>
+      </w:hyperlink>
+      <w:r>
+        <w:t xml:space="preserve">.</w:t>
+      </w:r>
+    </w:p>
+    <w:bookmarkEnd w:id="128"/>
+    <w:bookmarkStart w:id="130" w:name="ref-templeton2024scaling"/>
+    <w:p>
+      <w:pPr>
+        <w:pStyle w:val="Bibliography"/>
+      </w:pPr>
+      <w:r>
         <w:t xml:space="preserve">Templeton, Adly, Trenton Bricken, Joshua Batson, et al. 2024.</w:t>
       </w:r>
       <w:r>
@@ -4226,7 +5738,7 @@
       <w:r>
         <w:t xml:space="preserve"> </w:t>
       </w:r>
-      <w:hyperlink r:id="rId70">
+      <w:hyperlink r:id="rId129">
         <w:r>
           <w:rPr>
             <w:rStyle w:val="Hyperlink"/>
@@ -4238,14 +5750,14 @@
         <w:t xml:space="preserve">.</w:t>
       </w:r>
     </w:p>
-    <w:bookmarkEnd w:id="71"/>
-    <w:bookmarkStart w:id="73" w:name="ref-theodoris2023geneformer"/>
+    <w:bookmarkEnd w:id="130"/>
+    <w:bookmarkStart w:id="132" w:name="ref-theodoris2023geneformer"/>
     <w:p>
       <w:pPr>
         <w:pStyle w:val="Bibliography"/>
       </w:pPr>
       <w:r>
-        <w:t xml:space="preserve">Theodoris, Christina V., Ling Xiao, Aashi Chopra, et al. 2023.</w:t>
+        <w:t xml:space="preserve">Theodoris, Christina V., Ling Xiao, Anant Chopra, Mark D. Chaffin, Zeina R. Al Sayed, Matthew C. Hill, et al. 2023.</w:t>
       </w:r>
       <w:r>
         <w:t xml:space="preserve"> </w:t>
@@ -4267,12 +5779,12 @@
         <w:t xml:space="preserve"> </w:t>
       </w:r>
       <w:r>
-        <w:t xml:space="preserve">618 (7964): 355–64.</w:t>
-      </w:r>
-      <w:r>
-        <w:t xml:space="preserve"> </w:t>
-      </w:r>
-      <w:hyperlink r:id="rId72">
+        <w:t xml:space="preserve">618 (7965): 616–24.</w:t>
+      </w:r>
+      <w:r>
+        <w:t xml:space="preserve"> </w:t>
+      </w:r>
+      <w:hyperlink r:id="rId131">
         <w:r>
           <w:rPr>
             <w:rStyle w:val="Hyperlink"/>
@@ -4284,20 +5796,179 @@
         <w:t xml:space="preserve">.</w:t>
       </w:r>
     </w:p>
-    <w:bookmarkEnd w:id="73"/>
-    <w:bookmarkStart w:id="75" w:name="ref-yazar2022"/>
+    <w:bookmarkEnd w:id="132"/>
+    <w:bookmarkStart w:id="134" w:name="ref-tran2020batch"/>
     <w:p>
       <w:pPr>
         <w:pStyle w:val="Bibliography"/>
       </w:pPr>
       <w:r>
-        <w:t xml:space="preserve">Yazar, S., J. Alquicira-Hernandez, K. Wing, et al. 2022.</w:t>
-      </w:r>
-      <w:r>
-        <w:t xml:space="preserve"> </w:t>
-      </w:r>
-      <w:r>
-        <w:t xml:space="preserve">“Single-Cell eQTL Mapping Identifies Cell Type-Specific Genetic Control of Autoimmune Disease.”</w:t>
+        <w:t xml:space="preserve">Tran, Hoa Thi Nhu, Kok Siong Ang, Marion Chevrier, Xiaomeng Zhang, Nicole Yee Shin Lee, Michelle Goh, et al. 2020.</w:t>
+      </w:r>
+      <w:r>
+        <w:t xml:space="preserve"> </w:t>
+      </w:r>
+      <w:r>
+        <w:t xml:space="preserve">“A Benchmark of Batch-Effect Correction Methods for Single-Cell</w:t>
+      </w:r>
+      <w:r>
+        <w:t xml:space="preserve"> </w:t>
+      </w:r>
+      <w:r>
+        <w:t xml:space="preserve">RNA</w:t>
+      </w:r>
+      <w:r>
+        <w:t xml:space="preserve"> </w:t>
+      </w:r>
+      <w:r>
+        <w:t xml:space="preserve">Sequencing Data.”</w:t>
+      </w:r>
+      <w:r>
+        <w:t xml:space="preserve"> </w:t>
+      </w:r>
+      <w:r>
+        <w:rPr>
+          <w:iCs/>
+          <w:i/>
+        </w:rPr>
+        <w:t xml:space="preserve">Genome Biology</w:t>
+      </w:r>
+      <w:r>
+        <w:t xml:space="preserve"> </w:t>
+      </w:r>
+      <w:r>
+        <w:t xml:space="preserve">21 (1).</w:t>
+      </w:r>
+      <w:r>
+        <w:t xml:space="preserve"> </w:t>
+      </w:r>
+      <w:hyperlink r:id="rId133">
+        <w:r>
+          <w:rPr>
+            <w:rStyle w:val="Hyperlink"/>
+          </w:rPr>
+          <w:t xml:space="preserve">https://doi.org/10.1186/s13059-019-1850-9</w:t>
+        </w:r>
+      </w:hyperlink>
+      <w:r>
+        <w:t xml:space="preserve">.</w:t>
+      </w:r>
+    </w:p>
+    <w:bookmarkEnd w:id="134"/>
+    <w:bookmarkStart w:id="136" w:name="ref-vaswani2017attention"/>
+    <w:p>
+      <w:pPr>
+        <w:pStyle w:val="Bibliography"/>
+      </w:pPr>
+      <w:r>
+        <w:t xml:space="preserve">Vaswani, Ashish, Noam Shazeer, Niki Parmar, Jakob Uszkoreit, Llion Jones, Aidan N. Gomez, Lukasz Kaiser, and Illia Polosukhin. 2017.</w:t>
+      </w:r>
+      <w:r>
+        <w:t xml:space="preserve"> </w:t>
+      </w:r>
+      <w:r>
+        <w:t xml:space="preserve">“Attention Is All You Need.”</w:t>
+      </w:r>
+      <w:r>
+        <w:t xml:space="preserve"> </w:t>
+      </w:r>
+      <w:r>
+        <w:t xml:space="preserve">In</w:t>
+      </w:r>
+      <w:r>
+        <w:t xml:space="preserve"> </w:t>
+      </w:r>
+      <w:r>
+        <w:rPr>
+          <w:iCs/>
+          <w:i/>
+        </w:rPr>
+        <w:t xml:space="preserve">Advances in Neural Information Processing Systems 30</w:t>
+      </w:r>
+      <w:r>
+        <w:t xml:space="preserve">.</w:t>
+      </w:r>
+      <w:r>
+        <w:t xml:space="preserve"> </w:t>
+      </w:r>
+      <w:hyperlink r:id="rId135">
+        <w:r>
+          <w:rPr>
+            <w:rStyle w:val="Hyperlink"/>
+          </w:rPr>
+          <w:t xml:space="preserve">https://papers.neurips.cc/paper/7181-attention-is-all-you-need</w:t>
+        </w:r>
+      </w:hyperlink>
+      <w:r>
+        <w:t xml:space="preserve">.</w:t>
+      </w:r>
+    </w:p>
+    <w:bookmarkEnd w:id="136"/>
+    <w:bookmarkStart w:id="138" w:name="ref-wolf2018scanpy"/>
+    <w:p>
+      <w:pPr>
+        <w:pStyle w:val="Bibliography"/>
+      </w:pPr>
+      <w:r>
+        <w:t xml:space="preserve">Wolf, F. Alexander, Philipp Angerer, and Fabian J. Theis. 2018.</w:t>
+      </w:r>
+      <w:r>
+        <w:t xml:space="preserve"> </w:t>
+      </w:r>
+      <w:r>
+        <w:t xml:space="preserve">“</w:t>
+      </w:r>
+      <w:r>
+        <w:t xml:space="preserve">SCANPY</w:t>
+      </w:r>
+      <w:r>
+        <w:t xml:space="preserve">: Large-Scale Single-Cell Gene Expression Data Analysis.”</w:t>
+      </w:r>
+      <w:r>
+        <w:t xml:space="preserve"> </w:t>
+      </w:r>
+      <w:r>
+        <w:rPr>
+          <w:iCs/>
+          <w:i/>
+        </w:rPr>
+        <w:t xml:space="preserve">Genome Biology</w:t>
+      </w:r>
+      <w:r>
+        <w:t xml:space="preserve"> </w:t>
+      </w:r>
+      <w:r>
+        <w:t xml:space="preserve">19 (1).</w:t>
+      </w:r>
+      <w:r>
+        <w:t xml:space="preserve"> </w:t>
+      </w:r>
+      <w:hyperlink r:id="rId137">
+        <w:r>
+          <w:rPr>
+            <w:rStyle w:val="Hyperlink"/>
+          </w:rPr>
+          <w:t xml:space="preserve">https://doi.org/10.1186/s13059-017-1382-0</w:t>
+        </w:r>
+      </w:hyperlink>
+      <w:r>
+        <w:t xml:space="preserve">.</w:t>
+      </w:r>
+    </w:p>
+    <w:bookmarkEnd w:id="138"/>
+    <w:bookmarkStart w:id="140" w:name="ref-yazar2022"/>
+    <w:p>
+      <w:pPr>
+        <w:pStyle w:val="Bibliography"/>
+      </w:pPr>
+      <w:r>
+        <w:t xml:space="preserve">Yazar, Seyhan, Jose Alquicira-Hernandez, Kristof Wing, Anne Senabouth, M. Grace Gordon, Stacey Andersen, et al. 2022.</w:t>
+      </w:r>
+      <w:r>
+        <w:t xml:space="preserve"> </w:t>
+      </w:r>
+      <w:r>
+        <w:t xml:space="preserve">“Single-Cell eQTL Mapping Identifies Cell Type–Specific Genetic Control of Autoimmune Disease.”</w:t>
       </w:r>
       <w:r>
         <w:t xml:space="preserve"> </w:t>
@@ -4313,12 +5984,12 @@
         <w:t xml:space="preserve"> </w:t>
       </w:r>
       <w:r>
-        <w:t xml:space="preserve">376 (6589): eabf3041.</w:t>
-      </w:r>
-      <w:r>
-        <w:t xml:space="preserve"> </w:t>
-      </w:r>
-      <w:hyperlink r:id="rId74">
+        <w:t xml:space="preserve">376 (6589).</w:t>
+      </w:r>
+      <w:r>
+        <w:t xml:space="preserve"> </w:t>
+      </w:r>
+      <w:hyperlink r:id="rId139">
         <w:r>
           <w:rPr>
             <w:rStyle w:val="Hyperlink"/>
@@ -4330,9 +6001,110 @@
         <w:t xml:space="preserve">.</w:t>
       </w:r>
     </w:p>
-    <w:bookmarkEnd w:id="75"/>
-    <w:bookmarkEnd w:id="76"/>
-    <w:bookmarkEnd w:id="77"/>
+    <w:bookmarkEnd w:id="140"/>
+    <w:bookmarkStart w:id="142" w:name="ref-zhang2013hypothalamic"/>
+    <w:p>
+      <w:pPr>
+        <w:pStyle w:val="Bibliography"/>
+      </w:pPr>
+      <w:r>
+        <w:t xml:space="preserve">Zhang, Guo, Juxue Li, Sudarshana Purkayastha, Yizhe Tang, Hai Zhang, Ye Yin, et al. 2013.</w:t>
+      </w:r>
+      <w:r>
+        <w:t xml:space="preserve"> </w:t>
+      </w:r>
+      <w:r>
+        <w:t xml:space="preserve">“Hypothalamic Programming of Systemic Ageing Involving IKK-, NF-b and</w:t>
+      </w:r>
+      <w:r>
+        <w:t xml:space="preserve"> </w:t>
+      </w:r>
+      <w:r>
+        <w:t xml:space="preserve">GnRH</w:t>
+      </w:r>
+      <w:r>
+        <w:t xml:space="preserve">.”</w:t>
+      </w:r>
+      <w:r>
+        <w:t xml:space="preserve"> </w:t>
+      </w:r>
+      <w:r>
+        <w:rPr>
+          <w:iCs/>
+          <w:i/>
+        </w:rPr>
+        <w:t xml:space="preserve">Nature</w:t>
+      </w:r>
+      <w:r>
+        <w:t xml:space="preserve"> </w:t>
+      </w:r>
+      <w:r>
+        <w:t xml:space="preserve">497 (7448): 211–16.</w:t>
+      </w:r>
+      <w:r>
+        <w:t xml:space="preserve"> </w:t>
+      </w:r>
+      <w:hyperlink r:id="rId141">
+        <w:r>
+          <w:rPr>
+            <w:rStyle w:val="Hyperlink"/>
+          </w:rPr>
+          <w:t xml:space="preserve">https://doi.org/10.1038/nature12143</w:t>
+        </w:r>
+      </w:hyperlink>
+      <w:r>
+        <w:t xml:space="preserve">.</w:t>
+      </w:r>
+    </w:p>
+    <w:bookmarkEnd w:id="142"/>
+    <w:bookmarkStart w:id="144" w:name="ref-zimmerman2021pseudoreplication"/>
+    <w:p>
+      <w:pPr>
+        <w:pStyle w:val="Bibliography"/>
+      </w:pPr>
+      <w:r>
+        <w:t xml:space="preserve">Zimmerman, Kip D., Mark A. Espeland, and Carl D. Langefeld. 2021.</w:t>
+      </w:r>
+      <w:r>
+        <w:t xml:space="preserve"> </w:t>
+      </w:r>
+      <w:r>
+        <w:t xml:space="preserve">“A Practical Solution to Pseudoreplication Bias in Single-Cell Studies.”</w:t>
+      </w:r>
+      <w:r>
+        <w:t xml:space="preserve"> </w:t>
+      </w:r>
+      <w:r>
+        <w:rPr>
+          <w:iCs/>
+          <w:i/>
+        </w:rPr>
+        <w:t xml:space="preserve">Nature Communications</w:t>
+      </w:r>
+      <w:r>
+        <w:t xml:space="preserve"> </w:t>
+      </w:r>
+      <w:r>
+        <w:t xml:space="preserve">12 (1).</w:t>
+      </w:r>
+      <w:r>
+        <w:t xml:space="preserve"> </w:t>
+      </w:r>
+      <w:hyperlink r:id="rId143">
+        <w:r>
+          <w:rPr>
+            <w:rStyle w:val="Hyperlink"/>
+          </w:rPr>
+          <w:t xml:space="preserve">https://doi.org/10.1038/s41467-021-21038-1</w:t>
+        </w:r>
+      </w:hyperlink>
+      <w:r>
+        <w:t xml:space="preserve">.</w:t>
+      </w:r>
+    </w:p>
+    <w:bookmarkEnd w:id="144"/>
+    <w:bookmarkEnd w:id="145"/>
+    <w:bookmarkEnd w:id="146"/>
     <w:sectPr/>
   </w:body>
 </w:document>

</xml_diff>

<commit_message>
Polish manuscript for journal submission
</commit_message>
<xml_diff>
--- a/paper/manuscript.docx
+++ b/paper/manuscript.docx
@@ -7,7 +7,49 @@
         <w:pStyle w:val="Title"/>
       </w:pPr>
       <w:r>
-        <w:t xml:space="preserve">A</w:t>
+        <w:t xml:space="preserve">Inflammation-Linked</w:t>
+      </w:r>
+      <w:r>
+        <w:t xml:space="preserve"> </w:t>
+      </w:r>
+      <w:r>
+        <w:t xml:space="preserve">Aging</w:t>
+      </w:r>
+      <w:r>
+        <w:t xml:space="preserve"> </w:t>
+      </w:r>
+      <w:r>
+        <w:t xml:space="preserve">Signals</w:t>
+      </w:r>
+      <w:r>
+        <w:t xml:space="preserve"> </w:t>
+      </w:r>
+      <w:r>
+        <w:t xml:space="preserve">in</w:t>
+      </w:r>
+      <w:r>
+        <w:t xml:space="preserve"> </w:t>
+      </w:r>
+      <w:r>
+        <w:t xml:space="preserve">Frozen</w:t>
+      </w:r>
+      <w:r>
+        <w:t xml:space="preserve"> </w:t>
+      </w:r>
+      <w:r>
+        <w:t xml:space="preserve">Single-Cell</w:t>
+      </w:r>
+      <w:r>
+        <w:t xml:space="preserve"> </w:t>
+      </w:r>
+      <w:r>
+        <w:t xml:space="preserve">Foundation</w:t>
+      </w:r>
+      <w:r>
+        <w:t xml:space="preserve"> </w:t>
+      </w:r>
+      <w:r>
+        <w:t xml:space="preserve">Models:</w:t>
       </w:r>
       <w:r>
         <w:t xml:space="preserve"> </w:t>
@@ -19,67 +61,25 @@
         <w:t xml:space="preserve"> </w:t>
       </w:r>
       <w:r>
-        <w:t xml:space="preserve">Framework</w:t>
-      </w:r>
-      <w:r>
-        <w:t xml:space="preserve"> </w:t>
-      </w:r>
-      <w:r>
-        <w:t xml:space="preserve">for</w:t>
-      </w:r>
-      <w:r>
-        <w:t xml:space="preserve"> </w:t>
-      </w:r>
-      <w:r>
-        <w:t xml:space="preserve">Mechanistic</w:t>
-      </w:r>
-      <w:r>
-        <w:t xml:space="preserve"> </w:t>
-      </w:r>
-      <w:r>
-        <w:t xml:space="preserve">Interpretability</w:t>
-      </w:r>
-      <w:r>
-        <w:t xml:space="preserve"> </w:t>
-      </w:r>
-      <w:r>
-        <w:t xml:space="preserve">of</w:t>
-      </w:r>
-      <w:r>
-        <w:t xml:space="preserve"> </w:t>
-      </w:r>
-      <w:r>
-        <w:t xml:space="preserve">Aging</w:t>
-      </w:r>
-      <w:r>
-        <w:t xml:space="preserve"> </w:t>
-      </w:r>
-      <w:r>
-        <w:t xml:space="preserve">Signals</w:t>
-      </w:r>
-      <w:r>
-        <w:t xml:space="preserve"> </w:t>
-      </w:r>
-      <w:r>
-        <w:t xml:space="preserve">in</w:t>
-      </w:r>
-      <w:r>
-        <w:t xml:space="preserve"> </w:t>
-      </w:r>
-      <w:r>
-        <w:t xml:space="preserve">Single-Cell</w:t>
-      </w:r>
-      <w:r>
-        <w:t xml:space="preserve"> </w:t>
-      </w:r>
-      <w:r>
-        <w:t xml:space="preserve">Foundation</w:t>
-      </w:r>
-      <w:r>
-        <w:t xml:space="preserve"> </w:t>
-      </w:r>
-      <w:r>
-        <w:t xml:space="preserve">Models</w:t>
+        <w:t xml:space="preserve">Detection</w:t>
+      </w:r>
+      <w:r>
+        <w:t xml:space="preserve"> </w:t>
+      </w:r>
+      <w:r>
+        <w:t xml:space="preserve">and</w:t>
+      </w:r>
+      <w:r>
+        <w:t xml:space="preserve"> </w:t>
+      </w:r>
+      <w:r>
+        <w:t xml:space="preserve">Robustness</w:t>
+      </w:r>
+      <w:r>
+        <w:t xml:space="preserve"> </w:t>
+      </w:r>
+      <w:r>
+        <w:t xml:space="preserve">Testing</w:t>
       </w:r>
     </w:p>
     <w:p>
@@ -189,26 +189,6 @@
     </w:p>
     <w:p>
       <w:pPr>
-        <w:pStyle w:val="Date"/>
-      </w:pPr>
-      <w:r>
-        <w:t xml:space="preserve">March</w:t>
-      </w:r>
-      <w:r>
-        <w:t xml:space="preserve"> </w:t>
-      </w:r>
-      <w:r>
-        <w:t xml:space="preserve">31,</w:t>
-      </w:r>
-      <w:r>
-        <w:t xml:space="preserve"> </w:t>
-      </w:r>
-      <w:r>
-        <w:t xml:space="preserve">2026</w:t>
-      </w:r>
-    </w:p>
-    <w:p>
-      <w:pPr>
         <w:pStyle w:val="AbstractTitle"/>
       </w:pPr>
       <w:r>
@@ -238,13 +218,37 @@
         <w:t xml:space="preserve"> </w:t>
       </w:r>
       <w:r>
-        <w:t xml:space="preserve">may</w:t>
-      </w:r>
-      <w:r>
-        <w:t xml:space="preserve"> </w:t>
-      </w:r>
-      <w:r>
-        <w:t xml:space="preserve">encode</w:t>
+        <w:t xml:space="preserve">offer</w:t>
+      </w:r>
+      <w:r>
+        <w:t xml:space="preserve"> </w:t>
+      </w:r>
+      <w:r>
+        <w:t xml:space="preserve">a</w:t>
+      </w:r>
+      <w:r>
+        <w:t xml:space="preserve"> </w:t>
+      </w:r>
+      <w:r>
+        <w:t xml:space="preserve">possible</w:t>
+      </w:r>
+      <w:r>
+        <w:t xml:space="preserve"> </w:t>
+      </w:r>
+      <w:r>
+        <w:t xml:space="preserve">route</w:t>
+      </w:r>
+      <w:r>
+        <w:t xml:space="preserve"> </w:t>
+      </w:r>
+      <w:r>
+        <w:t xml:space="preserve">to</w:t>
+      </w:r>
+      <w:r>
+        <w:t xml:space="preserve"> </w:t>
+      </w:r>
+      <w:r>
+        <w:t xml:space="preserve">studying</w:t>
       </w:r>
       <w:r>
         <w:t xml:space="preserve"> </w:t>
@@ -256,7 +260,25 @@
         <w:t xml:space="preserve"> </w:t>
       </w:r>
       <w:r>
-        <w:t xml:space="preserve">biology,</w:t>
+        <w:t xml:space="preserve">biology</w:t>
+      </w:r>
+      <w:r>
+        <w:t xml:space="preserve"> </w:t>
+      </w:r>
+      <w:r>
+        <w:t xml:space="preserve">in</w:t>
+      </w:r>
+      <w:r>
+        <w:t xml:space="preserve"> </w:t>
+      </w:r>
+      <w:r>
+        <w:t xml:space="preserve">latent</w:t>
+      </w:r>
+      <w:r>
+        <w:t xml:space="preserve"> </w:t>
+      </w:r>
+      <w:r>
+        <w:t xml:space="preserve">space,</w:t>
       </w:r>
       <w:r>
         <w:t xml:space="preserve"> </w:t>
@@ -274,49 +296,325 @@
         <w:t xml:space="preserve"> </w:t>
       </w:r>
       <w:r>
+        <w:t xml:space="preserve">age</w:t>
+      </w:r>
+      <w:r>
+        <w:t xml:space="preserve"> </w:t>
+      </w:r>
+      <w:r>
+        <w:t xml:space="preserve">effects</w:t>
+      </w:r>
+      <w:r>
+        <w:t xml:space="preserve"> </w:t>
+      </w:r>
+      <w:r>
+        <w:t xml:space="preserve">can</w:t>
+      </w:r>
+      <w:r>
+        <w:t xml:space="preserve"> </w:t>
+      </w:r>
+      <w:r>
+        <w:t xml:space="preserve">be</w:t>
+      </w:r>
+      <w:r>
+        <w:t xml:space="preserve"> </w:t>
+      </w:r>
+      <w:r>
+        <w:t xml:space="preserve">distorted</w:t>
+      </w:r>
+      <w:r>
+        <w:t xml:space="preserve"> </w:t>
+      </w:r>
+      <w:r>
+        <w:t xml:space="preserve">by</w:t>
+      </w:r>
+      <w:r>
+        <w:t xml:space="preserve"> </w:t>
+      </w:r>
+      <w:r>
+        <w:t xml:space="preserve">donor</w:t>
+      </w:r>
+      <w:r>
+        <w:t xml:space="preserve"> </w:t>
+      </w:r>
+      <w:r>
+        <w:t xml:space="preserve">identity</w:t>
+      </w:r>
+      <w:r>
+        <w:t xml:space="preserve"> </w:t>
+      </w:r>
+      <w:r>
+        <w:t xml:space="preserve">and</w:t>
+      </w:r>
+      <w:r>
+        <w:t xml:space="preserve"> </w:t>
+      </w:r>
+      <w:r>
+        <w:t xml:space="preserve">cell-composition</w:t>
+      </w:r>
+      <w:r>
+        <w:t xml:space="preserve"> </w:t>
+      </w:r>
+      <w:r>
+        <w:t xml:space="preserve">differences.</w:t>
+      </w:r>
+      <w:r>
+        <w:t xml:space="preserve"> </w:t>
+      </w:r>
+      <w:r>
+        <w:t xml:space="preserve">We</w:t>
+      </w:r>
+      <w:r>
+        <w:t xml:space="preserve"> </w:t>
+      </w:r>
+      <w:r>
+        <w:t xml:space="preserve">developed</w:t>
+      </w:r>
+      <w:r>
+        <w:t xml:space="preserve"> </w:t>
+      </w:r>
+      <w:r>
+        <w:t xml:space="preserve">a</w:t>
+      </w:r>
+      <w:r>
+        <w:t xml:space="preserve"> </w:t>
+      </w:r>
+      <w:r>
+        <w:t xml:space="preserve">donor-aware</w:t>
+      </w:r>
+      <w:r>
+        <w:t xml:space="preserve"> </w:t>
+      </w:r>
+      <w:r>
+        <w:t xml:space="preserve">interpretability</w:t>
+      </w:r>
+      <w:r>
+        <w:t xml:space="preserve"> </w:t>
+      </w:r>
+      <w:r>
+        <w:t xml:space="preserve">workflow</w:t>
+      </w:r>
+      <w:r>
+        <w:t xml:space="preserve"> </w:t>
+      </w:r>
+      <w:r>
+        <w:t xml:space="preserve">to</w:t>
+      </w:r>
+      <w:r>
+        <w:t xml:space="preserve"> </w:t>
+      </w:r>
+      <w:r>
+        <w:t xml:space="preserve">test</w:t>
+      </w:r>
+      <w:r>
+        <w:t xml:space="preserve"> </w:t>
+      </w:r>
+      <w:r>
+        <w:t xml:space="preserve">whether</w:t>
+      </w:r>
+      <w:r>
+        <w:t xml:space="preserve"> </w:t>
+      </w:r>
+      <w:r>
+        <w:t xml:space="preserve">frozen</w:t>
+      </w:r>
+      <w:r>
+        <w:t xml:space="preserve"> </w:t>
+      </w:r>
+      <w:r>
+        <w:t xml:space="preserve">scGPT</w:t>
+      </w:r>
+      <w:r>
+        <w:t xml:space="preserve"> </w:t>
+      </w:r>
+      <w:r>
+        <w:t xml:space="preserve">and</w:t>
+      </w:r>
+      <w:r>
+        <w:t xml:space="preserve"> </w:t>
+      </w:r>
+      <w:r>
+        <w:t xml:space="preserve">Geneformer</w:t>
+      </w:r>
+      <w:r>
+        <w:t xml:space="preserve"> </w:t>
+      </w:r>
+      <w:r>
+        <w:t xml:space="preserve">representations</w:t>
+      </w:r>
+      <w:r>
+        <w:t xml:space="preserve"> </w:t>
+      </w:r>
+      <w:r>
+        <w:t xml:space="preserve">contain</w:t>
+      </w:r>
+      <w:r>
+        <w:t xml:space="preserve"> </w:t>
+      </w:r>
+      <w:r>
+        <w:t xml:space="preserve">biologically</w:t>
+      </w:r>
+      <w:r>
+        <w:t xml:space="preserve"> </w:t>
+      </w:r>
+      <w:r>
+        <w:t xml:space="preserve">coherent</w:t>
+      </w:r>
+      <w:r>
+        <w:t xml:space="preserve"> </w:t>
+      </w:r>
+      <w:r>
+        <w:t xml:space="preserve">aging</w:t>
+      </w:r>
+      <w:r>
+        <w:t xml:space="preserve"> </w:t>
+      </w:r>
+      <w:r>
         <w:t xml:space="preserve">signals</w:t>
       </w:r>
       <w:r>
         <w:t xml:space="preserve"> </w:t>
       </w:r>
       <w:r>
-        <w:t xml:space="preserve">can</w:t>
-      </w:r>
-      <w:r>
-        <w:t xml:space="preserve"> </w:t>
-      </w:r>
-      <w:r>
-        <w:t xml:space="preserve">easily</w:t>
-      </w:r>
-      <w:r>
-        <w:t xml:space="preserve"> </w:t>
-      </w:r>
-      <w:r>
-        <w:t xml:space="preserve">be</w:t>
-      </w:r>
-      <w:r>
-        <w:t xml:space="preserve"> </w:t>
-      </w:r>
-      <w:r>
-        <w:t xml:space="preserve">distorted</w:t>
-      </w:r>
-      <w:r>
-        <w:t xml:space="preserve"> </w:t>
-      </w:r>
-      <w:r>
-        <w:t xml:space="preserve">by</w:t>
-      </w:r>
-      <w:r>
-        <w:t xml:space="preserve"> </w:t>
-      </w:r>
-      <w:r>
-        <w:t xml:space="preserve">donor</w:t>
-      </w:r>
-      <w:r>
-        <w:t xml:space="preserve"> </w:t>
-      </w:r>
-      <w:r>
-        <w:t xml:space="preserve">identity</w:t>
+        <w:t xml:space="preserve">in</w:t>
+      </w:r>
+      <w:r>
+        <w:t xml:space="preserve"> </w:t>
+      </w:r>
+      <w:r>
+        <w:t xml:space="preserve">age-labeled</w:t>
+      </w:r>
+      <w:r>
+        <w:t xml:space="preserve"> </w:t>
+      </w:r>
+      <w:r>
+        <w:t xml:space="preserve">human</w:t>
+      </w:r>
+      <w:r>
+        <w:t xml:space="preserve"> </w:t>
+      </w:r>
+      <w:r>
+        <w:t xml:space="preserve">single-cell</w:t>
+      </w:r>
+      <w:r>
+        <w:t xml:space="preserve"> </w:t>
+      </w:r>
+      <w:r>
+        <w:t xml:space="preserve">datasets.</w:t>
+      </w:r>
+      <w:r>
+        <w:t xml:space="preserve"> </w:t>
+      </w:r>
+      <w:r>
+        <w:t xml:space="preserve">The</w:t>
+      </w:r>
+      <w:r>
+        <w:t xml:space="preserve"> </w:t>
+      </w:r>
+      <w:r>
+        <w:t xml:space="preserve">workflow</w:t>
+      </w:r>
+      <w:r>
+        <w:t xml:space="preserve"> </w:t>
+      </w:r>
+      <w:r>
+        <w:t xml:space="preserve">combined</w:t>
+      </w:r>
+      <w:r>
+        <w:t xml:space="preserve"> </w:t>
+      </w:r>
+      <w:r>
+        <w:t xml:space="preserve">donor-held-out</w:t>
+      </w:r>
+      <w:r>
+        <w:t xml:space="preserve"> </w:t>
+      </w:r>
+      <w:r>
+        <w:t xml:space="preserve">age</w:t>
+      </w:r>
+      <w:r>
+        <w:t xml:space="preserve"> </w:t>
+      </w:r>
+      <w:r>
+        <w:t xml:space="preserve">decoding,</w:t>
+      </w:r>
+      <w:r>
+        <w:t xml:space="preserve"> </w:t>
+      </w:r>
+      <w:r>
+        <w:t xml:space="preserve">sparse</w:t>
+      </w:r>
+      <w:r>
+        <w:t xml:space="preserve"> </w:t>
+      </w:r>
+      <w:r>
+        <w:t xml:space="preserve">autoencoder</w:t>
+      </w:r>
+      <w:r>
+        <w:t xml:space="preserve"> </w:t>
+      </w:r>
+      <w:r>
+        <w:t xml:space="preserve">feature</w:t>
+      </w:r>
+      <w:r>
+        <w:t xml:space="preserve"> </w:t>
+      </w:r>
+      <w:r>
+        <w:t xml:space="preserve">discovery,</w:t>
+      </w:r>
+      <w:r>
+        <w:t xml:space="preserve"> </w:t>
+      </w:r>
+      <w:r>
+        <w:t xml:space="preserve">cross-model</w:t>
+      </w:r>
+      <w:r>
+        <w:t xml:space="preserve"> </w:t>
+      </w:r>
+      <w:r>
+        <w:t xml:space="preserve">pathway</w:t>
+      </w:r>
+      <w:r>
+        <w:t xml:space="preserve"> </w:t>
+      </w:r>
+      <w:r>
+        <w:t xml:space="preserve">matching,</w:t>
+      </w:r>
+      <w:r>
+        <w:t xml:space="preserve"> </w:t>
+      </w:r>
+      <w:r>
+        <w:t xml:space="preserve">targeted</w:t>
+      </w:r>
+      <w:r>
+        <w:t xml:space="preserve"> </w:t>
+      </w:r>
+      <w:r>
+        <w:t xml:space="preserve">latent-space</w:t>
+      </w:r>
+      <w:r>
+        <w:t xml:space="preserve"> </w:t>
+      </w:r>
+      <w:r>
+        <w:t xml:space="preserve">interventions,</w:t>
+      </w:r>
+      <w:r>
+        <w:t xml:space="preserve"> </w:t>
+      </w:r>
+      <w:r>
+        <w:t xml:space="preserve">donor-bootstrap</w:t>
+      </w:r>
+      <w:r>
+        <w:t xml:space="preserve"> </w:t>
+      </w:r>
+      <w:r>
+        <w:t xml:space="preserve">confidence</w:t>
+      </w:r>
+      <w:r>
+        <w:t xml:space="preserve"> </w:t>
+      </w:r>
+      <w:r>
+        <w:t xml:space="preserve">intervals,</w:t>
       </w:r>
       <w:r>
         <w:t xml:space="preserve"> </w:t>
@@ -328,25 +626,309 @@
         <w:t xml:space="preserve"> </w:t>
       </w:r>
       <w:r>
-        <w:t xml:space="preserve">cell-composition</w:t>
-      </w:r>
-      <w:r>
-        <w:t xml:space="preserve"> </w:t>
-      </w:r>
-      <w:r>
-        <w:t xml:space="preserve">differences.</w:t>
-      </w:r>
-      <w:r>
-        <w:t xml:space="preserve"> </w:t>
-      </w:r>
-      <w:r>
-        <w:t xml:space="preserve">We</w:t>
-      </w:r>
-      <w:r>
-        <w:t xml:space="preserve"> </w:t>
-      </w:r>
-      <w:r>
-        <w:t xml:space="preserve">built</w:t>
+        <w:t xml:space="preserve">progressively</w:t>
+      </w:r>
+      <w:r>
+        <w:t xml:space="preserve"> </w:t>
+      </w:r>
+      <w:r>
+        <w:t xml:space="preserve">stricter</w:t>
+      </w:r>
+      <w:r>
+        <w:t xml:space="preserve"> </w:t>
+      </w:r>
+      <w:r>
+        <w:t xml:space="preserve">confound</w:t>
+      </w:r>
+      <w:r>
+        <w:t xml:space="preserve"> </w:t>
+      </w:r>
+      <w:r>
+        <w:t xml:space="preserve">controls.</w:t>
+      </w:r>
+    </w:p>
+    <w:p>
+      <w:pPr>
+        <w:pStyle w:val="Abstract"/>
+      </w:pPr>
+      <w:r>
+        <w:t xml:space="preserve">Across</w:t>
+      </w:r>
+      <w:r>
+        <w:t xml:space="preserve"> </w:t>
+      </w:r>
+      <w:r>
+        <w:t xml:space="preserve">five</w:t>
+      </w:r>
+      <w:r>
+        <w:t xml:space="preserve"> </w:t>
+      </w:r>
+      <w:r>
+        <w:t xml:space="preserve">datasets,</w:t>
+      </w:r>
+      <w:r>
+        <w:t xml:space="preserve"> </w:t>
+      </w:r>
+      <w:r>
+        <w:t xml:space="preserve">frozen</w:t>
+      </w:r>
+      <w:r>
+        <w:t xml:space="preserve"> </w:t>
+      </w:r>
+      <w:r>
+        <w:t xml:space="preserve">representations</w:t>
+      </w:r>
+      <w:r>
+        <w:t xml:space="preserve"> </w:t>
+      </w:r>
+      <w:r>
+        <w:t xml:space="preserve">contained</w:t>
+      </w:r>
+      <w:r>
+        <w:t xml:space="preserve"> </w:t>
+      </w:r>
+      <w:r>
+        <w:t xml:space="preserve">detectable</w:t>
+      </w:r>
+      <w:r>
+        <w:t xml:space="preserve"> </w:t>
+      </w:r>
+      <w:r>
+        <w:t xml:space="preserve">age</w:t>
+      </w:r>
+      <w:r>
+        <w:t xml:space="preserve"> </w:t>
+      </w:r>
+      <w:r>
+        <w:t xml:space="preserve">information,</w:t>
+      </w:r>
+      <w:r>
+        <w:t xml:space="preserve"> </w:t>
+      </w:r>
+      <w:r>
+        <w:t xml:space="preserve">with</w:t>
+      </w:r>
+      <w:r>
+        <w:t xml:space="preserve"> </w:t>
+      </w:r>
+      <w:r>
+        <w:t xml:space="preserve">best</w:t>
+      </w:r>
+      <w:r>
+        <w:t xml:space="preserve"> </w:t>
+      </w:r>
+      <w:r>
+        <w:t xml:space="preserve">donor-aware</w:t>
+      </w:r>
+      <w:r>
+        <w:t xml:space="preserve"> </w:t>
+      </w:r>
+      <w:r>
+        <w:t xml:space="preserve">balanced</w:t>
+      </w:r>
+      <w:r>
+        <w:t xml:space="preserve"> </w:t>
+      </w:r>
+      <w:r>
+        <w:t xml:space="preserve">accuracy</w:t>
+      </w:r>
+      <w:r>
+        <w:t xml:space="preserve"> </w:t>
+      </w:r>
+      <w:r>
+        <w:t xml:space="preserve">of</w:t>
+      </w:r>
+      <w:r>
+        <w:t xml:space="preserve"> </w:t>
+      </w:r>
+      <w:r>
+        <w:t xml:space="preserve">0.384.</w:t>
+      </w:r>
+      <w:r>
+        <w:t xml:space="preserve"> </w:t>
+      </w:r>
+      <w:r>
+        <w:t xml:space="preserve">Sparse</w:t>
+      </w:r>
+      <w:r>
+        <w:t xml:space="preserve"> </w:t>
+      </w:r>
+      <w:r>
+        <w:t xml:space="preserve">autoencoders</w:t>
+      </w:r>
+      <w:r>
+        <w:t xml:space="preserve"> </w:t>
+      </w:r>
+      <w:r>
+        <w:t xml:space="preserve">identified</w:t>
+      </w:r>
+      <w:r>
+        <w:t xml:space="preserve"> </w:t>
+      </w:r>
+      <w:r>
+        <w:t xml:space="preserve">132</w:t>
+      </w:r>
+      <w:r>
+        <w:t xml:space="preserve"> </w:t>
+      </w:r>
+      <w:r>
+        <w:t xml:space="preserve">donor-aware</w:t>
+      </w:r>
+      <w:r>
+        <w:t xml:space="preserve"> </w:t>
+      </w:r>
+      <w:r>
+        <w:t xml:space="preserve">robust</w:t>
+      </w:r>
+      <w:r>
+        <w:t xml:space="preserve"> </w:t>
+      </w:r>
+      <w:r>
+        <w:t xml:space="preserve">features,</w:t>
+      </w:r>
+      <w:r>
+        <w:t xml:space="preserve"> </w:t>
+      </w:r>
+      <w:r>
+        <w:t xml:space="preserve">and</w:t>
+      </w:r>
+      <w:r>
+        <w:t xml:space="preserve"> </w:t>
+      </w:r>
+      <w:r>
+        <w:t xml:space="preserve">cross-model</w:t>
+      </w:r>
+      <w:r>
+        <w:t xml:space="preserve"> </w:t>
+      </w:r>
+      <w:r>
+        <w:t xml:space="preserve">pathway</w:t>
+      </w:r>
+      <w:r>
+        <w:t xml:space="preserve"> </w:t>
+      </w:r>
+      <w:r>
+        <w:t xml:space="preserve">matching</w:t>
+      </w:r>
+      <w:r>
+        <w:t xml:space="preserve"> </w:t>
+      </w:r>
+      <w:r>
+        <w:t xml:space="preserve">produced</w:t>
+      </w:r>
+      <w:r>
+        <w:t xml:space="preserve"> </w:t>
+      </w:r>
+      <w:r>
+        <w:t xml:space="preserve">193</w:t>
+      </w:r>
+      <w:r>
+        <w:t xml:space="preserve"> </w:t>
+      </w:r>
+      <w:r>
+        <w:t xml:space="preserve">paired</w:t>
+      </w:r>
+      <w:r>
+        <w:t xml:space="preserve"> </w:t>
+      </w:r>
+      <w:r>
+        <w:t xml:space="preserve">features,</w:t>
+      </w:r>
+      <w:r>
+        <w:t xml:space="preserve"> </w:t>
+      </w:r>
+      <w:r>
+        <w:t xml:space="preserve">with</w:t>
+      </w:r>
+      <w:r>
+        <w:t xml:space="preserve"> </w:t>
+      </w:r>
+      <w:r>
+        <w:t xml:space="preserve">the</w:t>
+      </w:r>
+      <w:r>
+        <w:t xml:space="preserve"> </w:t>
+      </w:r>
+      <w:r>
+        <w:t xml:space="preserve">strongest</w:t>
+      </w:r>
+      <w:r>
+        <w:t xml:space="preserve"> </w:t>
+      </w:r>
+      <w:r>
+        <w:t xml:space="preserve">convergence</w:t>
+      </w:r>
+      <w:r>
+        <w:t xml:space="preserve"> </w:t>
+      </w:r>
+      <w:r>
+        <w:t xml:space="preserve">in</w:t>
+      </w:r>
+      <w:r>
+        <w:t xml:space="preserve"> </w:t>
+      </w:r>
+      <w:r>
+        <w:t xml:space="preserve">inflammation</w:t>
+      </w:r>
+      <w:r>
+        <w:t xml:space="preserve"> </w:t>
+      </w:r>
+      <w:r>
+        <w:t xml:space="preserve">and</w:t>
+      </w:r>
+      <w:r>
+        <w:t xml:space="preserve"> </w:t>
+      </w:r>
+      <w:r>
+        <w:t xml:space="preserve">NF-kappaB-related</w:t>
+      </w:r>
+      <w:r>
+        <w:t xml:space="preserve"> </w:t>
+      </w:r>
+      <w:r>
+        <w:t xml:space="preserve">programs.</w:t>
+      </w:r>
+      <w:r>
+        <w:t xml:space="preserve"> </w:t>
+      </w:r>
+      <w:r>
+        <w:t xml:space="preserve">The</w:t>
+      </w:r>
+      <w:r>
+        <w:t xml:space="preserve"> </w:t>
+      </w:r>
+      <w:r>
+        <w:t xml:space="preserve">clearest</w:t>
+      </w:r>
+      <w:r>
+        <w:t xml:space="preserve"> </w:t>
+      </w:r>
+      <w:r>
+        <w:t xml:space="preserve">intervention</w:t>
+      </w:r>
+      <w:r>
+        <w:t xml:space="preserve"> </w:t>
+      </w:r>
+      <w:r>
+        <w:t xml:space="preserve">signal</w:t>
+      </w:r>
+      <w:r>
+        <w:t xml:space="preserve"> </w:t>
+      </w:r>
+      <w:r>
+        <w:t xml:space="preserve">was</w:t>
+      </w:r>
+      <w:r>
+        <w:t xml:space="preserve"> </w:t>
+      </w:r>
+      <w:r>
+        <w:t xml:space="preserve">observed</w:t>
+      </w:r>
+      <w:r>
+        <w:t xml:space="preserve"> </w:t>
+      </w:r>
+      <w:r>
+        <w:t xml:space="preserve">in</w:t>
       </w:r>
       <w:r>
         <w:t xml:space="preserve"> </w:t>
@@ -358,1186 +940,482 @@
         <w:t xml:space="preserve"> </w:t>
       </w:r>
       <w:r>
+        <w:t xml:space="preserve">global</w:t>
+      </w:r>
+      <w:r>
+        <w:t xml:space="preserve"> </w:t>
+      </w:r>
+      <w:r>
+        <w:t xml:space="preserve">Geneformer</w:t>
+      </w:r>
+      <w:r>
+        <w:t xml:space="preserve"> </w:t>
+      </w:r>
+      <w:r>
+        <w:t xml:space="preserve">inflammatory</w:t>
+      </w:r>
+      <w:r>
+        <w:t xml:space="preserve"> </w:t>
+      </w:r>
+      <w:r>
+        <w:t xml:space="preserve">branch,</w:t>
+      </w:r>
+      <w:r>
+        <w:t xml:space="preserve"> </w:t>
+      </w:r>
+      <w:r>
+        <w:t xml:space="preserve">where</w:t>
+      </w:r>
+      <w:r>
+        <w:t xml:space="preserve"> </w:t>
+      </w:r>
+      <w:r>
+        <w:t xml:space="preserve">old-versus-random</w:t>
+      </w:r>
+      <w:r>
+        <w:t xml:space="preserve"> </w:t>
+      </w:r>
+      <w:r>
+        <w:t xml:space="preserve">and</w:t>
+      </w:r>
+      <w:r>
+        <w:t xml:space="preserve"> </w:t>
+      </w:r>
+      <w:r>
+        <w:t xml:space="preserve">old-versus-young</w:t>
+      </w:r>
+      <w:r>
+        <w:t xml:space="preserve"> </w:t>
+      </w:r>
+      <w:r>
+        <w:t xml:space="preserve">contrasts</w:t>
+      </w:r>
+      <w:r>
+        <w:t xml:space="preserve"> </w:t>
+      </w:r>
+      <w:r>
+        <w:t xml:space="preserve">remained</w:t>
+      </w:r>
+      <w:r>
+        <w:t xml:space="preserve"> </w:t>
+      </w:r>
+      <w:r>
+        <w:t xml:space="preserve">positive</w:t>
+      </w:r>
+      <w:r>
+        <w:t xml:space="preserve"> </w:t>
+      </w:r>
+      <w:r>
+        <w:t xml:space="preserve">after</w:t>
+      </w:r>
+      <w:r>
+        <w:t xml:space="preserve"> </w:t>
+      </w:r>
+      <w:r>
+        <w:t xml:space="preserve">split</w:t>
+      </w:r>
+      <w:r>
+        <w:t xml:space="preserve"> </w:t>
+      </w:r>
+      <w:r>
+        <w:t xml:space="preserve">expansion</w:t>
+      </w:r>
+      <w:r>
+        <w:t xml:space="preserve"> </w:t>
+      </w:r>
+      <w:r>
+        <w:t xml:space="preserve">and</w:t>
+      </w:r>
+      <w:r>
+        <w:t xml:space="preserve"> </w:t>
+      </w:r>
+      <w:r>
+        <w:t xml:space="preserve">donor-threshold</w:t>
+      </w:r>
+      <w:r>
+        <w:t xml:space="preserve"> </w:t>
+      </w:r>
+      <w:r>
+        <w:t xml:space="preserve">tightening</w:t>
+      </w:r>
+      <w:r>
+        <w:t xml:space="preserve"> </w:t>
+      </w:r>
+      <w:r>
+        <w:t xml:space="preserve">up</w:t>
+      </w:r>
+      <w:r>
+        <w:t xml:space="preserve"> </w:t>
+      </w:r>
+      <w:r>
+        <w:t xml:space="preserve">to</w:t>
+      </w:r>
+      <w:r>
+        <w:t xml:space="preserve"> </w:t>
+      </w:r>
+      <w:r>
+        <w:t xml:space="preserve">400</w:t>
+      </w:r>
+      <w:r>
+        <w:t xml:space="preserve"> </w:t>
+      </w:r>
+      <w:r>
+        <w:t xml:space="preserve">donors.</w:t>
+      </w:r>
+      <w:r>
+        <w:t xml:space="preserve"> </w:t>
+      </w:r>
+      <w:r>
+        <w:t xml:space="preserve">In</w:t>
+      </w:r>
+      <w:r>
+        <w:t xml:space="preserve"> </w:t>
+      </w:r>
+      <w:r>
+        <w:t xml:space="preserve">a</w:t>
+      </w:r>
+      <w:r>
+        <w:t xml:space="preserve"> </w:t>
+      </w:r>
+      <w:r>
+        <w:t xml:space="preserve">monocyte-restricted</w:t>
+      </w:r>
+      <w:r>
+        <w:t xml:space="preserve"> </w:t>
+      </w:r>
+      <w:r>
+        <w:t xml:space="preserve">analysis,</w:t>
+      </w:r>
+      <w:r>
+        <w:t xml:space="preserve"> </w:t>
+      </w:r>
+      <w:r>
+        <w:t xml:space="preserve">both</w:t>
+      </w:r>
+      <w:r>
+        <w:t xml:space="preserve"> </w:t>
+      </w:r>
+      <w:r>
+        <w:t xml:space="preserve">scGPT</w:t>
+      </w:r>
+      <w:r>
+        <w:t xml:space="preserve"> </w:t>
+      </w:r>
+      <w:r>
+        <w:t xml:space="preserve">and</w:t>
+      </w:r>
+      <w:r>
+        <w:t xml:space="preserve"> </w:t>
+      </w:r>
+      <w:r>
+        <w:t xml:space="preserve">Geneformer</w:t>
+      </w:r>
+      <w:r>
+        <w:t xml:space="preserve"> </w:t>
+      </w:r>
+      <w:r>
+        <w:t xml:space="preserve">also</w:t>
+      </w:r>
+      <w:r>
+        <w:t xml:space="preserve"> </w:t>
+      </w:r>
+      <w:r>
+        <w:t xml:space="preserve">showed</w:t>
+      </w:r>
+      <w:r>
+        <w:t xml:space="preserve"> </w:t>
+      </w:r>
+      <w:r>
+        <w:t xml:space="preserve">positive</w:t>
+      </w:r>
+      <w:r>
+        <w:t xml:space="preserve"> </w:t>
+      </w:r>
+      <w:r>
+        <w:t xml:space="preserve">old-versus-random</w:t>
+      </w:r>
+      <w:r>
+        <w:t xml:space="preserve"> </w:t>
+      </w:r>
+      <w:r>
+        <w:t xml:space="preserve">responses</w:t>
+      </w:r>
+      <w:r>
+        <w:t xml:space="preserve"> </w:t>
+      </w:r>
+      <w:r>
+        <w:t xml:space="preserve">in</w:t>
+      </w:r>
+      <w:r>
+        <w:t xml:space="preserve"> </w:t>
+      </w:r>
+      <w:r>
+        <w:t xml:space="preserve">one</w:t>
+      </w:r>
+      <w:r>
+        <w:t xml:space="preserve"> </w:t>
+      </w:r>
+      <w:r>
+        <w:t xml:space="preserve">cohort.</w:t>
+      </w:r>
+    </w:p>
+    <w:p>
+      <w:pPr>
+        <w:pStyle w:val="Abstract"/>
+      </w:pPr>
+      <w:r>
+        <w:t xml:space="preserve">The</w:t>
+      </w:r>
+      <w:r>
+        <w:t xml:space="preserve"> </w:t>
+      </w:r>
+      <w:r>
+        <w:t xml:space="preserve">strongest</w:t>
+      </w:r>
+      <w:r>
+        <w:t xml:space="preserve"> </w:t>
+      </w:r>
+      <w:r>
+        <w:t xml:space="preserve">global</w:t>
+      </w:r>
+      <w:r>
+        <w:t xml:space="preserve"> </w:t>
+      </w:r>
+      <w:r>
+        <w:t xml:space="preserve">signal</w:t>
+      </w:r>
+      <w:r>
+        <w:t xml:space="preserve"> </w:t>
+      </w:r>
+      <w:r>
+        <w:t xml:space="preserve">weakened</w:t>
+      </w:r>
+      <w:r>
+        <w:t xml:space="preserve"> </w:t>
+      </w:r>
+      <w:r>
+        <w:t xml:space="preserve">under</w:t>
+      </w:r>
+      <w:r>
+        <w:t xml:space="preserve"> </w:t>
+      </w:r>
+      <w:r>
+        <w:t xml:space="preserve">stricter</w:t>
+      </w:r>
+      <w:r>
+        <w:t xml:space="preserve"> </w:t>
+      </w:r>
+      <w:r>
+        <w:t xml:space="preserve">controls.</w:t>
+      </w:r>
+      <w:r>
+        <w:t xml:space="preserve"> </w:t>
+      </w:r>
+      <w:r>
+        <w:t xml:space="preserve">Fully</w:t>
+      </w:r>
+      <w:r>
+        <w:t xml:space="preserve"> </w:t>
+      </w:r>
+      <w:r>
+        <w:t xml:space="preserve">composition-matched</w:t>
+      </w:r>
+      <w:r>
+        <w:t xml:space="preserve"> </w:t>
+      </w:r>
+      <w:r>
+        <w:t xml:space="preserve">forward-pass</w:t>
+      </w:r>
+      <w:r>
+        <w:t xml:space="preserve"> </w:t>
+      </w:r>
+      <w:r>
+        <w:t xml:space="preserve">reruns</w:t>
+      </w:r>
+      <w:r>
+        <w:t xml:space="preserve"> </w:t>
+      </w:r>
+      <w:r>
+        <w:t xml:space="preserve">yielded</w:t>
+      </w:r>
+      <w:r>
+        <w:t xml:space="preserve"> </w:t>
+      </w:r>
+      <w:r>
+        <w:t xml:space="preserve">0</w:t>
+      </w:r>
+      <w:r>
+        <w:t xml:space="preserve"> </w:t>
+      </w:r>
+      <w:r>
+        <w:t xml:space="preserve">of</w:t>
+      </w:r>
+      <w:r>
+        <w:t xml:space="preserve"> </w:t>
+      </w:r>
+      <w:r>
+        <w:t xml:space="preserve">4</w:t>
+      </w:r>
+      <w:r>
+        <w:t xml:space="preserve"> </w:t>
+      </w:r>
+      <w:r>
+        <w:t xml:space="preserve">full</w:t>
+      </w:r>
+      <w:r>
+        <w:t xml:space="preserve"> </w:t>
+      </w:r>
+      <w:r>
+        <w:t xml:space="preserve">strict</w:t>
+      </w:r>
+      <w:r>
+        <w:t xml:space="preserve"> </w:t>
+      </w:r>
+      <w:r>
+        <w:t xml:space="preserve">replications.</w:t>
+      </w:r>
+      <w:r>
+        <w:t xml:space="preserve"> </w:t>
+      </w:r>
+      <w:r>
+        <w:t xml:space="preserve">These</w:t>
+      </w:r>
+      <w:r>
+        <w:t xml:space="preserve"> </w:t>
+      </w:r>
+      <w:r>
+        <w:t xml:space="preserve">results</w:t>
+      </w:r>
+      <w:r>
+        <w:t xml:space="preserve"> </w:t>
+      </w:r>
+      <w:r>
+        <w:t xml:space="preserve">indicate</w:t>
+      </w:r>
+      <w:r>
+        <w:t xml:space="preserve"> </w:t>
+      </w:r>
+      <w:r>
+        <w:t xml:space="preserve">that</w:t>
+      </w:r>
+      <w:r>
+        <w:t xml:space="preserve"> </w:t>
+      </w:r>
+      <w:r>
+        <w:t xml:space="preserve">frozen</w:t>
+      </w:r>
+      <w:r>
+        <w:t xml:space="preserve"> </w:t>
+      </w:r>
+      <w:r>
+        <w:t xml:space="preserve">single-cell</w:t>
+      </w:r>
+      <w:r>
+        <w:t xml:space="preserve"> </w:t>
+      </w:r>
+      <w:r>
+        <w:t xml:space="preserve">foundation</w:t>
+      </w:r>
+      <w:r>
+        <w:t xml:space="preserve"> </w:t>
+      </w:r>
+      <w:r>
+        <w:t xml:space="preserve">models</w:t>
+      </w:r>
+      <w:r>
+        <w:t xml:space="preserve"> </w:t>
+      </w:r>
+      <w:r>
+        <w:t xml:space="preserve">do</w:t>
+      </w:r>
+      <w:r>
+        <w:t xml:space="preserve"> </w:t>
+      </w:r>
+      <w:r>
+        <w:t xml:space="preserve">capture</w:t>
+      </w:r>
+      <w:r>
+        <w:t xml:space="preserve"> </w:t>
+      </w:r>
+      <w:r>
+        <w:t xml:space="preserve">biologically</w:t>
+      </w:r>
+      <w:r>
+        <w:t xml:space="preserve"> </w:t>
+      </w:r>
+      <w:r>
+        <w:t xml:space="preserve">plausible</w:t>
+      </w:r>
+      <w:r>
+        <w:t xml:space="preserve"> </w:t>
+      </w:r>
+      <w:r>
+        <w:t xml:space="preserve">aging-related</w:t>
+      </w:r>
+      <w:r>
+        <w:t xml:space="preserve"> </w:t>
+      </w:r>
+      <w:r>
+        <w:t xml:space="preserve">structure,</w:t>
+      </w:r>
+      <w:r>
+        <w:t xml:space="preserve"> </w:t>
+      </w:r>
+      <w:r>
+        <w:t xml:space="preserve">especially</w:t>
+      </w:r>
+      <w:r>
+        <w:t xml:space="preserve"> </w:t>
+      </w:r>
+      <w:r>
+        <w:t xml:space="preserve">around</w:t>
+      </w:r>
+      <w:r>
+        <w:t xml:space="preserve"> </w:t>
+      </w:r>
+      <w:r>
+        <w:t xml:space="preserve">inflammatory</w:t>
+      </w:r>
+      <w:r>
+        <w:t xml:space="preserve"> </w:t>
+      </w:r>
+      <w:r>
+        <w:t xml:space="preserve">programs,</w:t>
+      </w:r>
+      <w:r>
+        <w:t xml:space="preserve"> </w:t>
+      </w:r>
+      <w:r>
+        <w:t xml:space="preserve">but</w:t>
+      </w:r>
+      <w:r>
+        <w:t xml:space="preserve"> </w:t>
+      </w:r>
+      <w:r>
+        <w:t xml:space="preserve">also</w:t>
+      </w:r>
+      <w:r>
+        <w:t xml:space="preserve"> </w:t>
+      </w:r>
+      <w:r>
+        <w:t xml:space="preserve">that</w:t>
+      </w:r>
+      <w:r>
+        <w:t xml:space="preserve"> </w:t>
+      </w:r>
+      <w:r>
         <w:t xml:space="preserve">donor-aware</w:t>
       </w:r>
       <w:r>
         <w:t xml:space="preserve"> </w:t>
       </w:r>
       <w:r>
-        <w:t xml:space="preserve">interpretability</w:t>
-      </w:r>
-      <w:r>
-        <w:t xml:space="preserve"> </w:t>
-      </w:r>
-      <w:r>
-        <w:t xml:space="preserve">framework</w:t>
-      </w:r>
-      <w:r>
-        <w:t xml:space="preserve"> </w:t>
-      </w:r>
-      <w:r>
-        <w:t xml:space="preserve">to</w:t>
-      </w:r>
-      <w:r>
-        <w:t xml:space="preserve"> </w:t>
-      </w:r>
-      <w:r>
-        <w:t xml:space="preserve">test</w:t>
-      </w:r>
-      <w:r>
-        <w:t xml:space="preserve"> </w:t>
-      </w:r>
-      <w:r>
-        <w:t xml:space="preserve">aging-related</w:t>
-      </w:r>
-      <w:r>
-        <w:t xml:space="preserve"> </w:t>
-      </w:r>
-      <w:r>
-        <w:t xml:space="preserve">structure</w:t>
-      </w:r>
-      <w:r>
-        <w:t xml:space="preserve"> </w:t>
-      </w:r>
-      <w:r>
-        <w:t xml:space="preserve">in</w:t>
-      </w:r>
-      <w:r>
-        <w:t xml:space="preserve"> </w:t>
-      </w:r>
-      <w:r>
-        <w:t xml:space="preserve">frozen</w:t>
-      </w:r>
-      <w:r>
-        <w:t xml:space="preserve"> </w:t>
-      </w:r>
-      <w:r>
-        <w:t xml:space="preserve">scGPT</w:t>
-      </w:r>
-      <w:r>
-        <w:t xml:space="preserve"> </w:t>
-      </w:r>
-      <w:r>
         <w:t xml:space="preserve">and</w:t>
       </w:r>
       <w:r>
         <w:t xml:space="preserve"> </w:t>
       </w:r>
       <w:r>
-        <w:t xml:space="preserve">Geneformer</w:t>
-      </w:r>
-      <w:r>
-        <w:t xml:space="preserve"> </w:t>
-      </w:r>
-      <w:r>
-        <w:t xml:space="preserve">embeddings</w:t>
-      </w:r>
-      <w:r>
-        <w:t xml:space="preserve"> </w:t>
-      </w:r>
-      <w:r>
-        <w:t xml:space="preserve">from</w:t>
-      </w:r>
-      <w:r>
-        <w:t xml:space="preserve"> </w:t>
-      </w:r>
-      <w:r>
-        <w:t xml:space="preserve">age-labeled</w:t>
-      </w:r>
-      <w:r>
-        <w:t xml:space="preserve"> </w:t>
-      </w:r>
-      <w:r>
-        <w:t xml:space="preserve">human</w:t>
-      </w:r>
-      <w:r>
-        <w:t xml:space="preserve"> </w:t>
-      </w:r>
-      <w:r>
-        <w:t xml:space="preserve">single-cell</w:t>
-      </w:r>
-      <w:r>
-        <w:t xml:space="preserve"> </w:t>
-      </w:r>
-      <w:r>
-        <w:t xml:space="preserve">datasets.</w:t>
-      </w:r>
-      <w:r>
-        <w:t xml:space="preserve"> </w:t>
-      </w:r>
-      <w:r>
-        <w:t xml:space="preserve">The</w:t>
-      </w:r>
-      <w:r>
-        <w:t xml:space="preserve"> </w:t>
-      </w:r>
-      <w:r>
-        <w:t xml:space="preserve">workflow</w:t>
-      </w:r>
-      <w:r>
-        <w:t xml:space="preserve"> </w:t>
-      </w:r>
-      <w:r>
-        <w:t xml:space="preserve">combines</w:t>
-      </w:r>
-      <w:r>
-        <w:t xml:space="preserve"> </w:t>
-      </w:r>
-      <w:r>
-        <w:t xml:space="preserve">donor-held-out</w:t>
-      </w:r>
-      <w:r>
-        <w:t xml:space="preserve"> </w:t>
-      </w:r>
-      <w:r>
-        <w:t xml:space="preserve">age</w:t>
-      </w:r>
-      <w:r>
-        <w:t xml:space="preserve"> </w:t>
-      </w:r>
-      <w:r>
-        <w:t xml:space="preserve">decoding,</w:t>
-      </w:r>
-      <w:r>
-        <w:t xml:space="preserve"> </w:t>
-      </w:r>
-      <w:r>
-        <w:t xml:space="preserve">sparse</w:t>
-      </w:r>
-      <w:r>
-        <w:t xml:space="preserve"> </w:t>
-      </w:r>
-      <w:r>
-        <w:t xml:space="preserve">autoencoder</w:t>
-      </w:r>
-      <w:r>
-        <w:t xml:space="preserve"> </w:t>
-      </w:r>
-      <w:r>
-        <w:t xml:space="preserve">feature</w:t>
-      </w:r>
-      <w:r>
-        <w:t xml:space="preserve"> </w:t>
-      </w:r>
-      <w:r>
-        <w:t xml:space="preserve">discovery,</w:t>
-      </w:r>
-      <w:r>
-        <w:t xml:space="preserve"> </w:t>
-      </w:r>
-      <w:r>
-        <w:t xml:space="preserve">cross-model</w:t>
-      </w:r>
-      <w:r>
-        <w:t xml:space="preserve"> </w:t>
-      </w:r>
-      <w:r>
-        <w:t xml:space="preserve">pathway</w:t>
-      </w:r>
-      <w:r>
-        <w:t xml:space="preserve"> </w:t>
-      </w:r>
-      <w:r>
-        <w:t xml:space="preserve">matching,</w:t>
-      </w:r>
-      <w:r>
-        <w:t xml:space="preserve"> </w:t>
-      </w:r>
-      <w:r>
-        <w:t xml:space="preserve">latent-space</w:t>
-      </w:r>
-      <w:r>
-        <w:t xml:space="preserve"> </w:t>
-      </w:r>
-      <w:r>
-        <w:t xml:space="preserve">intervention</w:t>
-      </w:r>
-      <w:r>
-        <w:t xml:space="preserve"> </w:t>
-      </w:r>
-      <w:r>
-        <w:t xml:space="preserve">tests,</w:t>
-      </w:r>
-      <w:r>
-        <w:t xml:space="preserve"> </w:t>
-      </w:r>
-      <w:r>
-        <w:t xml:space="preserve">donor-bootstrap</w:t>
-      </w:r>
-      <w:r>
-        <w:t xml:space="preserve"> </w:t>
-      </w:r>
-      <w:r>
-        <w:t xml:space="preserve">confidence</w:t>
-      </w:r>
-      <w:r>
-        <w:t xml:space="preserve"> </w:t>
-      </w:r>
-      <w:r>
-        <w:t xml:space="preserve">intervals,</w:t>
-      </w:r>
-      <w:r>
-        <w:t xml:space="preserve"> </w:t>
-      </w:r>
-      <w:r>
-        <w:t xml:space="preserve">and</w:t>
-      </w:r>
-      <w:r>
-        <w:t xml:space="preserve"> </w:t>
-      </w:r>
-      <w:r>
-        <w:t xml:space="preserve">progressively</w:t>
-      </w:r>
-      <w:r>
-        <w:t xml:space="preserve"> </w:t>
-      </w:r>
-      <w:r>
-        <w:t xml:space="preserve">stricter</w:t>
-      </w:r>
-      <w:r>
-        <w:t xml:space="preserve"> </w:t>
-      </w:r>
-      <w:r>
-        <w:t xml:space="preserve">confound</w:t>
-      </w:r>
-      <w:r>
-        <w:t xml:space="preserve"> </w:t>
-      </w:r>
-      <w:r>
-        <w:t xml:space="preserve">controls.</w:t>
-      </w:r>
-    </w:p>
-    <w:p>
-      <w:pPr>
-        <w:pStyle w:val="Abstract"/>
-      </w:pPr>
-      <w:r>
-        <w:t xml:space="preserve">Across</w:t>
-      </w:r>
-      <w:r>
-        <w:t xml:space="preserve"> </w:t>
-      </w:r>
-      <w:r>
-        <w:t xml:space="preserve">five</w:t>
-      </w:r>
-      <w:r>
-        <w:t xml:space="preserve"> </w:t>
-      </w:r>
-      <w:r>
-        <w:t xml:space="preserve">datasets,</w:t>
-      </w:r>
-      <w:r>
-        <w:t xml:space="preserve"> </w:t>
-      </w:r>
-      <w:r>
-        <w:t xml:space="preserve">frozen</w:t>
-      </w:r>
-      <w:r>
-        <w:t xml:space="preserve"> </w:t>
-      </w:r>
-      <w:r>
-        <w:t xml:space="preserve">representations</w:t>
-      </w:r>
-      <w:r>
-        <w:t xml:space="preserve"> </w:t>
-      </w:r>
-      <w:r>
-        <w:t xml:space="preserve">contained</w:t>
-      </w:r>
-      <w:r>
-        <w:t xml:space="preserve"> </w:t>
-      </w:r>
-      <w:r>
-        <w:t xml:space="preserve">detectable</w:t>
-      </w:r>
-      <w:r>
-        <w:t xml:space="preserve"> </w:t>
-      </w:r>
-      <w:r>
-        <w:t xml:space="preserve">age</w:t>
-      </w:r>
-      <w:r>
-        <w:t xml:space="preserve"> </w:t>
-      </w:r>
-      <w:r>
-        <w:t xml:space="preserve">information,</w:t>
-      </w:r>
-      <w:r>
-        <w:t xml:space="preserve"> </w:t>
-      </w:r>
-      <w:r>
-        <w:t xml:space="preserve">with</w:t>
-      </w:r>
-      <w:r>
-        <w:t xml:space="preserve"> </w:t>
-      </w:r>
-      <w:r>
-        <w:t xml:space="preserve">best</w:t>
-      </w:r>
-      <w:r>
-        <w:t xml:space="preserve"> </w:t>
-      </w:r>
-      <w:r>
-        <w:t xml:space="preserve">donor-aware</w:t>
-      </w:r>
-      <w:r>
-        <w:t xml:space="preserve"> </w:t>
-      </w:r>
-      <w:r>
-        <w:t xml:space="preserve">balanced</w:t>
-      </w:r>
-      <w:r>
-        <w:t xml:space="preserve"> </w:t>
-      </w:r>
-      <w:r>
-        <w:t xml:space="preserve">accuracy</w:t>
-      </w:r>
-      <w:r>
-        <w:t xml:space="preserve"> </w:t>
-      </w:r>
-      <w:r>
-        <w:t xml:space="preserve">0.384.</w:t>
-      </w:r>
-      <w:r>
-        <w:t xml:space="preserve"> </w:t>
-      </w:r>
-      <w:r>
-        <w:t xml:space="preserve">Sparse</w:t>
-      </w:r>
-      <w:r>
-        <w:t xml:space="preserve"> </w:t>
-      </w:r>
-      <w:r>
-        <w:t xml:space="preserve">autoencoders</w:t>
-      </w:r>
-      <w:r>
-        <w:t xml:space="preserve"> </w:t>
-      </w:r>
-      <w:r>
-        <w:t xml:space="preserve">recovered</w:t>
-      </w:r>
-      <w:r>
-        <w:t xml:space="preserve"> </w:t>
-      </w:r>
-      <w:r>
-        <w:t xml:space="preserve">132</w:t>
-      </w:r>
-      <w:r>
-        <w:t xml:space="preserve"> </w:t>
-      </w:r>
-      <w:r>
-        <w:t xml:space="preserve">donor-aware</w:t>
-      </w:r>
-      <w:r>
-        <w:t xml:space="preserve"> </w:t>
-      </w:r>
-      <w:r>
-        <w:t xml:space="preserve">robust</w:t>
-      </w:r>
-      <w:r>
-        <w:t xml:space="preserve"> </w:t>
-      </w:r>
-      <w:r>
-        <w:t xml:space="preserve">features</w:t>
-      </w:r>
-      <w:r>
-        <w:t xml:space="preserve"> </w:t>
-      </w:r>
-      <w:r>
-        <w:t xml:space="preserve">across</w:t>
-      </w:r>
-      <w:r>
-        <w:t xml:space="preserve"> </w:t>
-      </w:r>
-      <w:r>
-        <w:t xml:space="preserve">the</w:t>
-      </w:r>
-      <w:r>
-        <w:t xml:space="preserve"> </w:t>
-      </w:r>
-      <w:r>
-        <w:t xml:space="preserve">two</w:t>
-      </w:r>
-      <w:r>
-        <w:t xml:space="preserve"> </w:t>
-      </w:r>
-      <w:r>
-        <w:t xml:space="preserve">core</w:t>
-      </w:r>
-      <w:r>
-        <w:t xml:space="preserve"> </w:t>
-      </w:r>
-      <w:r>
-        <w:t xml:space="preserve">AIDA</w:t>
-      </w:r>
-      <w:r>
-        <w:t xml:space="preserve"> </w:t>
-      </w:r>
-      <w:r>
-        <w:t xml:space="preserve">cohorts,</w:t>
-      </w:r>
-      <w:r>
-        <w:t xml:space="preserve"> </w:t>
-      </w:r>
-      <w:r>
-        <w:t xml:space="preserve">and</w:t>
-      </w:r>
-      <w:r>
-        <w:t xml:space="preserve"> </w:t>
-      </w:r>
-      <w:r>
-        <w:t xml:space="preserve">cross-model</w:t>
-      </w:r>
-      <w:r>
-        <w:t xml:space="preserve"> </w:t>
-      </w:r>
-      <w:r>
-        <w:t xml:space="preserve">pathway</w:t>
-      </w:r>
-      <w:r>
-        <w:t xml:space="preserve"> </w:t>
-      </w:r>
-      <w:r>
-        <w:t xml:space="preserve">matching</w:t>
-      </w:r>
-      <w:r>
-        <w:t xml:space="preserve"> </w:t>
-      </w:r>
-      <w:r>
-        <w:t xml:space="preserve">yielded</w:t>
-      </w:r>
-      <w:r>
-        <w:t xml:space="preserve"> </w:t>
-      </w:r>
-      <w:r>
-        <w:t xml:space="preserve">193</w:t>
-      </w:r>
-      <w:r>
-        <w:t xml:space="preserve"> </w:t>
-      </w:r>
-      <w:r>
-        <w:t xml:space="preserve">paired</w:t>
-      </w:r>
-      <w:r>
-        <w:t xml:space="preserve"> </w:t>
-      </w:r>
-      <w:r>
-        <w:t xml:space="preserve">features,</w:t>
-      </w:r>
-      <w:r>
-        <w:t xml:space="preserve"> </w:t>
-      </w:r>
-      <w:r>
-        <w:t xml:space="preserve">most</w:t>
-      </w:r>
-      <w:r>
-        <w:t xml:space="preserve"> </w:t>
-      </w:r>
-      <w:r>
-        <w:t xml:space="preserve">strongly</w:t>
-      </w:r>
-      <w:r>
-        <w:t xml:space="preserve"> </w:t>
-      </w:r>
-      <w:r>
-        <w:t xml:space="preserve">concentrated</w:t>
-      </w:r>
-      <w:r>
-        <w:t xml:space="preserve"> </w:t>
-      </w:r>
-      <w:r>
-        <w:t xml:space="preserve">in</w:t>
-      </w:r>
-      <w:r>
-        <w:t xml:space="preserve"> </w:t>
-      </w:r>
-      <w:r>
-        <w:t xml:space="preserve">inflammation</w:t>
-      </w:r>
-      <w:r>
-        <w:t xml:space="preserve"> </w:t>
-      </w:r>
-      <w:r>
-        <w:t xml:space="preserve">/</w:t>
-      </w:r>
-      <w:r>
-        <w:t xml:space="preserve"> </w:t>
-      </w:r>
-      <w:r>
-        <w:t xml:space="preserve">NF-kappaB</w:t>
-      </w:r>
-      <w:r>
-        <w:t xml:space="preserve"> </w:t>
-      </w:r>
-      <w:r>
-        <w:t xml:space="preserve">programs</w:t>
-      </w:r>
-      <w:r>
-        <w:t xml:space="preserve"> </w:t>
-      </w:r>
-      <w:r>
-        <w:t xml:space="preserve">in</w:t>
-      </w:r>
-      <w:r>
-        <w:t xml:space="preserve"> </w:t>
-      </w:r>
-      <w:r>
-        <w:t xml:space="preserve">AIDA</w:t>
-      </w:r>
-      <w:r>
-        <w:t xml:space="preserve"> </w:t>
-      </w:r>
-      <w:r>
-        <w:t xml:space="preserve">phase</w:t>
-      </w:r>
-      <w:r>
-        <w:t xml:space="preserve"> </w:t>
-      </w:r>
-      <w:r>
-        <w:t xml:space="preserve">1</w:t>
-      </w:r>
-      <w:r>
-        <w:t xml:space="preserve"> </w:t>
-      </w:r>
-      <w:r>
-        <w:t xml:space="preserve">v2.</w:t>
-      </w:r>
-      <w:r>
-        <w:t xml:space="preserve"> </w:t>
-      </w:r>
-      <w:r>
-        <w:t xml:space="preserve">The</w:t>
-      </w:r>
-      <w:r>
-        <w:t xml:space="preserve"> </w:t>
-      </w:r>
-      <w:r>
-        <w:t xml:space="preserve">clearest</w:t>
-      </w:r>
-      <w:r>
-        <w:t xml:space="preserve"> </w:t>
-      </w:r>
-      <w:r>
-        <w:t xml:space="preserve">positive</w:t>
-      </w:r>
-      <w:r>
-        <w:t xml:space="preserve"> </w:t>
-      </w:r>
-      <w:r>
-        <w:t xml:space="preserve">intervention</w:t>
-      </w:r>
-      <w:r>
-        <w:t xml:space="preserve"> </w:t>
-      </w:r>
-      <w:r>
-        <w:t xml:space="preserve">result</w:t>
-      </w:r>
-      <w:r>
-        <w:t xml:space="preserve"> </w:t>
-      </w:r>
-      <w:r>
-        <w:t xml:space="preserve">appeared</w:t>
-      </w:r>
-      <w:r>
-        <w:t xml:space="preserve"> </w:t>
-      </w:r>
-      <w:r>
-        <w:t xml:space="preserve">in</w:t>
-      </w:r>
-      <w:r>
-        <w:t xml:space="preserve"> </w:t>
-      </w:r>
-      <w:r>
-        <w:t xml:space="preserve">a</w:t>
-      </w:r>
-      <w:r>
-        <w:t xml:space="preserve"> </w:t>
-      </w:r>
-      <w:r>
-        <w:t xml:space="preserve">global</w:t>
-      </w:r>
-      <w:r>
-        <w:t xml:space="preserve"> </w:t>
-      </w:r>
-      <w:r>
-        <w:t xml:space="preserve">Geneformer</w:t>
-      </w:r>
-      <w:r>
-        <w:t xml:space="preserve"> </w:t>
-      </w:r>
-      <w:r>
-        <w:t xml:space="preserve">inflammation</w:t>
-      </w:r>
-      <w:r>
-        <w:t xml:space="preserve"> </w:t>
-      </w:r>
-      <w:r>
-        <w:t xml:space="preserve">branch:</w:t>
-      </w:r>
-      <w:r>
-        <w:t xml:space="preserve"> </w:t>
-      </w:r>
-      <w:r>
-        <w:t xml:space="preserve">old-versus-random</w:t>
-      </w:r>
-      <w:r>
-        <w:t xml:space="preserve"> </w:t>
-      </w:r>
-      <w:r>
-        <w:t xml:space="preserve">and</w:t>
-      </w:r>
-      <w:r>
-        <w:t xml:space="preserve"> </w:t>
-      </w:r>
-      <w:r>
-        <w:t xml:space="preserve">old-versus-young</w:t>
-      </w:r>
-      <w:r>
-        <w:t xml:space="preserve"> </w:t>
-      </w:r>
-      <w:r>
-        <w:t xml:space="preserve">expected-age</w:t>
-      </w:r>
-      <w:r>
-        <w:t xml:space="preserve"> </w:t>
-      </w:r>
-      <w:r>
-        <w:t xml:space="preserve">contrasts</w:t>
-      </w:r>
-      <w:r>
-        <w:t xml:space="preserve"> </w:t>
-      </w:r>
-      <w:r>
-        <w:t xml:space="preserve">remained</w:t>
-      </w:r>
-      <w:r>
-        <w:t xml:space="preserve"> </w:t>
-      </w:r>
-      <w:r>
-        <w:t xml:space="preserve">significant</w:t>
-      </w:r>
-      <w:r>
-        <w:t xml:space="preserve"> </w:t>
-      </w:r>
-      <w:r>
-        <w:t xml:space="preserve">after</w:t>
-      </w:r>
-      <w:r>
-        <w:t xml:space="preserve"> </w:t>
-      </w:r>
-      <w:r>
-        <w:t xml:space="preserve">split</w:t>
-      </w:r>
-      <w:r>
-        <w:t xml:space="preserve"> </w:t>
-      </w:r>
-      <w:r>
-        <w:t xml:space="preserve">expansion</w:t>
-      </w:r>
-      <w:r>
-        <w:t xml:space="preserve"> </w:t>
-      </w:r>
-      <w:r>
-        <w:t xml:space="preserve">and</w:t>
-      </w:r>
-      <w:r>
-        <w:t xml:space="preserve"> </w:t>
-      </w:r>
-      <w:r>
-        <w:t xml:space="preserve">donor-threshold</w:t>
-      </w:r>
-      <w:r>
-        <w:t xml:space="preserve"> </w:t>
-      </w:r>
-      <w:r>
-        <w:t xml:space="preserve">tightening</w:t>
-      </w:r>
-      <w:r>
-        <w:t xml:space="preserve"> </w:t>
-      </w:r>
-      <w:r>
-        <w:t xml:space="preserve">up</w:t>
-      </w:r>
-      <w:r>
-        <w:t xml:space="preserve"> </w:t>
-      </w:r>
-      <w:r>
-        <w:t xml:space="preserve">to</w:t>
-      </w:r>
-      <w:r>
-        <w:t xml:space="preserve"> </w:t>
-      </w:r>
-      <w:r>
-        <w:t xml:space="preserve">400</w:t>
-      </w:r>
-      <w:r>
-        <w:t xml:space="preserve"> </w:t>
-      </w:r>
-      <w:r>
-        <w:t xml:space="preserve">donors.</w:t>
-      </w:r>
-      <w:r>
-        <w:t xml:space="preserve"> </w:t>
-      </w:r>
-      <w:r>
-        <w:t xml:space="preserve">In</w:t>
-      </w:r>
-      <w:r>
-        <w:t xml:space="preserve"> </w:t>
-      </w:r>
-      <w:r>
-        <w:t xml:space="preserve">a</w:t>
-      </w:r>
-      <w:r>
-        <w:t xml:space="preserve"> </w:t>
-      </w:r>
-      <w:r>
-        <w:t xml:space="preserve">monocyte-restricted</w:t>
-      </w:r>
-      <w:r>
-        <w:t xml:space="preserve"> </w:t>
-      </w:r>
-      <w:r>
-        <w:t xml:space="preserve">analysis</w:t>
-      </w:r>
-      <w:r>
-        <w:t xml:space="preserve"> </w:t>
-      </w:r>
-      <w:r>
-        <w:t xml:space="preserve">on</w:t>
-      </w:r>
-      <w:r>
-        <w:t xml:space="preserve"> </w:t>
-      </w:r>
-      <w:r>
-        <w:t xml:space="preserve">AIDA</w:t>
-      </w:r>
-      <w:r>
-        <w:t xml:space="preserve"> </w:t>
-      </w:r>
-      <w:r>
-        <w:t xml:space="preserve">phase</w:t>
-      </w:r>
-      <w:r>
-        <w:t xml:space="preserve"> </w:t>
-      </w:r>
-      <w:r>
-        <w:t xml:space="preserve">1</w:t>
-      </w:r>
-      <w:r>
-        <w:t xml:space="preserve"> </w:t>
-      </w:r>
-      <w:r>
-        <w:t xml:space="preserve">v1,</w:t>
-      </w:r>
-      <w:r>
-        <w:t xml:space="preserve"> </w:t>
-      </w:r>
-      <w:r>
-        <w:t xml:space="preserve">both</w:t>
-      </w:r>
-      <w:r>
-        <w:t xml:space="preserve"> </w:t>
-      </w:r>
-      <w:r>
-        <w:t xml:space="preserve">scGPT</w:t>
-      </w:r>
-      <w:r>
-        <w:t xml:space="preserve"> </w:t>
-      </w:r>
-      <w:r>
-        <w:t xml:space="preserve">and</w:t>
-      </w:r>
-      <w:r>
-        <w:t xml:space="preserve"> </w:t>
-      </w:r>
-      <w:r>
-        <w:t xml:space="preserve">Geneformer</w:t>
-      </w:r>
-      <w:r>
-        <w:t xml:space="preserve"> </w:t>
-      </w:r>
-      <w:r>
-        <w:t xml:space="preserve">also</w:t>
-      </w:r>
-      <w:r>
-        <w:t xml:space="preserve"> </w:t>
-      </w:r>
-      <w:r>
-        <w:t xml:space="preserve">showed</w:t>
-      </w:r>
-      <w:r>
-        <w:t xml:space="preserve"> </w:t>
-      </w:r>
-      <w:r>
-        <w:t xml:space="preserve">positive</w:t>
-      </w:r>
-      <w:r>
-        <w:t xml:space="preserve"> </w:t>
-      </w:r>
-      <w:r>
-        <w:t xml:space="preserve">old-versus-random</w:t>
-      </w:r>
-      <w:r>
-        <w:t xml:space="preserve"> </w:t>
-      </w:r>
-      <w:r>
-        <w:t xml:space="preserve">responses</w:t>
-      </w:r>
-      <w:r>
-        <w:t xml:space="preserve"> </w:t>
-      </w:r>
-      <w:r>
-        <w:t xml:space="preserve">at</w:t>
-      </w:r>
-      <w:r>
-        <w:t xml:space="preserve"> </w:t>
-      </w:r>
-      <w:r>
-        <w:t xml:space="preserve">intervention</w:t>
-      </w:r>
-      <w:r>
-        <w:t xml:space="preserve"> </w:t>
-      </w:r>
-      <w:r>
-        <w:t xml:space="preserve">scale</w:t>
-      </w:r>
-      <w:r>
-        <w:t xml:space="preserve"> </w:t>
-      </w:r>
-      <w:r>
-        <w:t xml:space="preserve">2.0.</w:t>
-      </w:r>
-    </w:p>
-    <w:p>
-      <w:pPr>
-        <w:pStyle w:val="Abstract"/>
-      </w:pPr>
-      <w:r>
-        <w:t xml:space="preserve">Under</w:t>
-      </w:r>
-      <w:r>
-        <w:t xml:space="preserve"> </w:t>
-      </w:r>
-      <w:r>
-        <w:t xml:space="preserve">the</w:t>
-      </w:r>
-      <w:r>
-        <w:t xml:space="preserve"> </w:t>
-      </w:r>
-      <w:r>
-        <w:t xml:space="preserve">strictest</w:t>
-      </w:r>
-      <w:r>
-        <w:t xml:space="preserve"> </w:t>
-      </w:r>
-      <w:r>
-        <w:t xml:space="preserve">control,</w:t>
-      </w:r>
-      <w:r>
-        <w:t xml:space="preserve"> </w:t>
-      </w:r>
-      <w:r>
-        <w:t xml:space="preserve">however,</w:t>
-      </w:r>
-      <w:r>
-        <w:t xml:space="preserve"> </w:t>
-      </w:r>
-      <w:r>
-        <w:t xml:space="preserve">the</w:t>
-      </w:r>
-      <w:r>
-        <w:t xml:space="preserve"> </w:t>
-      </w:r>
-      <w:r>
-        <w:t xml:space="preserve">strongest</w:t>
-      </w:r>
-      <w:r>
-        <w:t xml:space="preserve"> </w:t>
-      </w:r>
-      <w:r>
-        <w:t xml:space="preserve">global</w:t>
-      </w:r>
-      <w:r>
-        <w:t xml:space="preserve"> </w:t>
-      </w:r>
-      <w:r>
-        <w:t xml:space="preserve">branch</w:t>
-      </w:r>
-      <w:r>
-        <w:t xml:space="preserve"> </w:t>
-      </w:r>
-      <w:r>
-        <w:t xml:space="preserve">weakened.</w:t>
-      </w:r>
-      <w:r>
-        <w:t xml:space="preserve"> </w:t>
-      </w:r>
-      <w:r>
-        <w:t xml:space="preserve">Fully</w:t>
-      </w:r>
-      <w:r>
-        <w:t xml:space="preserve"> </w:t>
-      </w:r>
-      <w:r>
-        <w:t xml:space="preserve">composition-matched</w:t>
-      </w:r>
-      <w:r>
-        <w:t xml:space="preserve"> </w:t>
-      </w:r>
-      <w:r>
-        <w:t xml:space="preserve">forward-pass</w:t>
-      </w:r>
-      <w:r>
-        <w:t xml:space="preserve"> </w:t>
-      </w:r>
-      <w:r>
-        <w:t xml:space="preserve">reruns</w:t>
-      </w:r>
-      <w:r>
-        <w:t xml:space="preserve"> </w:t>
-      </w:r>
-      <w:r>
-        <w:t xml:space="preserve">eliminated</w:t>
-      </w:r>
-      <w:r>
-        <w:t xml:space="preserve"> </w:t>
-      </w:r>
-      <w:r>
-        <w:t xml:space="preserve">full</w:t>
-      </w:r>
-      <w:r>
-        <w:t xml:space="preserve"> </w:t>
-      </w:r>
-      <w:r>
-        <w:t xml:space="preserve">strict</w:t>
-      </w:r>
-      <w:r>
-        <w:t xml:space="preserve"> </w:t>
-      </w:r>
-      <w:r>
-        <w:t xml:space="preserve">replication,</w:t>
-      </w:r>
-      <w:r>
-        <w:t xml:space="preserve"> </w:t>
-      </w:r>
-      <w:r>
-        <w:t xml:space="preserve">with</w:t>
-      </w:r>
-      <w:r>
-        <w:t xml:space="preserve"> </w:t>
-      </w:r>
-      <w:r>
-        <w:t xml:space="preserve">0</w:t>
-      </w:r>
-      <w:r>
-        <w:t xml:space="preserve"> </w:t>
-      </w:r>
-      <w:r>
-        <w:t xml:space="preserve">of</w:t>
-      </w:r>
-      <w:r>
-        <w:t xml:space="preserve"> </w:t>
-      </w:r>
-      <w:r>
-        <w:t xml:space="preserve">4</w:t>
-      </w:r>
-      <w:r>
-        <w:t xml:space="preserve"> </w:t>
-      </w:r>
-      <w:r>
-        <w:t xml:space="preserve">matched-seed</w:t>
-      </w:r>
-      <w:r>
-        <w:t xml:space="preserve"> </w:t>
-      </w:r>
-      <w:r>
-        <w:t xml:space="preserve">reruns</w:t>
-      </w:r>
-      <w:r>
-        <w:t xml:space="preserve"> </w:t>
-      </w:r>
-      <w:r>
-        <w:t xml:space="preserve">passing</w:t>
-      </w:r>
-      <w:r>
-        <w:t xml:space="preserve"> </w:t>
-      </w:r>
-      <w:r>
-        <w:t xml:space="preserve">the</w:t>
-      </w:r>
-      <w:r>
-        <w:t xml:space="preserve"> </w:t>
-      </w:r>
-      <w:r>
-        <w:t xml:space="preserve">full</w:t>
-      </w:r>
-      <w:r>
-        <w:t xml:space="preserve"> </w:t>
-      </w:r>
-      <w:r>
-        <w:t xml:space="preserve">claim</w:t>
-      </w:r>
-      <w:r>
-        <w:t xml:space="preserve"> </w:t>
-      </w:r>
-      <w:r>
-        <w:t xml:space="preserve">gate.</w:t>
-      </w:r>
-      <w:r>
-        <w:t xml:space="preserve"> </w:t>
-      </w:r>
-      <w:r>
-        <w:t xml:space="preserve">These</w:t>
-      </w:r>
-      <w:r>
-        <w:t xml:space="preserve"> </w:t>
-      </w:r>
-      <w:r>
-        <w:t xml:space="preserve">results</w:t>
-      </w:r>
-      <w:r>
-        <w:t xml:space="preserve"> </w:t>
-      </w:r>
-      <w:r>
-        <w:t xml:space="preserve">show</w:t>
-      </w:r>
-      <w:r>
-        <w:t xml:space="preserve"> </w:t>
-      </w:r>
-      <w:r>
-        <w:t xml:space="preserve">that</w:t>
-      </w:r>
-      <w:r>
-        <w:t xml:space="preserve"> </w:t>
-      </w:r>
-      <w:r>
-        <w:t xml:space="preserve">frozen</w:t>
-      </w:r>
-      <w:r>
-        <w:t xml:space="preserve"> </w:t>
-      </w:r>
-      <w:r>
-        <w:t xml:space="preserve">single-cell</w:t>
-      </w:r>
-      <w:r>
-        <w:t xml:space="preserve"> </w:t>
-      </w:r>
-      <w:r>
-        <w:t xml:space="preserve">foundation</w:t>
-      </w:r>
-      <w:r>
-        <w:t xml:space="preserve"> </w:t>
-      </w:r>
-      <w:r>
-        <w:t xml:space="preserve">models</w:t>
-      </w:r>
-      <w:r>
-        <w:t xml:space="preserve"> </w:t>
-      </w:r>
-      <w:r>
-        <w:t xml:space="preserve">do</w:t>
-      </w:r>
-      <w:r>
-        <w:t xml:space="preserve"> </w:t>
-      </w:r>
-      <w:r>
-        <w:t xml:space="preserve">contain</w:t>
-      </w:r>
-      <w:r>
-        <w:t xml:space="preserve"> </w:t>
-      </w:r>
-      <w:r>
-        <w:t xml:space="preserve">biologically</w:t>
-      </w:r>
-      <w:r>
-        <w:t xml:space="preserve"> </w:t>
-      </w:r>
-      <w:r>
-        <w:t xml:space="preserve">coherent</w:t>
-      </w:r>
-      <w:r>
-        <w:t xml:space="preserve"> </w:t>
-      </w:r>
-      <w:r>
-        <w:t xml:space="preserve">aging-related</w:t>
-      </w:r>
-      <w:r>
-        <w:t xml:space="preserve"> </w:t>
-      </w:r>
-      <w:r>
-        <w:t xml:space="preserve">structure,</w:t>
-      </w:r>
-      <w:r>
-        <w:t xml:space="preserve"> </w:t>
-      </w:r>
-      <w:r>
-        <w:t xml:space="preserve">especially</w:t>
-      </w:r>
-      <w:r>
-        <w:t xml:space="preserve"> </w:t>
-      </w:r>
-      <w:r>
-        <w:t xml:space="preserve">around</w:t>
-      </w:r>
-      <w:r>
-        <w:t xml:space="preserve"> </w:t>
-      </w:r>
-      <w:r>
-        <w:t xml:space="preserve">inflammatory</w:t>
-      </w:r>
-      <w:r>
-        <w:t xml:space="preserve"> </w:t>
-      </w:r>
-      <w:r>
-        <w:t xml:space="preserve">programs,</w:t>
-      </w:r>
-      <w:r>
-        <w:t xml:space="preserve"> </w:t>
-      </w:r>
-      <w:r>
-        <w:t xml:space="preserve">but</w:t>
-      </w:r>
-      <w:r>
-        <w:t xml:space="preserve"> </w:t>
-      </w:r>
-      <w:r>
-        <w:t xml:space="preserve">they</w:t>
-      </w:r>
-      <w:r>
-        <w:t xml:space="preserve"> </w:t>
-      </w:r>
-      <w:r>
-        <w:t xml:space="preserve">also</w:t>
-      </w:r>
-      <w:r>
-        <w:t xml:space="preserve"> </w:t>
-      </w:r>
-      <w:r>
-        <w:t xml:space="preserve">show</w:t>
-      </w:r>
-      <w:r>
-        <w:t xml:space="preserve"> </w:t>
-      </w:r>
-      <w:r>
-        <w:t xml:space="preserve">that</w:t>
-      </w:r>
-      <w:r>
-        <w:t xml:space="preserve"> </w:t>
-      </w:r>
-      <w:r>
-        <w:t xml:space="preserve">donor-aware</w:t>
-      </w:r>
-      <w:r>
-        <w:t xml:space="preserve"> </w:t>
-      </w:r>
-      <w:r>
-        <w:t xml:space="preserve">and</w:t>
-      </w:r>
-      <w:r>
-        <w:t xml:space="preserve"> </w:t>
-      </w:r>
-      <w:r>
         <w:t xml:space="preserve">composition-aware</w:t>
       </w:r>
       <w:r>
@@ -1562,7 +1440,7 @@
         <w:t xml:space="preserve"> </w:t>
       </w:r>
       <w:r>
-        <w:t xml:space="preserve">essential</w:t>
+        <w:t xml:space="preserve">necessary</w:t>
       </w:r>
       <w:r>
         <w:t xml:space="preserve"> </w:t>
@@ -1574,19 +1452,19 @@
         <w:t xml:space="preserve"> </w:t>
       </w:r>
       <w:r>
-        <w:t xml:space="preserve">treating</w:t>
-      </w:r>
-      <w:r>
-        <w:t xml:space="preserve"> </w:t>
-      </w:r>
-      <w:r>
-        <w:t xml:space="preserve">those</w:t>
-      </w:r>
-      <w:r>
-        <w:t xml:space="preserve"> </w:t>
-      </w:r>
-      <w:r>
-        <w:t xml:space="preserve">patterns</w:t>
+        <w:t xml:space="preserve">interpreting</w:t>
+      </w:r>
+      <w:r>
+        <w:t xml:space="preserve"> </w:t>
+      </w:r>
+      <w:r>
+        <w:t xml:space="preserve">such</w:t>
+      </w:r>
+      <w:r>
+        <w:t xml:space="preserve"> </w:t>
+      </w:r>
+      <w:r>
+        <w:t xml:space="preserve">signals</w:t>
       </w:r>
       <w:r>
         <w:t xml:space="preserve"> </w:t>
@@ -1622,7 +1500,7 @@
         <w:t xml:space="preserve"> </w:t>
       </w:r>
       <w:r>
-        <w:t xml:space="preserve">aging; biogerontology; single-cell transcriptomics; foundation models; mechanistic interpretability; inflammation</w:t>
+        <w:t xml:space="preserve">aging; inflammaging; single-cell transcriptomics; foundation models; interpretability; immune aging</w:t>
       </w:r>
     </w:p>
     <w:bookmarkStart w:id="20" w:name="introduction"/>
@@ -1744,7 +1622,7 @@
         <w:pStyle w:val="FirstParagraph"/>
       </w:pPr>
       <w:r>
-        <w:t xml:space="preserve">Core analyses centered on age-labeled human immune single-cell data already available in-project, with primary focus on AIDA phase 1 v1 and AIDA phase 1 v2. External and reference datasets included Tabula Sapiens-derived assets</w:t>
+        <w:t xml:space="preserve">Core analyses centered on age-labeled human immune single-cell data already available in-project, with primary focus on two internal AIDA immune-aging cohorts. External and reference datasets included Tabula Sapiens-derived assets</w:t>
       </w:r>
       <w:r>
         <w:t xml:space="preserve"> </w:t>
@@ -1779,7 +1657,7 @@
         <w:pStyle w:val="BodyText"/>
       </w:pPr>
       <w:r>
-        <w:t xml:space="preserve">The strongest-branch analyses were performed on AIDA phase 1 v2, which had the largest donor support in the deep-dive stage (</w:t>
+        <w:t xml:space="preserve">The strongest-branch analyses were performed on the larger of the two AIDA cohorts, which had the greatest donor support in the deep-dive analysis (</w:t>
       </w:r>
       <m:oMath>
         <m:r>
@@ -1929,7 +1807,7 @@
         <w:pStyle w:val="FirstParagraph"/>
       </w:pPr>
       <w:r>
-        <w:t xml:space="preserve">The analysis proceeded in four blocks. First, we asked whether age-related signal was present at all, using donor-held-out linear probes and simple manifold diagnostics (Stages 1–2). Second, we searched for interpretable latent structure using sparse autoencoders and cross-model pathway matching (Stages 3–4), motivated by sparse dictionary learning frameworks</w:t>
+        <w:t xml:space="preserve">The analysis proceeded in four blocks. First, we asked whether age-related signal was present at all, using donor-held-out linear probes and simple manifold diagnostics. Second, we searched for interpretable latent structure using sparse autoencoders and cross-model pathway matching, motivated by sparse dictionary learning frameworks</w:t>
       </w:r>
       <w:r>
         <w:t xml:space="preserve"> </w:t>
@@ -1938,7 +1816,7 @@
         <w:t xml:space="preserve">(Bricken et al. 2023; Templeton et al. 2024)</w:t>
       </w:r>
       <w:r>
-        <w:t xml:space="preserve">. Third, we tested candidate pathways with targeted interventions, donor-bootstrap confidence intervals, and conservative promotion gates (Stages 5–8). Finally, we stress-tested the strongest surviving branch with donor-threshold sweeps, donor-composition reweighting, fully composition-matched reruns, and multi-seed matched reruns (Stages 9–11).</w:t>
+        <w:t xml:space="preserve">. Third, we tested candidate pathways with targeted interventions, donor-bootstrap confidence intervals, and conservative promotion criteria. Finally, we stress-tested the strongest surviving branch with donor-threshold sweeps, donor-composition reweighting, fully composition-matched reruns, and multi-seed matched reruns.</w:t>
       </w:r>
     </w:p>
     <w:p>
@@ -2023,13 +1901,13 @@
         <w:t xml:space="preserve">Results</w:t>
       </w:r>
     </w:p>
-    <w:bookmarkStart w:id="28" w:name="global-trajectory-across-stages"/>
+    <w:bookmarkStart w:id="28" w:name="X82a6cb5840a358afba03884aa8189d982c76b7a"/>
     <w:p>
       <w:pPr>
         <w:pStyle w:val="Heading2"/>
       </w:pPr>
       <w:r>
-        <w:t xml:space="preserve">Global trajectory across stages</w:t>
+        <w:t xml:space="preserve">Global trajectory across the analysis pipeline</w:t>
       </w:r>
     </w:p>
     <w:p>
@@ -2051,7 +1929,7 @@
         <w:t xml:space="preserve"> </w:t>
       </w:r>
       <w:r>
-        <w:t xml:space="preserve">summarizes stage-level outcomes.</w:t>
+        <w:t xml:space="preserve">summarizes the main outcomes across the pipeline.</w:t>
       </w:r>
     </w:p>
     <w:bookmarkStart w:id="27" w:name="tab:stage-overview"/>
@@ -2060,7 +1938,7 @@
         <w:pStyle w:val="TableCaption"/>
       </w:pPr>
       <w:r>
-        <w:t xml:space="preserve">Stage-level outcomes across the full pipeline.</w:t>
+        <w:t xml:space="preserve">Analysis outcomes across the full pipeline.</w:t>
       </w:r>
     </w:p>
     <w:tbl>
@@ -2069,7 +1947,7 @@
         <w:tblW w:type="auto" w:w="0"/>
         <w:tblLook w:firstRow="1" w:lastRow="0" w:firstColumn="0" w:lastColumn="0" w:noHBand="0" w:noVBand="0" w:val="0020"/>
         <w:jc w:val="start"/>
-        <w:tblCaption w:val="Stage-level outcomes across the full pipeline."/>
+        <w:tblCaption w:val="Analysis outcomes across the full pipeline."/>
       </w:tblPr>
       <w:tblGrid>
         <w:gridCol w:w="2640"/>
@@ -2092,7 +1970,7 @@
                 <w:bCs/>
                 <w:b/>
               </w:rPr>
-              <w:t xml:space="preserve">Stage</w:t>
+              <w:t xml:space="preserve">Block</w:t>
             </w:r>
           </w:p>
         </w:tc>
@@ -2474,13 +2352,13 @@
     </w:tbl>
     <w:bookmarkEnd w:id="27"/>
     <w:bookmarkEnd w:id="28"/>
-    <w:bookmarkStart w:id="32" w:name="Xd24edef54d090c434d7cf6e3717dbe2c9ede408"/>
+    <w:bookmarkStart w:id="32" w:name="X66b76884b4d271d9dc6889a4e1c4e682f676048"/>
     <w:p>
       <w:pPr>
         <w:pStyle w:val="Heading2"/>
       </w:pPr>
       <w:r>
-        <w:t xml:space="preserve">Age can be decoded, but global age geometry is not robust (Stages 1–2)</w:t>
+        <w:t xml:space="preserve">Age can be decoded, but global age geometry is not robust</w:t>
       </w:r>
     </w:p>
     <w:p>
@@ -2593,13 +2471,13 @@
       </w:r>
     </w:p>
     <w:bookmarkEnd w:id="32"/>
-    <w:bookmarkStart w:id="39" w:name="Xd8d69b28c299c39ab49b0ca3555e00d982e7421"/>
+    <w:bookmarkStart w:id="39" w:name="X6c310e16402ccea85802ee4d585241ed82bb352"/>
     <w:p>
       <w:pPr>
         <w:pStyle w:val="Heading2"/>
       </w:pPr>
       <w:r>
-        <w:t xml:space="preserve">Sparse features and cross-model overlap point to inflammatory programs (Stages 3–4)</w:t>
+        <w:t xml:space="preserve">Sparse features and cross-model overlap point to inflammatory programs</w:t>
       </w:r>
     </w:p>
     <w:p>
@@ -2754,13 +2632,13 @@
       </w:r>
     </w:p>
     <w:bookmarkEnd w:id="39"/>
-    <w:bookmarkStart w:id="43" w:name="X3600fc3e840c0a67b042e7402473d4a825e5afe"/>
+    <w:bookmarkStart w:id="43" w:name="Xc0168e3824258c483420a9023400b2b6db334fa"/>
     <w:p>
       <w:pPr>
         <w:pStyle w:val="Heading2"/>
       </w:pPr>
       <w:r>
-        <w:t xml:space="preserve">The clearest cell-type-specific signal appears in AIDA v1 monocytes (Stage 8)</w:t>
+        <w:t xml:space="preserve">The clearest cell-type-specific signal appears in AIDA v1 monocytes</w:t>
       </w:r>
     </w:p>
     <w:p>
@@ -2868,13 +2746,13 @@
       </w:r>
     </w:p>
     <w:bookmarkEnd w:id="43"/>
-    <w:bookmarkStart w:id="47" w:name="Xee8aa3d04864b401d67348f018d52dc75e4dbc6"/>
+    <w:bookmarkStart w:id="47" w:name="Xfdaa29b9c9c91d5c447709301b37ae1baa094a0"/>
     <w:p>
       <w:pPr>
         <w:pStyle w:val="Heading2"/>
       </w:pPr>
       <w:r>
-        <w:t xml:space="preserve">A single global Geneformer branch survives the deep-dive stress test (Stage 9)</w:t>
+        <w:t xml:space="preserve">A single global Geneformer branch survives the deep-dive stress test</w:t>
       </w:r>
     </w:p>
     <w:p>
@@ -3001,13 +2879,13 @@
       </w:r>
     </w:p>
     <w:bookmarkEnd w:id="47"/>
-    <w:bookmarkStart w:id="54" w:name="X0c8227316fa869b2409f9bc0e738a64e25069f7"/>
+    <w:bookmarkStart w:id="54" w:name="X9c8f42579a5dbe70dc83eb4f4e1941c673ac9fb"/>
     <w:p>
       <w:pPr>
         <w:pStyle w:val="Heading2"/>
       </w:pPr>
       <w:r>
-        <w:t xml:space="preserve">Composition matching weakens the strongest global signal (Stages 10–11)</w:t>
+        <w:t xml:space="preserve">Composition matching weakens the strongest global signal</w:t>
       </w:r>
     </w:p>
     <w:p>
@@ -3274,13 +3152,13 @@
       </w:r>
     </w:p>
     <w:bookmarkEnd w:id="54"/>
-    <w:bookmarkStart w:id="56" w:name="X2a784b642538f732dcde11db46a0aacdee071b0"/>
+    <w:bookmarkStart w:id="56" w:name="X4642428c82379decf5e053b2d33c6380378e56c"/>
     <w:p>
       <w:pPr>
         <w:pStyle w:val="Heading2"/>
       </w:pPr>
       <w:r>
-        <w:t xml:space="preserve">Matched reruns do not reproduce the baseline claim (Stage 11)</w:t>
+        <w:t xml:space="preserve">Matched reruns do not reproduce the baseline claim</w:t>
       </w:r>
     </w:p>
     <w:p>
@@ -3378,7 +3256,7 @@
         <w:pStyle w:val="TableCaption"/>
       </w:pPr>
       <w:r>
-        <w:t xml:space="preserve">Stage 11 composition-matched seed panel summary (strict outcomes).</w:t>
+        <w:t xml:space="preserve">Composition-matched seed panel summary under the strict outcome criteria.</w:t>
       </w:r>
     </w:p>
     <w:tbl>
@@ -3387,7 +3265,7 @@
         <w:tblW w:type="auto" w:w="0"/>
         <w:tblLook w:firstRow="1" w:lastRow="0" w:firstColumn="0" w:lastColumn="0" w:noHBand="0" w:noVBand="0" w:val="0020"/>
         <w:jc w:val="start"/>
-        <w:tblCaption w:val="Stage 11 composition-matched seed panel summary (strict outcomes)."/>
+        <w:tblCaption w:val="Composition-matched seed panel summary under the strict outcome criteria."/>
       </w:tblPr>
       <w:tblGrid>
         <w:gridCol w:w="1584"/>
@@ -3820,7 +3698,7 @@
         <w:pStyle w:val="FirstParagraph"/>
       </w:pPr>
       <w:r>
-        <w:t xml:space="preserve">A clear pattern emerged across the project. Frozen single-cell foundation models do contain aging-related structure, and some of that structure is biologically interpretable. We repeatedly recovered donor-aware sparse features, saw substantial cross-model overlap in inflammatory programs, and observed a strong cell-type-local monocyte signal in AIDA phase 1 v1. This biological direction is plausible: inflammatory drift, NF-kappaB-linked signaling, senescence-associated secretory phenotypes, and immune remodeling are all well-established features of aging biology</w:t>
+        <w:t xml:space="preserve">A clear but mixed pattern emerged from the study. Frozen single-cell foundation models do contain aging-related structure, and some of that structure is biologically interpretable. We repeatedly recovered donor-aware sparse features, saw substantial cross-model overlap in inflammatory programs, and observed a strong cell-type-local monocyte signal in one of the two main immune-aging cohorts. This biological direction is plausible: inflammatory drift, NF-kappaB-linked signaling, senescence-associated secretory phenotypes, and immune remodeling are well-established features of aging biology</w:t>
       </w:r>
       <w:r>
         <w:t xml:space="preserve"> </w:t>
@@ -3829,7 +3707,7 @@
         <w:t xml:space="preserve">(FRANCESCHI et al. 2000; Furman et al. 2019; Ferrucci and Fabbri 2018; Goronzy and Weyand 2019; Salminen et al. 2008; Chien et al. 2011; Basisty et al. 2020)</w:t>
       </w:r>
       <w:r>
-        <w:t xml:space="preserve">. These are not trivial findings, because they appeared without age-specific fine-tuning.</w:t>
+        <w:t xml:space="preserve">. These findings are therefore more than generic age decoding. They indicate that frozen models can organize biologically meaningful aging-associated structure even without age-specific fine-tuning.</w:t>
       </w:r>
     </w:p>
     <w:p>
@@ -3837,7 +3715,7 @@
         <w:pStyle w:val="BodyText"/>
       </w:pPr>
       <w:r>
-        <w:t xml:space="preserve">At the same time, the strongest global signal did not survive the most demanding control. The AIDA phase 1 v2 Geneformer inflammation branch looked convincing after split expansion, donor-threshold tightening, and donor-composition reweighting. But once we enforced full composition matching and repeated the analysis across multiple matched seeds, the full strict claim did not replicate. That is not a side note. It is the central methodological result of the study.</w:t>
+        <w:t xml:space="preserve">At the same time, the strongest global signal did not survive the most demanding control. The larger AIDA cohort yielded a Geneformer inflammation branch that remained convincing after split expansion, donor-threshold tightening, and donor-composition reweighting. However, once full composition matching was enforced and the analysis was repeated across multiple matched seeds, the full strict claim did not replicate. That result is not incidental. It is the central methodological message of the study.</w:t>
       </w:r>
     </w:p>
     <w:bookmarkStart w:id="58" w:name="X23ac13b45d1bde487f9c63f5b619b52ef5a0bc2"/>
@@ -3934,7 +3812,7 @@
         <w:pStyle w:val="FirstParagraph"/>
       </w:pPr>
       <w:r>
-        <w:t xml:space="preserve">Key limitations include: (i) limited donor support in some strata and external subsets; (ii) reduced power under strict within-cell-type constraints; (iii) sensitivity of final strict status to composition-matched sample realization; and (iv) incomplete high-power composition-matched reruns due runtime constraints.</w:t>
+        <w:t xml:space="preserve">Key limitations include limited donor support in some strata and external subsets, reduced power under strict within-cell-type constraints, sensitivity of final strict status to the specific composition-matched sample realization, and incomplete higher-budget composition-matched reruns due runtime constraints.</w:t>
       </w:r>
     </w:p>
     <w:bookmarkEnd w:id="59"/>
@@ -3953,7 +3831,7 @@
         <w:pStyle w:val="FirstParagraph"/>
       </w:pPr>
       <w:r>
-        <w:t xml:space="preserve">This project establishes that frozen scGPT and Geneformer representations contain meaningful, interpretable aging-associated latent programs, with particularly strong intermediate evidence around inflammatory biology. However, under repeated fully composition-matched forward-pass controls, the strongest global strict-claim branch did not replicate. The most accurate summary is therefore:</w:t>
+        <w:t xml:space="preserve">This study shows that frozen scGPT and Geneformer representations contain meaningful and interpretable aging-associated latent programs, with the clearest evidence concentrated in inflammatory biology. However, under repeated fully composition-matched forward-pass controls, the strongest global signal did not replicate at the strictest decision threshold. The most accurate summary is therefore:</w:t>
       </w:r>
       <w:r>
         <w:t xml:space="preserve"> </w:t>
@@ -3963,7 +3841,7 @@
           <w:bCs/>
           <w:b/>
         </w:rPr>
-        <w:t xml:space="preserve">promising mechanistic signal, not yet a promotion-grade robust mechanism</w:t>
+        <w:t xml:space="preserve">promising mechanistic signal, but not yet a robust mechanism-level claim</w:t>
       </w:r>
       <w:r>
         <w:t xml:space="preserve">.</w:t>
@@ -3974,7 +3852,7 @@
         <w:pStyle w:val="BodyText"/>
       </w:pPr>
       <w:r>
-        <w:t xml:space="preserve">The highest-value next step is a higher-power composition-matched consensus protocol (larger matched cell budgets and pooled multi-resample decision rules) to determine whether the Stage-9 signal reflects a true stable mechanism or a sampling-sensitive artifact.</w:t>
+        <w:t xml:space="preserve">The highest-value next step is a higher-power composition-matched consensus protocol, with larger matched cell budgets and pooled multi-resample decision rules, to determine whether the deep-dive inflammatory signal reflects a stable mechanism or a sampling-sensitive artifact.</w:t>
       </w:r>
     </w:p>
     <w:bookmarkEnd w:id="61"/>

</xml_diff>